<commit_message>
Correct schedule timeline, add 이진수 acting justice minister, shift meeting to 18:30
Co-Authored-By: Claude Sonnet 5.5 <noreply@anthropic.com>
Claude-Session: https://claude.ai/code/session_01SU68m6ZzGQrirKhNBvPqFV
</commit_message>
<xml_diff>
--- a/NSC_전체회의_회의록_2026-09-30_시뮬레이션.docx
+++ b/NSC_전체회의_회의록_2026-09-30_시뮬레이션.docx
@@ -59,7 +59,7 @@
           <w:sz w:val="22"/>
           <w:szCs w:val="22"/>
         </w:rPr>
-        <w:t xml:space="preserve"> : 2026. 09. 30.(수), 18:00 ~ 21:40</w:t>
+        <w:t xml:space="preserve"> : 2026. 09. 30.(수), 18:30 ~ 22:10</w:t>
       </w:r>
     </w:p>
     <w:p>
@@ -82,7 +82,7 @@
           <w:sz w:val="22"/>
           <w:szCs w:val="22"/>
         </w:rPr>
-        <w:t xml:space="preserve"> : 청와대 본관 위기관리센터 ⇔ 독일 현지(통일부장관, 보안 화상)</w:t>
+        <w:t xml:space="preserve"> : 청와대 본관 위기관리센터 ⇔ 영국 북아일랜드 현지(통일부장관, 보안 화상)</w:t>
       </w:r>
     </w:p>
     <w:p>
@@ -965,7 +965,7 @@
                 <w:sz w:val="16"/>
                 <w:szCs w:val="16"/>
               </w:rPr>
-              <w:t xml:space="preserve">화상(독일 현지)</w:t>
+              <w:t xml:space="preserve">화상(북아일랜드)</w:t>
             </w:r>
           </w:p>
         </w:tc>
@@ -1376,7 +1376,7 @@
                 <w:sz w:val="19"/>
                 <w:szCs w:val="19"/>
               </w:rPr>
-              <w:t xml:space="preserve">통일부장관은 유럽 출장 중 보안 화상으로 참석(출장 일정 단축 조치 중, 10.1 귀국 예정)</w:t>
+              <w:t xml:space="preserve">통일부장관은 유럽 출장(9.28~10.5 예정) 중 북아일랜드 현지에서 보안 화상으로 참석(현지 시각 10:30). 회의 중 대통령 지시로 일정 단축, 10.1 귀국</w:t>
             </w:r>
           </w:p>
         </w:tc>
@@ -1902,7 +1902,7 @@
                 <w:sz w:val="19"/>
                 <w:szCs w:val="19"/>
               </w:rPr>
-              <w:t xml:space="preserve">-</w:t>
+              <w:t xml:space="preserve">이진수</w:t>
             </w:r>
           </w:p>
         </w:tc>
@@ -1966,7 +1966,7 @@
                 <w:sz w:val="16"/>
                 <w:szCs w:val="16"/>
               </w:rPr>
-              <w:t xml:space="preserve">안건 2·3, 성명 미확인</w:t>
+              <w:t xml:space="preserve">안건 2·3</w:t>
             </w:r>
           </w:p>
         </w:tc>
@@ -2386,7 +2386,7 @@
                 <w:sz w:val="19"/>
                 <w:szCs w:val="19"/>
               </w:rPr>
-              <w:t xml:space="preserve">국가안보실 제3차장</w:t>
+              <w:t xml:space="preserve">대통령비서실 홍보소통수석</w:t>
             </w:r>
           </w:p>
         </w:tc>
@@ -2418,7 +2418,7 @@
                 <w:sz w:val="19"/>
                 <w:szCs w:val="19"/>
               </w:rPr>
-              <w:t xml:space="preserve">송기호</w:t>
+              <w:t xml:space="preserve">성기홍</w:t>
             </w:r>
           </w:p>
         </w:tc>
@@ -2482,7 +2482,265 @@
                 <w:sz w:val="16"/>
                 <w:szCs w:val="16"/>
               </w:rPr>
+              <w:t xml:space="preserve">안건 6</w:t>
+            </w:r>
+          </w:p>
+        </w:tc>
+      </w:tr>
+      <w:tr>
+        <w:tc>
+          <w:tcPr>
+            <w:tcW w:type="dxa" w:w="1950"/>
+            <w:tcBorders>
+              <w:top w:val="single" w:color="000000" w:sz="4"/>
+              <w:left w:val="single" w:color="000000" w:sz="4"/>
+              <w:bottom w:val="single" w:color="000000" w:sz="4"/>
+              <w:right w:val="single" w:color="000000" w:sz="4"/>
+            </w:tcBorders>
+            <w:tcMar>
+              <w:top w:type="dxa" w:w="60"/>
+              <w:left w:type="dxa" w:w="80"/>
+              <w:bottom w:type="dxa" w:w="60"/>
+              <w:right w:type="dxa" w:w="80"/>
+            </w:tcMar>
+            <w:vAlign w:val="center"/>
+          </w:tcPr>
+          <w:p>
+            <w:pPr>
+              <w:spacing w:line="280" w:lineRule="auto"/>
+              <w:jc w:val="center"/>
+            </w:pPr>
+            <w:r>
+              <w:rPr>
+                <w:rFonts w:ascii="바탕" w:cs="바탕" w:eastAsia="바탕" w:hAnsi="바탕"/>
+                <w:sz w:val="19"/>
+                <w:szCs w:val="19"/>
+              </w:rPr>
+              <w:t xml:space="preserve">국가안보실 제3차장</w:t>
+            </w:r>
+          </w:p>
+        </w:tc>
+        <w:tc>
+          <w:tcPr>
+            <w:tcW w:type="dxa" w:w="880"/>
+            <w:tcBorders>
+              <w:top w:val="single" w:color="000000" w:sz="4"/>
+              <w:left w:val="single" w:color="000000" w:sz="4"/>
+              <w:bottom w:val="single" w:color="000000" w:sz="4"/>
+              <w:right w:val="single" w:color="000000" w:sz="4"/>
+            </w:tcBorders>
+            <w:tcMar>
+              <w:top w:type="dxa" w:w="60"/>
+              <w:left w:type="dxa" w:w="80"/>
+              <w:bottom w:type="dxa" w:w="60"/>
+              <w:right w:type="dxa" w:w="80"/>
+            </w:tcMar>
+            <w:vAlign w:val="center"/>
+          </w:tcPr>
+          <w:p>
+            <w:pPr>
+              <w:spacing w:line="280" w:lineRule="auto"/>
+              <w:jc w:val="center"/>
+            </w:pPr>
+            <w:r>
+              <w:rPr>
+                <w:rFonts w:ascii="바탕" w:cs="바탕" w:eastAsia="바탕" w:hAnsi="바탕"/>
+                <w:sz w:val="19"/>
+                <w:szCs w:val="19"/>
+              </w:rPr>
+              <w:t xml:space="preserve">송기호</w:t>
+            </w:r>
+          </w:p>
+        </w:tc>
+        <w:tc>
+          <w:tcPr>
+            <w:tcW w:type="dxa" w:w="520"/>
+            <w:tcBorders>
+              <w:top w:val="single" w:color="000000" w:sz="4"/>
+              <w:left w:val="single" w:color="000000" w:sz="4"/>
+              <w:bottom w:val="single" w:color="000000" w:sz="4"/>
+              <w:right w:val="single" w:color="000000" w:sz="4"/>
+            </w:tcBorders>
+            <w:tcMar>
+              <w:top w:type="dxa" w:w="60"/>
+              <w:left w:type="dxa" w:w="80"/>
+              <w:bottom w:type="dxa" w:w="60"/>
+              <w:right w:type="dxa" w:w="80"/>
+            </w:tcMar>
+            <w:vAlign w:val="center"/>
+          </w:tcPr>
+          <w:p>
+            <w:pPr>
+              <w:spacing w:line="280" w:lineRule="auto"/>
+              <w:jc w:val="center"/>
+            </w:pPr>
+            <w:r>
+              <w:rPr>
+                <w:rFonts w:ascii="바탕" w:cs="바탕" w:eastAsia="바탕" w:hAnsi="바탕"/>
+                <w:sz w:val="19"/>
+                <w:szCs w:val="19"/>
+              </w:rPr>
+              <w:t xml:space="preserve">○</w:t>
+            </w:r>
+          </w:p>
+        </w:tc>
+        <w:tc>
+          <w:tcPr>
+            <w:tcW w:type="dxa" w:w="1469"/>
+            <w:tcBorders>
+              <w:top w:val="single" w:color="000000" w:sz="4"/>
+              <w:left w:val="single" w:color="000000" w:sz="4"/>
+              <w:bottom w:val="single" w:color="000000" w:sz="4"/>
+              <w:right w:val="single" w:color="000000" w:sz="4"/>
+            </w:tcBorders>
+            <w:tcMar>
+              <w:top w:type="dxa" w:w="60"/>
+              <w:left w:type="dxa" w:w="80"/>
+              <w:bottom w:type="dxa" w:w="60"/>
+              <w:right w:type="dxa" w:w="80"/>
+            </w:tcMar>
+            <w:vAlign w:val="center"/>
+          </w:tcPr>
+          <w:p>
+            <w:pPr>
+              <w:spacing w:line="280" w:lineRule="auto"/>
+              <w:jc w:val="center"/>
+            </w:pPr>
+            <w:r>
+              <w:rPr>
+                <w:rFonts w:ascii="바탕" w:cs="바탕" w:eastAsia="바탕" w:hAnsi="바탕"/>
+                <w:sz w:val="16"/>
+                <w:szCs w:val="16"/>
+              </w:rPr>
               <w:t xml:space="preserve">경제안보 담당</w:t>
+            </w:r>
+          </w:p>
+        </w:tc>
+        <w:tc>
+          <w:tcPr>
+            <w:tcW w:type="dxa" w:w="1950"/>
+            <w:tcBorders>
+              <w:top w:val="single" w:color="000000" w:sz="4"/>
+              <w:left w:val="single" w:color="000000" w:sz="4"/>
+              <w:bottom w:val="single" w:color="000000" w:sz="4"/>
+              <w:right w:val="single" w:color="000000" w:sz="4"/>
+            </w:tcBorders>
+            <w:tcMar>
+              <w:top w:type="dxa" w:w="60"/>
+              <w:left w:type="dxa" w:w="80"/>
+              <w:bottom w:type="dxa" w:w="60"/>
+              <w:right w:type="dxa" w:w="80"/>
+            </w:tcMar>
+            <w:vAlign w:val="center"/>
+          </w:tcPr>
+          <w:p>
+            <w:pPr>
+              <w:spacing w:line="280" w:lineRule="auto"/>
+              <w:jc w:val="center"/>
+            </w:pPr>
+            <w:r>
+              <w:rPr>
+                <w:rFonts w:ascii="바탕" w:cs="바탕" w:eastAsia="바탕" w:hAnsi="바탕"/>
+                <w:sz w:val="19"/>
+                <w:szCs w:val="19"/>
+              </w:rPr>
+              <w:t xml:space="preserve"/>
+            </w:r>
+          </w:p>
+        </w:tc>
+        <w:tc>
+          <w:tcPr>
+            <w:tcW w:type="dxa" w:w="880"/>
+            <w:tcBorders>
+              <w:top w:val="single" w:color="000000" w:sz="4"/>
+              <w:left w:val="single" w:color="000000" w:sz="4"/>
+              <w:bottom w:val="single" w:color="000000" w:sz="4"/>
+              <w:right w:val="single" w:color="000000" w:sz="4"/>
+            </w:tcBorders>
+            <w:tcMar>
+              <w:top w:type="dxa" w:w="60"/>
+              <w:left w:type="dxa" w:w="80"/>
+              <w:bottom w:type="dxa" w:w="60"/>
+              <w:right w:type="dxa" w:w="80"/>
+            </w:tcMar>
+            <w:vAlign w:val="center"/>
+          </w:tcPr>
+          <w:p>
+            <w:pPr>
+              <w:spacing w:line="280" w:lineRule="auto"/>
+              <w:jc w:val="center"/>
+            </w:pPr>
+            <w:r>
+              <w:rPr>
+                <w:rFonts w:ascii="바탕" w:cs="바탕" w:eastAsia="바탕" w:hAnsi="바탕"/>
+                <w:sz w:val="19"/>
+                <w:szCs w:val="19"/>
+              </w:rPr>
+              <w:t xml:space="preserve"/>
+            </w:r>
+          </w:p>
+        </w:tc>
+        <w:tc>
+          <w:tcPr>
+            <w:tcW w:type="dxa" w:w="520"/>
+            <w:tcBorders>
+              <w:top w:val="single" w:color="000000" w:sz="4"/>
+              <w:left w:val="single" w:color="000000" w:sz="4"/>
+              <w:bottom w:val="single" w:color="000000" w:sz="4"/>
+              <w:right w:val="single" w:color="000000" w:sz="4"/>
+            </w:tcBorders>
+            <w:tcMar>
+              <w:top w:type="dxa" w:w="60"/>
+              <w:left w:type="dxa" w:w="80"/>
+              <w:bottom w:type="dxa" w:w="60"/>
+              <w:right w:type="dxa" w:w="80"/>
+            </w:tcMar>
+            <w:vAlign w:val="center"/>
+          </w:tcPr>
+          <w:p>
+            <w:pPr>
+              <w:spacing w:line="280" w:lineRule="auto"/>
+              <w:jc w:val="center"/>
+            </w:pPr>
+            <w:r>
+              <w:rPr>
+                <w:rFonts w:ascii="바탕" w:cs="바탕" w:eastAsia="바탕" w:hAnsi="바탕"/>
+                <w:sz w:val="19"/>
+                <w:szCs w:val="19"/>
+              </w:rPr>
+              <w:t xml:space="preserve"/>
+            </w:r>
+          </w:p>
+        </w:tc>
+        <w:tc>
+          <w:tcPr>
+            <w:tcW w:type="dxa" w:w="1469"/>
+            <w:tcBorders>
+              <w:top w:val="single" w:color="000000" w:sz="4"/>
+              <w:left w:val="single" w:color="000000" w:sz="4"/>
+              <w:bottom w:val="single" w:color="000000" w:sz="4"/>
+              <w:right w:val="single" w:color="000000" w:sz="4"/>
+            </w:tcBorders>
+            <w:tcMar>
+              <w:top w:type="dxa" w:w="60"/>
+              <w:left w:type="dxa" w:w="80"/>
+              <w:bottom w:type="dxa" w:w="60"/>
+              <w:right w:type="dxa" w:w="80"/>
+            </w:tcMar>
+            <w:vAlign w:val="center"/>
+          </w:tcPr>
+          <w:p>
+            <w:pPr>
+              <w:spacing w:line="280" w:lineRule="auto"/>
+              <w:jc w:val="center"/>
+            </w:pPr>
+            <w:r>
+              <w:rPr>
+                <w:rFonts w:ascii="바탕" w:cs="바탕" w:eastAsia="바탕" w:hAnsi="바탕"/>
+                <w:sz w:val="19"/>
+                <w:szCs w:val="19"/>
+              </w:rPr>
+              <w:t xml:space="preserve"/>
             </w:r>
           </w:p>
         </w:tc>
@@ -2799,7 +3057,7 @@
                 <w:sz w:val="19"/>
                 <w:szCs w:val="19"/>
               </w:rPr>
-              <w:t xml:space="preserve">18:00~18:10</w:t>
+              <w:t xml:space="preserve">18:30~18:40</w:t>
             </w:r>
           </w:p>
         </w:tc>
@@ -2932,7 +3190,7 @@
                 <w:sz w:val="19"/>
                 <w:szCs w:val="19"/>
               </w:rPr>
-              <w:t xml:space="preserve">18:10~18:35</w:t>
+              <w:t xml:space="preserve">18:40~19:05</w:t>
             </w:r>
           </w:p>
         </w:tc>
@@ -3065,7 +3323,7 @@
                 <w:sz w:val="19"/>
                 <w:szCs w:val="19"/>
               </w:rPr>
-              <w:t xml:space="preserve">18:35~19:20</w:t>
+              <w:t xml:space="preserve">19:05~19:50</w:t>
             </w:r>
           </w:p>
         </w:tc>
@@ -3198,7 +3456,7 @@
                 <w:sz w:val="19"/>
                 <w:szCs w:val="19"/>
               </w:rPr>
-              <w:t xml:space="preserve">19:20~19:45</w:t>
+              <w:t xml:space="preserve">19:50~20:15</w:t>
             </w:r>
           </w:p>
         </w:tc>
@@ -3331,7 +3589,7 @@
                 <w:sz w:val="19"/>
                 <w:szCs w:val="19"/>
               </w:rPr>
-              <w:t xml:space="preserve">19:45~20:30</w:t>
+              <w:t xml:space="preserve">20:15~21:00</w:t>
             </w:r>
           </w:p>
         </w:tc>
@@ -3464,7 +3722,7 @@
                 <w:sz w:val="19"/>
                 <w:szCs w:val="19"/>
               </w:rPr>
-              <w:t xml:space="preserve">20:30~21:00</w:t>
+              <w:t xml:space="preserve">21:00~21:30</w:t>
             </w:r>
           </w:p>
         </w:tc>
@@ -3597,7 +3855,7 @@
                 <w:sz w:val="19"/>
                 <w:szCs w:val="19"/>
               </w:rPr>
-              <w:t xml:space="preserve">21:00~21:15</w:t>
+              <w:t xml:space="preserve">21:30~21:45</w:t>
             </w:r>
           </w:p>
         </w:tc>
@@ -3730,7 +3988,7 @@
                 <w:sz w:val="19"/>
                 <w:szCs w:val="19"/>
               </w:rPr>
-              <w:t xml:space="preserve">21:15~21:30</w:t>
+              <w:t xml:space="preserve">21:45~22:00</w:t>
             </w:r>
           </w:p>
         </w:tc>
@@ -3863,7 +4121,7 @@
                 <w:sz w:val="19"/>
                 <w:szCs w:val="19"/>
               </w:rPr>
-              <w:t xml:space="preserve">21:30~21:40</w:t>
+              <w:t xml:space="preserve">22:00~22:10</w:t>
             </w:r>
           </w:p>
         </w:tc>
@@ -4855,7 +5113,7 @@
           <w:sz w:val="20"/>
           <w:szCs w:val="20"/>
         </w:rPr>
-        <w:t xml:space="preserve">(18시 개회)</w:t>
+        <w:t xml:space="preserve">(18시 30분 개회)</w:t>
       </w:r>
     </w:p>
     <w:p>
@@ -4939,7 +5197,7 @@
           <w:sz w:val="22"/>
           <w:szCs w:val="22"/>
         </w:rPr>
-        <w:t xml:space="preserve">먼저 부상을 입은 장병들과 가족분들께 다시 한번 위로 말씀을 드립니다. 국가가 보낸 길에서 다쳤습니다. 그러면 국가가 끝까지 책임지는 게 맞습니다. 치료, 보상, 복귀 지원, 하나도 빠짐없이 챙기세요.</w:t>
+        <w:t xml:space="preserve">먼저 오늘 오전에 국군수도병원에 가서 다친 장병들과 가족분들을 만나고 왔습니다. 치료와 재활은 물론이고 군 생활을 계속할 수 있도록 충분히 예우하겠다고 약속드렸습니다. 이건 말로 끝나면 안 되는 약속입니다. 국가가 보낸 길에서 다쳤으면 국가가 끝까지 책임지는 게 맞습니다. 치료, 보상, 복귀 지원, 하나도 빠짐없이 챙기세요.</w:t>
       </w:r>
     </w:p>
     <w:p>
@@ -4958,6 +5216,24 @@
           <w:szCs w:val="22"/>
         </w:rPr>
         <w:t xml:space="preserve">그리고 오늘 이 회의를 왜 이제야 열게 됐는지, 그것부터 짚겠습니다. 장병이 지뢰에 크게 다친 지 벌써 9일입니다. 그동안 NSC 전체회의가 한 번도 안 열렸다, 이런 비판이 나오는데, 저는 그 비판이 틀렸다고 말하기 어렵습니다. 제가 순방 중이었다는 건 변명이 안 됩니다. 대통령이 자리를 비웠다고 안보 컨트롤타워가 멈춰 서 있으면 그게 무슨 컨트롤타워입니까? 책임은 일차적으로 저한테 있고, 그다음이 이 자리에 앉아 계신 분들입니다.</w:t>
+      </w:r>
+    </w:p>
+    <w:p>
+      <w:pPr>
+        <w:pBdr>
+          <w:left w:val="single" w:color="1F2F6B" w:sz="18" w:space="8"/>
+        </w:pBdr>
+        <w:spacing w:after="120" w:line="350" w:lineRule="auto"/>
+        <w:ind w:left="200"/>
+        <w:jc w:val="both"/>
+      </w:pPr>
+      <w:r>
+        <w:rPr>
+          <w:rFonts w:ascii="바탕" w:cs="바탕" w:eastAsia="바탕" w:hAnsi="바탕"/>
+          <w:sz w:val="22"/>
+          <w:szCs w:val="22"/>
+        </w:rPr>
+        <w:t xml:space="preserve">오후에는 울산에서 이지스구축함 진수식에 갔습니다. 거기서 자주국방은 곧 주권이라고 말씀드렸는데, 우리 DMZ 안에 북한 지뢰가 1년 넘게 있었다는 걸 확인하고 나니 그 말이 참 무겁게 들립니다. 남의 힘에 기대지 않고 스스로 지킬 수 있어야 한다면서, 정작 우리 장병이 다니는 길 하나를 못 지켰다는 겁니다.</w:t>
       </w:r>
     </w:p>
     <w:p>
@@ -5278,7 +5554,7 @@
                 <w:sz w:val="19"/>
                 <w:szCs w:val="19"/>
               </w:rPr>
-              <w:t xml:space="preserve">9.18(금)</w:t>
+              <w:t xml:space="preserve">9.17(목)</w:t>
             </w:r>
           </w:p>
         </w:tc>
@@ -5310,7 +5586,7 @@
                 <w:sz w:val="19"/>
                 <w:szCs w:val="19"/>
               </w:rPr>
-              <w:t xml:space="preserve">대통령 기자회견. 호르무즈 관련 “전쟁에 관여·개입하는 파병은 없다”, 청해부대 활동 강화는 검토</w:t>
+              <w:t xml:space="preserve">청와대, 위성락 안보실장 주재 NSC 상임위(호르무즈 논의) 순연. 조현 외교부장관 방미 후로 연기 보도</w:t>
             </w:r>
           </w:p>
         </w:tc>
@@ -5347,7 +5623,7 @@
                 <w:sz w:val="19"/>
                 <w:szCs w:val="19"/>
               </w:rPr>
-              <w:t xml:space="preserve">9.19(토)</w:t>
+              <w:t xml:space="preserve">9.18(금)</w:t>
             </w:r>
           </w:p>
         </w:tc>
@@ -5379,7 +5655,7 @@
                 <w:sz w:val="19"/>
                 <w:szCs w:val="19"/>
               </w:rPr>
-              <w:t xml:space="preserve">법무부장관 후보자 자진 사퇴(8.30 지명, 9.15 청문회). 정성호 전 장관 퇴임 후 법무부장관 공석 지속</w:t>
+              <w:t xml:space="preserve">대통령 기자회견. 호르무즈 관련 “전쟁에 관여·개입하는 파병은 없다”, 청해부대 활동 강화는 검토</w:t>
             </w:r>
           </w:p>
         </w:tc>
@@ -5416,7 +5692,7 @@
                 <w:sz w:val="19"/>
                 <w:szCs w:val="19"/>
               </w:rPr>
-              <w:t xml:space="preserve">9.21(월)</w:t>
+              <w:t xml:space="preserve">9.19(토)</w:t>
             </w:r>
           </w:p>
         </w:tc>
@@ -5448,7 +5724,7 @@
                 <w:sz w:val="19"/>
                 <w:szCs w:val="19"/>
               </w:rPr>
-              <w:t xml:space="preserve">대통령 미국·멕시코 순방 출발(~9.27). 같은 날 25사단 수색대대 DMZ 수색로 작전 중 지뢰 폭발(10:51경). 비서실장 사의 표명</w:t>
+              <w:t xml:space="preserve">법무부장관 후보자 자진 사퇴(8.30 지명, 9.15 청문회). 정성호 전 장관 퇴임 후 법무부장관 공석 지속</w:t>
             </w:r>
           </w:p>
         </w:tc>
@@ -5485,7 +5761,7 @@
                 <w:sz w:val="19"/>
                 <w:szCs w:val="19"/>
               </w:rPr>
-              <w:t xml:space="preserve">9.22(화)</w:t>
+              <w:t xml:space="preserve">9.21(월)</w:t>
             </w:r>
           </w:p>
         </w:tc>
@@ -5517,7 +5793,7 @@
                 <w:sz w:val="19"/>
                 <w:szCs w:val="19"/>
               </w:rPr>
-              <w:t xml:space="preserve">북한 전투기 1기 서해 전술조치선 월선(공군 전투기 발진, 백령도 인근 어선 70여 척 대피, 약 2시간 후 해제). 대통령 유엔총회 기조연설(현지 22일). 이형일 경제부총리 취임</w:t>
+              <w:t xml:space="preserve">대통령 미국·멕시코 순방 출발(~9.27). 같은 날 25사단 수색대대 DMZ 수색로 작전 중 지뢰 폭발(10:51경). 비서실장 사의 표명</w:t>
             </w:r>
           </w:p>
         </w:tc>
@@ -5554,7 +5830,7 @@
                 <w:sz w:val="19"/>
                 <w:szCs w:val="19"/>
               </w:rPr>
-              <w:t xml:space="preserve">9.23(수)</w:t>
+              <w:t xml:space="preserve">9.22(화)</w:t>
             </w:r>
           </w:p>
         </w:tc>
@@ -5586,7 +5862,7 @@
                 <w:sz w:val="19"/>
                 <w:szCs w:val="19"/>
               </w:rPr>
-              <w:t xml:space="preserve">젤렌스키 우크라이나 대통령, 유엔총회 연설에서 북한군 포로 2명 한국 송환 사실 공개</w:t>
+              <w:t xml:space="preserve">북한 전투기 1기 서해 전술조치선 월선(공군 전투기 발진, 백령도 인근 어선 70여 척 대피, 약 2시간 후 해제). 대통령 유엔총회 기조연설(현지 22일). 이형일 경제부총리 취임</w:t>
             </w:r>
           </w:p>
         </w:tc>
@@ -5623,7 +5899,7 @@
                 <w:sz w:val="19"/>
                 <w:szCs w:val="19"/>
               </w:rPr>
-              <w:t xml:space="preserve">9.24(목)</w:t>
+              <w:t xml:space="preserve">9.23(수)</w:t>
             </w:r>
           </w:p>
         </w:tc>
@@ -5655,7 +5931,7 @@
                 <w:sz w:val="19"/>
                 <w:szCs w:val="19"/>
               </w:rPr>
-              <w:t xml:space="preserve">트럼프–시진핑 정상회담(백악관). 뚜렷한 성과물 없이 후속 대화 지속 합의</w:t>
+              <w:t xml:space="preserve">젤렌스키 우크라이나 대통령, 유엔총회 연설에서 북한군 포로 2명 한국 송환 사실 공개</w:t>
             </w:r>
           </w:p>
         </w:tc>
@@ -5692,7 +5968,7 @@
                 <w:sz w:val="19"/>
                 <w:szCs w:val="19"/>
               </w:rPr>
-              <w:t xml:space="preserve">9.28(월)</w:t>
+              <w:t xml:space="preserve">9.24(목)</w:t>
             </w:r>
           </w:p>
         </w:tc>
@@ -5724,7 +6000,7 @@
                 <w:sz w:val="19"/>
                 <w:szCs w:val="19"/>
               </w:rPr>
-              <w:t xml:space="preserve">외교부, 주한 우크라이나 대사대리 초치. 통일부장관 유럽 출장 출발. 비서실장 사의 수리 여부 미발표</w:t>
+              <w:t xml:space="preserve">트럼프–시진핑 정상회담(백악관). 뚜렷한 성과물 없이 후속 대화 지속 합의</w:t>
             </w:r>
           </w:p>
         </w:tc>
@@ -5761,7 +6037,7 @@
                 <w:sz w:val="19"/>
                 <w:szCs w:val="19"/>
               </w:rPr>
-              <w:t xml:space="preserve">9.29(화)</w:t>
+              <w:t xml:space="preserve">9.28(월)</w:t>
             </w:r>
           </w:p>
         </w:tc>
@@ -5793,7 +6069,7 @@
                 <w:sz w:val="19"/>
                 <w:szCs w:val="19"/>
               </w:rPr>
-              <w:t xml:space="preserve">제42회 국무회의(대통령 “음모론 경계”). 국회 국방위에서 국방부장관 “매설” 확인, 현장에서 4번째 지뢰 발견</w:t>
+              <w:t xml:space="preserve">외교부, 주한 우크라이나 대사대리 초치. 통일부장관 유럽 출장 출발(9.29부터 북아일랜드 일정). 비서실장 사의 수리 여부 미발표</w:t>
             </w:r>
           </w:p>
         </w:tc>
@@ -5830,6 +6106,75 @@
                 <w:sz w:val="19"/>
                 <w:szCs w:val="19"/>
               </w:rPr>
+              <w:t xml:space="preserve">9.29(화)</w:t>
+            </w:r>
+          </w:p>
+        </w:tc>
+        <w:tc>
+          <w:tcPr>
+            <w:tcW w:type="dxa" w:w="8338"/>
+            <w:tcBorders>
+              <w:top w:val="single" w:color="000000" w:sz="4"/>
+              <w:left w:val="single" w:color="000000" w:sz="4"/>
+              <w:bottom w:val="single" w:color="000000" w:sz="4"/>
+              <w:right w:val="single" w:color="000000" w:sz="4"/>
+            </w:tcBorders>
+            <w:tcMar>
+              <w:top w:type="dxa" w:w="60"/>
+              <w:left w:type="dxa" w:w="80"/>
+              <w:bottom w:type="dxa" w:w="60"/>
+              <w:right w:type="dxa" w:w="80"/>
+            </w:tcMar>
+            <w:vAlign w:val="center"/>
+          </w:tcPr>
+          <w:p>
+            <w:pPr>
+              <w:spacing w:line="280" w:lineRule="auto"/>
+              <w:jc w:val="left"/>
+            </w:pPr>
+            <w:r>
+              <w:rPr>
+                <w:rFonts w:ascii="바탕" w:cs="바탕" w:eastAsia="바탕" w:hAnsi="바탕"/>
+                <w:sz w:val="19"/>
+                <w:szCs w:val="19"/>
+              </w:rPr>
+              <w:t xml:space="preserve">제42회 국무회의(대통령 “음모론 경계”). 국회 국방위에서 국방부장관 “매설” 확인, 현장에서 4번째 지뢰 발견</w:t>
+            </w:r>
+          </w:p>
+        </w:tc>
+      </w:tr>
+      <w:tr>
+        <w:trPr>
+          <w:cantSplit/>
+        </w:trPr>
+        <w:tc>
+          <w:tcPr>
+            <w:tcW w:type="dxa" w:w="1300"/>
+            <w:tcBorders>
+              <w:top w:val="single" w:color="000000" w:sz="4"/>
+              <w:left w:val="single" w:color="000000" w:sz="4"/>
+              <w:bottom w:val="single" w:color="000000" w:sz="4"/>
+              <w:right w:val="single" w:color="000000" w:sz="4"/>
+            </w:tcBorders>
+            <w:tcMar>
+              <w:top w:type="dxa" w:w="60"/>
+              <w:left w:type="dxa" w:w="80"/>
+              <w:bottom w:type="dxa" w:w="60"/>
+              <w:right w:type="dxa" w:w="80"/>
+            </w:tcMar>
+            <w:vAlign w:val="center"/>
+          </w:tcPr>
+          <w:p>
+            <w:pPr>
+              <w:spacing w:line="280" w:lineRule="auto"/>
+              <w:jc w:val="center"/>
+            </w:pPr>
+            <w:r>
+              <w:rPr>
+                <w:rFonts w:ascii="바탕" w:cs="바탕" w:eastAsia="바탕" w:hAnsi="바탕"/>
+                <w:sz w:val="19"/>
+                <w:szCs w:val="19"/>
+              </w:rPr>
               <w:t xml:space="preserve">9.30(수)</w:t>
             </w:r>
           </w:p>
@@ -5862,7 +6207,7 @@
                 <w:sz w:val="19"/>
                 <w:szCs w:val="19"/>
               </w:rPr>
-              <w:t xml:space="preserve">유엔사 “정전협정 위반” 발표, 합참 “요새화 중단·사과” 촉구. 김여정 담화. 국회 정보위(국정원 보고), 외통위 파행</w:t>
+              <w:t xml:space="preserve">오전 7시 30분경 김여정 담화 보도. 오전 유엔사 “정전협정 위반” 발표, 합참 작전본부장 입장문(10:30경). 10:00 국회 정보위(국정원 보고). 대통령 국군수도병원 부상 장병 위문(오전). 부산 해군작전사령부 점검(국방부장관, 10:20). 14:00 외통위(야당 단독, 정부·여당 불참). 오후 울산 대호김종서함 진수식(대통령). 14:00 국가첨단전략산업위, 16:30 범부처 주택 신속공급 점검회의(총리·부총리)</w:t>
             </w:r>
           </w:p>
         </w:tc>
@@ -7213,7 +7558,7 @@
           <w:sz w:val="22"/>
           <w:szCs w:val="22"/>
         </w:rPr>
-        <w:t xml:space="preserve">유럽 출장 중 사고 보고를 받았고 현지에서도 계속 확인하고 있음. 출장 일정은 단축하여 내일 귀국하도록 조치하고 있음.</w:t>
+        <w:t xml:space="preserve">북아일랜드에서 사고 보고를 받았고 현지에서도 계속 확인하고 있음. 아일랜드와 독일 일정은 단축을 검토하고 있던 중임.</w:t>
       </w:r>
     </w:p>
     <w:p>
@@ -7291,7 +7636,7 @@
           <w:sz w:val="22"/>
           <w:szCs w:val="22"/>
         </w:rPr>
-        <w:t xml:space="preserve">판단이 부족했다고 하셨으니 그 말을 기억하겠습니다. 귀국하는 즉시 국회에 가서 설명하세요. 그리고 장관님, 평화 얘기하는 건 좋은데, 평화공존이 구호가 돼서는 안 됩니다. 국민의 안전이 담보되지 않는 평화는 평화가 아닙니다. 그 점은 장관님도 동의하시죠?</w:t>
+        <w:t xml:space="preserve">판단이 부족했다고 하셨으니 그 말을 기억하겠습니다. 단축을 검토할 단계가 아닙니다. 아일랜드, 독일 일정은 취소하고 내일 들어오세요. 들어오는 즉시 국회에 가서 설명하시고요. 그리고 장관님, 평화 얘기하는 건 좋은데, 평화공존이 구호가 돼서는 안 됩니다. 국민의 안전이 담보되지 않는 평화는 평화가 아닙니다. 그 점은 장관님도 동의하시죠?</w:t>
       </w:r>
     </w:p>
     <w:p>
@@ -7333,7 +7678,7 @@
           <w:sz w:val="22"/>
           <w:szCs w:val="22"/>
         </w:rPr>
-        <w:t xml:space="preserve">동의함. 평화는 안전이 전제되어야 한다는 점에 이견이 없음. 귀국 즉시 국회에 출석하여 설명하겠음.</w:t>
+        <w:t xml:space="preserve">동의함. 평화는 안전이 전제되어야 한다는 점에 이견이 없음. 잔여 일정을 취소하고 내일 귀국하여 즉시 국회에 출석하여 설명하겠음.</w:t>
       </w:r>
     </w:p>
     <w:p>
@@ -10166,7 +10511,7 @@
           <w:sz w:val="22"/>
           <w:szCs w:val="22"/>
         </w:rPr>
-        <w:t xml:space="preserve">법무부차관(장관 직무대행)</w:t>
+        <w:t xml:space="preserve">법무부차관 이진수(장관 직무대행)</w:t>
       </w:r>
     </w:p>
     <w:p>
@@ -10312,7 +10657,7 @@
           <w:sz w:val="21"/>
           <w:szCs w:val="21"/>
         </w:rPr>
-        <w:t xml:space="preserve">법무부차관(장관 직무대행)</w:t>
+        <w:t xml:space="preserve">법무부차관 이진수(장관 직무대행)</w:t>
       </w:r>
     </w:p>
     <w:p>
@@ -10372,7 +10717,7 @@
           <w:sz w:val="21"/>
           <w:szCs w:val="21"/>
         </w:rPr>
-        <w:t xml:space="preserve">법무부차관(장관 직무대행)</w:t>
+        <w:t xml:space="preserve">법무부차관 이진수(장관 직무대행)</w:t>
       </w:r>
     </w:p>
     <w:p>
@@ -10772,7 +11117,7 @@
           <w:sz w:val="21"/>
           <w:szCs w:val="21"/>
         </w:rPr>
-        <w:t xml:space="preserve">법무부차관(장관 직무대행)</w:t>
+        <w:t xml:space="preserve">법무부차관 이진수(장관 직무대행)</w:t>
       </w:r>
     </w:p>
     <w:p>
@@ -11129,6 +11474,21 @@
           <w:szCs w:val="22"/>
         </w:rPr>
         <w:t xml:space="preserve">대통령께서는 9월 18일 기자회견에서 전쟁에 관여하거나 개입하는 파병은 없다는 원칙에 변함이 없다고 밝히시면서도, 우리 상선과 원유 수송로, 국민 안전을 지키기 위한 청해부대 활동 강화는 검토하고 있다고 하셨음. 홍해 진입도 검토를 지시하셨음.</w:t>
+      </w:r>
+    </w:p>
+    <w:p>
+      <w:pPr>
+        <w:spacing w:after="120" w:line="350" w:lineRule="auto"/>
+        <w:ind w:left="340"/>
+        <w:jc w:val="both"/>
+      </w:pPr>
+      <w:r>
+        <w:rPr>
+          <w:rFonts w:ascii="바탕" w:cs="바탕" w:eastAsia="바탕" w:hAnsi="바탕"/>
+          <w:sz w:val="22"/>
+          <w:szCs w:val="22"/>
+        </w:rPr>
+        <w:t xml:space="preserve">국방부장관은 오늘 부산 해군작전사령부를 방문하여 해양 작전 대비태세를 점검하고, 10월 초 소말리아 아덴만 해역에 파견될 청해부대 49진의 준비 상황을 확인하였음.</w:t>
       </w:r>
     </w:p>
     <w:p>
@@ -11518,7 +11878,7 @@
                 <w:sz w:val="19"/>
                 <w:szCs w:val="19"/>
               </w:rPr>
-              <w:t xml:space="preserve">기존 파견 부대의 작전 영역 확대, 홍해 진입 검토</w:t>
+              <w:t xml:space="preserve">기존 파견 부대의 작전 영역 확대, 홍해 진입 검토(10월 초 청해부대 49진 파견 시점과 연계 검토)</w:t>
             </w:r>
           </w:p>
         </w:tc>
@@ -11951,7 +12311,7 @@
           <w:sz w:val="21"/>
           <w:szCs w:val="21"/>
         </w:rPr>
-        <w:t xml:space="preserve">법무부차관(장관 직무대행)</w:t>
+        <w:t xml:space="preserve">법무부차관 이진수(장관 직무대행)</w:t>
       </w:r>
     </w:p>
     <w:p>
@@ -15478,7 +15838,108 @@
           <w:sz w:val="22"/>
           <w:szCs w:val="22"/>
         </w:rPr>
-        <w:t xml:space="preserve">지지율 얘기는 하지 마세요. 지지율이 낮다고 해서 해야 할 일을 안 할 수 없고, 높다고 해서 해도 되는 일이 늘어나는 것도 아닙니다. 다만 국민이 정부를 바라보는 눈이 엄중하다는 건 아프게 받아들이겠습니다. 대통령비서실에서 말씀드리죠. 그동안 사고 대응에 관한 비판이 나올 때 청와대는 어떻게 대응했습니까? 대변인 브리핑은 했습니까?</w:t>
+        <w:t xml:space="preserve">지지율 얘기는 하지 마세요. 지지율이 낮다고 해서 해야 할 일을 안 할 수 없고, 높다고 해서 해도 되는 일이 늘어나는 것도 아닙니다. 다만 국민이 정부를 바라보는 눈이 엄중하다는 건 아프게 받아들이겠습니다. 그러면 소통 쪽을 짚겠습니다. 그동안 사고 대응에 관한 비판이 나올 때 청와대는 어떻게 대응했습니까? 홍보소통수석이 설명해 주세요.</w:t>
+      </w:r>
+    </w:p>
+    <w:p>
+      <w:pPr>
+        <w:keepNext/>
+        <w:spacing w:after="80" w:before="160"/>
+      </w:pPr>
+      <w:r>
+        <w:rPr>
+          <w:rFonts w:ascii="맑은 고딕" w:cs="맑은 고딕" w:eastAsia="맑은 고딕" w:hAnsi="맑은 고딕"/>
+          <w:b/>
+          <w:bCs/>
+          <w:sz w:val="22"/>
+          <w:szCs w:val="22"/>
+        </w:rPr>
+        <w:t xml:space="preserve">○ </w:t>
+      </w:r>
+      <w:r>
+        <w:rPr>
+          <w:rFonts w:ascii="맑은 고딕" w:cs="맑은 고딕" w:eastAsia="맑은 고딕" w:hAnsi="맑은 고딕"/>
+          <w:b/>
+          <w:bCs/>
+          <w:sz w:val="22"/>
+          <w:szCs w:val="22"/>
+        </w:rPr>
+        <w:t xml:space="preserve">대통령비서실 홍보소통수석 성기홍</w:t>
+      </w:r>
+    </w:p>
+    <w:p>
+      <w:pPr>
+        <w:spacing w:after="120" w:line="350" w:lineRule="auto"/>
+        <w:ind w:left="340"/>
+        <w:jc w:val="both"/>
+      </w:pPr>
+      <w:r>
+        <w:rPr>
+          <w:rFonts w:ascii="바탕" w:cs="바탕" w:eastAsia="바탕" w:hAnsi="바탕"/>
+          <w:sz w:val="22"/>
+          <w:szCs w:val="22"/>
+        </w:rPr>
+        <w:t xml:space="preserve">청와대 대외 설명 현황 보고드리겠음. 사고 이후 청와대는 “선 진상규명, 후 응분의 조치”라는 입장을 반복해 왔고, 이 표현이 대응이 미온적이라는 비판으로 이어진 측면이 있음. 오늘도 청와대 입장은 결코 미온적이지 않다는 점을 설명할 계획임.</w:t>
+      </w:r>
+    </w:p>
+    <w:p>
+      <w:pPr>
+        <w:pBdr>
+          <w:left w:val="single" w:color="1F2F6B" w:sz="18" w:space="8"/>
+        </w:pBdr>
+        <w:spacing w:after="120" w:line="350" w:lineRule="auto"/>
+        <w:ind w:left="200"/>
+        <w:jc w:val="both"/>
+      </w:pPr>
+      <w:r>
+        <w:rPr>
+          <w:rFonts w:ascii="바탕" w:cs="바탕" w:eastAsia="바탕" w:hAnsi="바탕"/>
+          <w:sz w:val="22"/>
+          <w:szCs w:val="22"/>
+        </w:rPr>
+        <w:t xml:space="preserve">선 진상규명, 후 조치. 맞습니다. 저도 어제 그렇게 말했습니다. 그런데 오늘 진상이 확인됐으면 이제 후 조치 단계로 넘어간 겁니다. 그 표현을 계속 쓰면 아무것도 안 하겠다는 말로 들립니다. 오늘부터는 무엇을 하고 있는지로 설명하세요. 말 바꾸기라는 소리 들을까 봐 그 표현에 갇혀 있으면 안 됩니다.</w:t>
+      </w:r>
+    </w:p>
+    <w:p>
+      <w:pPr>
+        <w:keepNext/>
+        <w:spacing w:after="60" w:before="140"/>
+        <w:ind w:left="340"/>
+      </w:pPr>
+      <w:r>
+        <w:rPr>
+          <w:rFonts w:ascii="맑은 고딕" w:cs="맑은 고딕" w:eastAsia="맑은 고딕" w:hAnsi="맑은 고딕"/>
+          <w:b/>
+          <w:bCs/>
+          <w:sz w:val="20"/>
+          <w:szCs w:val="20"/>
+        </w:rPr>
+        <w:t xml:space="preserve">● </w:t>
+      </w:r>
+      <w:r>
+        <w:rPr>
+          <w:rFonts w:ascii="맑은 고딕" w:cs="맑은 고딕" w:eastAsia="맑은 고딕" w:hAnsi="맑은 고딕"/>
+          <w:b/>
+          <w:bCs/>
+          <w:sz w:val="21"/>
+          <w:szCs w:val="21"/>
+        </w:rPr>
+        <w:t xml:space="preserve">대통령비서실 홍보소통수석 성기홍</w:t>
+      </w:r>
+    </w:p>
+    <w:p>
+      <w:pPr>
+        <w:spacing w:after="120" w:line="350" w:lineRule="auto"/>
+        <w:ind w:left="800"/>
+        <w:jc w:val="both"/>
+      </w:pPr>
+      <w:r>
+        <w:rPr>
+          <w:rFonts w:ascii="바탕" w:cs="바탕" w:eastAsia="바탕" w:hAnsi="바탕"/>
+          <w:sz w:val="22"/>
+          <w:szCs w:val="22"/>
+        </w:rPr>
+        <w:t xml:space="preserve">알겠음. 오늘 결정사항 중 공개 가능한 내용을 중심으로 설명 방식을 바꾸겠음.</w:t>
       </w:r>
     </w:p>
     <w:p>
@@ -18972,7 +19433,7 @@
                 <w:sz w:val="19"/>
                 <w:szCs w:val="19"/>
               </w:rPr>
-              <w:t xml:space="preserve">정동영 통일부장관 귀국 / 국군의 날 / NSC 미소집 경위 발표</w:t>
+              <w:t xml:space="preserve">정동영 통일부장관 귀국 / 제78주년 국군의 날 기념식(계룡대, 대통령 참석 확인) / NSC 미소집 경위 발표</w:t>
             </w:r>
           </w:p>
         </w:tc>
@@ -19004,7 +19465,7 @@
                 <w:sz w:val="19"/>
                 <w:szCs w:val="19"/>
               </w:rPr>
-              <w:t xml:space="preserve">대통령 참석 여부 별도 확인</w:t>
+              <w:t xml:space="preserve">대통령 기념사에서 부상 장병 위로, 긴장 완화 조치 지속 언급(보도)</w:t>
             </w:r>
           </w:p>
         </w:tc>
@@ -21307,7 +21768,7 @@
           <w:sz w:val="20"/>
           <w:szCs w:val="20"/>
         </w:rPr>
-        <w:t xml:space="preserve">(21시 40분 폐회)</w:t>
+        <w:t xml:space="preserve">(22시 10분 폐회)</w:t>
       </w:r>
     </w:p>
     <w:p>
@@ -25071,7 +25532,7 @@
           <w:sz w:val="26"/>
           <w:szCs w:val="26"/>
         </w:rPr>
-        <w:t xml:space="preserve">1. 9월 30일 실제 일정 대조</w:t>
+        <w:t xml:space="preserve">1. 9월 30일 실제 일정 시간표(KST)</w:t>
       </w:r>
     </w:p>
     <w:tbl>
@@ -25087,9 +25548,9 @@
         </w:tblBorders>
       </w:tblPr>
       <w:tblGrid>
-        <w:gridCol w:w="2000"/>
-        <w:gridCol w:w="5238"/>
-        <w:gridCol w:w="2400"/>
+        <w:gridCol w:w="1300"/>
+        <w:gridCol w:w="6038"/>
+        <w:gridCol w:w="2300"/>
       </w:tblGrid>
       <w:tr>
         <w:trPr>
@@ -25097,7 +25558,7 @@
         </w:trPr>
         <w:tc>
           <w:tcPr>
-            <w:tcW w:type="dxa" w:w="2000"/>
+            <w:tcW w:type="dxa" w:w="1300"/>
             <w:tcBorders>
               <w:top w:val="single" w:color="000000" w:sz="4"/>
               <w:left w:val="single" w:color="000000" w:sz="4"/>
@@ -25126,13 +25587,13 @@
                 <w:sz w:val="19"/>
                 <w:szCs w:val="19"/>
               </w:rPr>
-              <w:t xml:space="preserve">인물</w:t>
-            </w:r>
-          </w:p>
-        </w:tc>
-        <w:tc>
-          <w:tcPr>
-            <w:tcW w:type="dxa" w:w="5238"/>
+              <w:t xml:space="preserve">시 각</w:t>
+            </w:r>
+          </w:p>
+        </w:tc>
+        <w:tc>
+          <w:tcPr>
+            <w:tcW w:type="dxa" w:w="6038"/>
             <w:tcBorders>
               <w:top w:val="single" w:color="000000" w:sz="4"/>
               <w:left w:val="single" w:color="000000" w:sz="4"/>
@@ -25161,13 +25622,13 @@
                 <w:sz w:val="19"/>
                 <w:szCs w:val="19"/>
               </w:rPr>
-              <w:t xml:space="preserve">9.30 확인된 일정</w:t>
-            </w:r>
-          </w:p>
-        </w:tc>
-        <w:tc>
-          <w:tcPr>
-            <w:tcW w:type="dxa" w:w="2400"/>
+              <w:t xml:space="preserve">확인된 일정</w:t>
+            </w:r>
+          </w:p>
+        </w:tc>
+        <w:tc>
+          <w:tcPr>
+            <w:tcW w:type="dxa" w:w="2300"/>
             <w:tcBorders>
               <w:top w:val="single" w:color="000000" w:sz="4"/>
               <w:left w:val="single" w:color="000000" w:sz="4"/>
@@ -25196,7 +25657,7 @@
                 <w:sz w:val="19"/>
                 <w:szCs w:val="19"/>
               </w:rPr>
-              <w:t xml:space="preserve">회의 반영</w:t>
+              <w:t xml:space="preserve">출처 성격</w:t>
             </w:r>
           </w:p>
         </w:tc>
@@ -25207,39 +25668,39 @@
         </w:trPr>
         <w:tc>
           <w:tcPr>
-            <w:tcW w:type="dxa" w:w="2000"/>
-            <w:tcBorders>
-              <w:top w:val="single" w:color="000000" w:sz="4"/>
-              <w:left w:val="single" w:color="000000" w:sz="4"/>
-              <w:bottom w:val="single" w:color="000000" w:sz="4"/>
-              <w:right w:val="single" w:color="000000" w:sz="4"/>
-            </w:tcBorders>
-            <w:tcMar>
-              <w:top w:type="dxa" w:w="60"/>
-              <w:left w:type="dxa" w:w="80"/>
-              <w:bottom w:type="dxa" w:w="60"/>
-              <w:right w:type="dxa" w:w="80"/>
-            </w:tcMar>
-            <w:vAlign w:val="center"/>
-          </w:tcPr>
-          <w:p>
-            <w:pPr>
-              <w:spacing w:line="280" w:lineRule="auto"/>
-              <w:jc w:val="center"/>
-            </w:pPr>
-            <w:r>
-              <w:rPr>
-                <w:rFonts w:ascii="바탕" w:cs="바탕" w:eastAsia="바탕" w:hAnsi="바탕"/>
-                <w:sz w:val="19"/>
-                <w:szCs w:val="19"/>
-              </w:rPr>
-              <w:t xml:space="preserve">이재명 대통령</w:t>
-            </w:r>
-          </w:p>
-        </w:tc>
-        <w:tc>
-          <w:tcPr>
-            <w:tcW w:type="dxa" w:w="5238"/>
+            <w:tcW w:type="dxa" w:w="1300"/>
+            <w:tcBorders>
+              <w:top w:val="single" w:color="000000" w:sz="4"/>
+              <w:left w:val="single" w:color="000000" w:sz="4"/>
+              <w:bottom w:val="single" w:color="000000" w:sz="4"/>
+              <w:right w:val="single" w:color="000000" w:sz="4"/>
+            </w:tcBorders>
+            <w:tcMar>
+              <w:top w:type="dxa" w:w="60"/>
+              <w:left w:type="dxa" w:w="80"/>
+              <w:bottom w:type="dxa" w:w="60"/>
+              <w:right w:type="dxa" w:w="80"/>
+            </w:tcMar>
+            <w:vAlign w:val="center"/>
+          </w:tcPr>
+          <w:p>
+            <w:pPr>
+              <w:spacing w:line="280" w:lineRule="auto"/>
+              <w:jc w:val="center"/>
+            </w:pPr>
+            <w:r>
+              <w:rPr>
+                <w:rFonts w:ascii="바탕" w:cs="바탕" w:eastAsia="바탕" w:hAnsi="바탕"/>
+                <w:sz w:val="19"/>
+                <w:szCs w:val="19"/>
+              </w:rPr>
+              <w:t xml:space="preserve">07:30경</w:t>
+            </w:r>
+          </w:p>
+        </w:tc>
+        <w:tc>
+          <w:tcPr>
+            <w:tcW w:type="dxa" w:w="6038"/>
             <w:tcBorders>
               <w:top w:val="single" w:color="000000" w:sz="4"/>
               <w:left w:val="single" w:color="000000" w:sz="4"/>
@@ -25265,13 +25726,13 @@
                 <w:sz w:val="19"/>
                 <w:szCs w:val="19"/>
               </w:rPr>
-              <w:t xml:space="preserve">공개 일정 없음(통상업무)</w:t>
-            </w:r>
-          </w:p>
-        </w:tc>
-        <w:tc>
-          <w:tcPr>
-            <w:tcW w:type="dxa" w:w="2400"/>
+              <w:t xml:space="preserve">김여정 노동당 총무부장 담화 보도(조선중앙통신)</w:t>
+            </w:r>
+          </w:p>
+        </w:tc>
+        <w:tc>
+          <w:tcPr>
+            <w:tcW w:type="dxa" w:w="2300"/>
             <w:tcBorders>
               <w:top w:val="single" w:color="000000" w:sz="4"/>
               <w:left w:val="single" w:color="000000" w:sz="4"/>
@@ -25297,7 +25758,7 @@
                 <w:sz w:val="19"/>
                 <w:szCs w:val="19"/>
               </w:rPr>
-              <w:t xml:space="preserve">종일 가능</w:t>
+              <w:t xml:space="preserve">기사 입력 시각 기준</w:t>
             </w:r>
           </w:p>
         </w:tc>
@@ -25308,39 +25769,39 @@
         </w:trPr>
         <w:tc>
           <w:tcPr>
-            <w:tcW w:type="dxa" w:w="2000"/>
-            <w:tcBorders>
-              <w:top w:val="single" w:color="000000" w:sz="4"/>
-              <w:left w:val="single" w:color="000000" w:sz="4"/>
-              <w:bottom w:val="single" w:color="000000" w:sz="4"/>
-              <w:right w:val="single" w:color="000000" w:sz="4"/>
-            </w:tcBorders>
-            <w:tcMar>
-              <w:top w:type="dxa" w:w="60"/>
-              <w:left w:type="dxa" w:w="80"/>
-              <w:bottom w:type="dxa" w:w="60"/>
-              <w:right w:type="dxa" w:w="80"/>
-            </w:tcMar>
-            <w:vAlign w:val="center"/>
-          </w:tcPr>
-          <w:p>
-            <w:pPr>
-              <w:spacing w:line="280" w:lineRule="auto"/>
-              <w:jc w:val="center"/>
-            </w:pPr>
-            <w:r>
-              <w:rPr>
-                <w:rFonts w:ascii="바탕" w:cs="바탕" w:eastAsia="바탕" w:hAnsi="바탕"/>
-                <w:sz w:val="19"/>
-                <w:szCs w:val="19"/>
-              </w:rPr>
-              <w:t xml:space="preserve">한성숙 국무총리</w:t>
-            </w:r>
-          </w:p>
-        </w:tc>
-        <w:tc>
-          <w:tcPr>
-            <w:tcW w:type="dxa" w:w="5238"/>
+            <w:tcW w:type="dxa" w:w="1300"/>
+            <w:tcBorders>
+              <w:top w:val="single" w:color="000000" w:sz="4"/>
+              <w:left w:val="single" w:color="000000" w:sz="4"/>
+              <w:bottom w:val="single" w:color="000000" w:sz="4"/>
+              <w:right w:val="single" w:color="000000" w:sz="4"/>
+            </w:tcBorders>
+            <w:tcMar>
+              <w:top w:type="dxa" w:w="60"/>
+              <w:left w:type="dxa" w:w="80"/>
+              <w:bottom w:type="dxa" w:w="60"/>
+              <w:right w:type="dxa" w:w="80"/>
+            </w:tcMar>
+            <w:vAlign w:val="center"/>
+          </w:tcPr>
+          <w:p>
+            <w:pPr>
+              <w:spacing w:line="280" w:lineRule="auto"/>
+              <w:jc w:val="center"/>
+            </w:pPr>
+            <w:r>
+              <w:rPr>
+                <w:rFonts w:ascii="바탕" w:cs="바탕" w:eastAsia="바탕" w:hAnsi="바탕"/>
+                <w:sz w:val="19"/>
+                <w:szCs w:val="19"/>
+              </w:rPr>
+              <w:t xml:space="preserve">오전</w:t>
+            </w:r>
+          </w:p>
+        </w:tc>
+        <w:tc>
+          <w:tcPr>
+            <w:tcW w:type="dxa" w:w="6038"/>
             <w:tcBorders>
               <w:top w:val="single" w:color="000000" w:sz="4"/>
               <w:left w:val="single" w:color="000000" w:sz="4"/>
@@ -25366,13 +25827,13 @@
                 <w:sz w:val="19"/>
                 <w:szCs w:val="19"/>
               </w:rPr>
-              <w:t xml:space="preserve">14:00 제9차 국가첨단전략산업위원회, 15:50 주택정책 장관회의, 16:30 주택공급 점검회의</w:t>
-            </w:r>
-          </w:p>
-        </w:tc>
-        <w:tc>
-          <w:tcPr>
-            <w:tcW w:type="dxa" w:w="2400"/>
+              <w:t xml:space="preserve">유엔사 “정전협정 위반” 공식 발표(한국일보 보도 09:34)</w:t>
+            </w:r>
+          </w:p>
+        </w:tc>
+        <w:tc>
+          <w:tcPr>
+            <w:tcW w:type="dxa" w:w="2300"/>
             <w:tcBorders>
               <w:top w:val="single" w:color="000000" w:sz="4"/>
               <w:left w:val="single" w:color="000000" w:sz="4"/>
@@ -25398,7 +25859,7 @@
                 <w:sz w:val="19"/>
                 <w:szCs w:val="19"/>
               </w:rPr>
-              <w:t xml:space="preserve">17:30 이후 참석</w:t>
+              <w:t xml:space="preserve">보도</w:t>
             </w:r>
           </w:p>
         </w:tc>
@@ -25409,39 +25870,39 @@
         </w:trPr>
         <w:tc>
           <w:tcPr>
-            <w:tcW w:type="dxa" w:w="2000"/>
-            <w:tcBorders>
-              <w:top w:val="single" w:color="000000" w:sz="4"/>
-              <w:left w:val="single" w:color="000000" w:sz="4"/>
-              <w:bottom w:val="single" w:color="000000" w:sz="4"/>
-              <w:right w:val="single" w:color="000000" w:sz="4"/>
-            </w:tcBorders>
-            <w:tcMar>
-              <w:top w:type="dxa" w:w="60"/>
-              <w:left w:type="dxa" w:w="80"/>
-              <w:bottom w:type="dxa" w:w="60"/>
-              <w:right w:type="dxa" w:w="80"/>
-            </w:tcMar>
-            <w:vAlign w:val="center"/>
-          </w:tcPr>
-          <w:p>
-            <w:pPr>
-              <w:spacing w:line="280" w:lineRule="auto"/>
-              <w:jc w:val="center"/>
-            </w:pPr>
-            <w:r>
-              <w:rPr>
-                <w:rFonts w:ascii="바탕" w:cs="바탕" w:eastAsia="바탕" w:hAnsi="바탕"/>
-                <w:sz w:val="19"/>
-                <w:szCs w:val="19"/>
-              </w:rPr>
-              <w:t xml:space="preserve">강신철 국방부장관</w:t>
-            </w:r>
-          </w:p>
-        </w:tc>
-        <w:tc>
-          <w:tcPr>
-            <w:tcW w:type="dxa" w:w="5238"/>
+            <w:tcW w:type="dxa" w:w="1300"/>
+            <w:tcBorders>
+              <w:top w:val="single" w:color="000000" w:sz="4"/>
+              <w:left w:val="single" w:color="000000" w:sz="4"/>
+              <w:bottom w:val="single" w:color="000000" w:sz="4"/>
+              <w:right w:val="single" w:color="000000" w:sz="4"/>
+            </w:tcBorders>
+            <w:tcMar>
+              <w:top w:type="dxa" w:w="60"/>
+              <w:left w:type="dxa" w:w="80"/>
+              <w:bottom w:type="dxa" w:w="60"/>
+              <w:right w:type="dxa" w:w="80"/>
+            </w:tcMar>
+            <w:vAlign w:val="center"/>
+          </w:tcPr>
+          <w:p>
+            <w:pPr>
+              <w:spacing w:line="280" w:lineRule="auto"/>
+              <w:jc w:val="center"/>
+            </w:pPr>
+            <w:r>
+              <w:rPr>
+                <w:rFonts w:ascii="바탕" w:cs="바탕" w:eastAsia="바탕" w:hAnsi="바탕"/>
+                <w:sz w:val="19"/>
+                <w:szCs w:val="19"/>
+              </w:rPr>
+              <w:t xml:space="preserve">10:00</w:t>
+            </w:r>
+          </w:p>
+        </w:tc>
+        <w:tc>
+          <w:tcPr>
+            <w:tcW w:type="dxa" w:w="6038"/>
             <w:tcBorders>
               <w:top w:val="single" w:color="000000" w:sz="4"/>
               <w:left w:val="single" w:color="000000" w:sz="4"/>
@@ -25467,13 +25928,13 @@
                 <w:sz w:val="19"/>
                 <w:szCs w:val="19"/>
               </w:rPr>
-              <w:t xml:space="preserve">10:20 해군작전사령부 현장점검</w:t>
-            </w:r>
-          </w:p>
-        </w:tc>
-        <w:tc>
-          <w:tcPr>
-            <w:tcW w:type="dxa" w:w="2400"/>
+              <w:t xml:space="preserve">국회 정보위 전체회의(본관 647호), 이종석 국정원장 출석, 낮 12시경 종료</w:t>
+            </w:r>
+          </w:p>
+        </w:tc>
+        <w:tc>
+          <w:tcPr>
+            <w:tcW w:type="dxa" w:w="2300"/>
             <w:tcBorders>
               <w:top w:val="single" w:color="000000" w:sz="4"/>
               <w:left w:val="single" w:color="000000" w:sz="4"/>
@@ -25499,7 +25960,7 @@
                 <w:sz w:val="19"/>
                 <w:szCs w:val="19"/>
               </w:rPr>
-              <w:t xml:space="preserve">오전 제외, 이동 시간 고려(추정)</w:t>
+              <w:t xml:space="preserve">국회 일정·사진 기사</w:t>
             </w:r>
           </w:p>
         </w:tc>
@@ -25510,39 +25971,39 @@
         </w:trPr>
         <w:tc>
           <w:tcPr>
-            <w:tcW w:type="dxa" w:w="2000"/>
-            <w:tcBorders>
-              <w:top w:val="single" w:color="000000" w:sz="4"/>
-              <w:left w:val="single" w:color="000000" w:sz="4"/>
-              <w:bottom w:val="single" w:color="000000" w:sz="4"/>
-              <w:right w:val="single" w:color="000000" w:sz="4"/>
-            </w:tcBorders>
-            <w:tcMar>
-              <w:top w:type="dxa" w:w="60"/>
-              <w:left w:type="dxa" w:w="80"/>
-              <w:bottom w:type="dxa" w:w="60"/>
-              <w:right w:type="dxa" w:w="80"/>
-            </w:tcMar>
-            <w:vAlign w:val="center"/>
-          </w:tcPr>
-          <w:p>
-            <w:pPr>
-              <w:spacing w:line="280" w:lineRule="auto"/>
-              <w:jc w:val="center"/>
-            </w:pPr>
-            <w:r>
-              <w:rPr>
-                <w:rFonts w:ascii="바탕" w:cs="바탕" w:eastAsia="바탕" w:hAnsi="바탕"/>
-                <w:sz w:val="19"/>
-                <w:szCs w:val="19"/>
-              </w:rPr>
-              <w:t xml:space="preserve">조현 외교부장관</w:t>
-            </w:r>
-          </w:p>
-        </w:tc>
-        <w:tc>
-          <w:tcPr>
-            <w:tcW w:type="dxa" w:w="5238"/>
+            <w:tcW w:type="dxa" w:w="1300"/>
+            <w:tcBorders>
+              <w:top w:val="single" w:color="000000" w:sz="4"/>
+              <w:left w:val="single" w:color="000000" w:sz="4"/>
+              <w:bottom w:val="single" w:color="000000" w:sz="4"/>
+              <w:right w:val="single" w:color="000000" w:sz="4"/>
+            </w:tcBorders>
+            <w:tcMar>
+              <w:top w:type="dxa" w:w="60"/>
+              <w:left w:type="dxa" w:w="80"/>
+              <w:bottom w:type="dxa" w:w="60"/>
+              <w:right w:type="dxa" w:w="80"/>
+            </w:tcMar>
+            <w:vAlign w:val="center"/>
+          </w:tcPr>
+          <w:p>
+            <w:pPr>
+              <w:spacing w:line="280" w:lineRule="auto"/>
+              <w:jc w:val="center"/>
+            </w:pPr>
+            <w:r>
+              <w:rPr>
+                <w:rFonts w:ascii="바탕" w:cs="바탕" w:eastAsia="바탕" w:hAnsi="바탕"/>
+                <w:sz w:val="19"/>
+                <w:szCs w:val="19"/>
+              </w:rPr>
+              <w:t xml:space="preserve">10:00</w:t>
+            </w:r>
+          </w:p>
+        </w:tc>
+        <w:tc>
+          <w:tcPr>
+            <w:tcW w:type="dxa" w:w="6038"/>
             <w:tcBorders>
               <w:top w:val="single" w:color="000000" w:sz="4"/>
               <w:left w:val="single" w:color="000000" w:sz="4"/>
@@ -25568,13 +26029,13 @@
                 <w:sz w:val="19"/>
                 <w:szCs w:val="19"/>
               </w:rPr>
-              <w:t xml:space="preserve">10:00 과학기술 관련 장관회의, 14:00 외통위 불참</w:t>
-            </w:r>
-          </w:p>
-        </w:tc>
-        <w:tc>
-          <w:tcPr>
-            <w:tcW w:type="dxa" w:w="2400"/>
+              <w:t xml:space="preserve">제13회 과학기술관계장관회의(외교부는 김진아 2차관 참석, 조현 장관 아님)</w:t>
+            </w:r>
+          </w:p>
+        </w:tc>
+        <w:tc>
+          <w:tcPr>
+            <w:tcW w:type="dxa" w:w="2300"/>
             <w:tcBorders>
               <w:top w:val="single" w:color="000000" w:sz="4"/>
               <w:left w:val="single" w:color="000000" w:sz="4"/>
@@ -25600,7 +26061,7 @@
                 <w:sz w:val="19"/>
                 <w:szCs w:val="19"/>
               </w:rPr>
-              <w:t xml:space="preserve">저녁 가능</w:t>
+              <w:t xml:space="preserve">사진 기사</w:t>
             </w:r>
           </w:p>
         </w:tc>
@@ -25611,39 +26072,39 @@
         </w:trPr>
         <w:tc>
           <w:tcPr>
-            <w:tcW w:type="dxa" w:w="2000"/>
-            <w:tcBorders>
-              <w:top w:val="single" w:color="000000" w:sz="4"/>
-              <w:left w:val="single" w:color="000000" w:sz="4"/>
-              <w:bottom w:val="single" w:color="000000" w:sz="4"/>
-              <w:right w:val="single" w:color="000000" w:sz="4"/>
-            </w:tcBorders>
-            <w:tcMar>
-              <w:top w:type="dxa" w:w="60"/>
-              <w:left w:type="dxa" w:w="80"/>
-              <w:bottom w:type="dxa" w:w="60"/>
-              <w:right w:type="dxa" w:w="80"/>
-            </w:tcMar>
-            <w:vAlign w:val="center"/>
-          </w:tcPr>
-          <w:p>
-            <w:pPr>
-              <w:spacing w:line="280" w:lineRule="auto"/>
-              <w:jc w:val="center"/>
-            </w:pPr>
-            <w:r>
-              <w:rPr>
-                <w:rFonts w:ascii="바탕" w:cs="바탕" w:eastAsia="바탕" w:hAnsi="바탕"/>
-                <w:sz w:val="19"/>
-                <w:szCs w:val="19"/>
-              </w:rPr>
-              <w:t xml:space="preserve">정동영 통일부장관</w:t>
-            </w:r>
-          </w:p>
-        </w:tc>
-        <w:tc>
-          <w:tcPr>
-            <w:tcW w:type="dxa" w:w="5238"/>
+            <w:tcW w:type="dxa" w:w="1300"/>
+            <w:tcBorders>
+              <w:top w:val="single" w:color="000000" w:sz="4"/>
+              <w:left w:val="single" w:color="000000" w:sz="4"/>
+              <w:bottom w:val="single" w:color="000000" w:sz="4"/>
+              <w:right w:val="single" w:color="000000" w:sz="4"/>
+            </w:tcBorders>
+            <w:tcMar>
+              <w:top w:type="dxa" w:w="60"/>
+              <w:left w:type="dxa" w:w="80"/>
+              <w:bottom w:type="dxa" w:w="60"/>
+              <w:right w:type="dxa" w:w="80"/>
+            </w:tcMar>
+            <w:vAlign w:val="center"/>
+          </w:tcPr>
+          <w:p>
+            <w:pPr>
+              <w:spacing w:line="280" w:lineRule="auto"/>
+              <w:jc w:val="center"/>
+            </w:pPr>
+            <w:r>
+              <w:rPr>
+                <w:rFonts w:ascii="바탕" w:cs="바탕" w:eastAsia="바탕" w:hAnsi="바탕"/>
+                <w:sz w:val="19"/>
+                <w:szCs w:val="19"/>
+              </w:rPr>
+              <w:t xml:space="preserve">10:20~</w:t>
+            </w:r>
+          </w:p>
+        </w:tc>
+        <w:tc>
+          <w:tcPr>
+            <w:tcW w:type="dxa" w:w="6038"/>
             <w:tcBorders>
               <w:top w:val="single" w:color="000000" w:sz="4"/>
               <w:left w:val="single" w:color="000000" w:sz="4"/>
@@ -25669,13 +26130,13 @@
                 <w:sz w:val="19"/>
                 <w:szCs w:val="19"/>
               </w:rPr>
-              <w:t xml:space="preserve">유럽 출장 중(9.28~10.5 예정), 9.30 밤 10.1 조기 귀국 발표</w:t>
-            </w:r>
-          </w:p>
-        </w:tc>
-        <w:tc>
-          <w:tcPr>
-            <w:tcW w:type="dxa" w:w="2400"/>
+              <w:t xml:space="preserve">강신철 국방부장관 부산 해군작전사령부 점검, 청해부대 49진(10월 초 파견) 준비 확인</w:t>
+            </w:r>
+          </w:p>
+        </w:tc>
+        <w:tc>
+          <w:tcPr>
+            <w:tcW w:type="dxa" w:w="2300"/>
             <w:tcBorders>
               <w:top w:val="single" w:color="000000" w:sz="4"/>
               <w:left w:val="single" w:color="000000" w:sz="4"/>
@@ -25701,7 +26162,7 @@
                 <w:sz w:val="19"/>
                 <w:szCs w:val="19"/>
               </w:rPr>
-              <w:t xml:space="preserve">화상 참석으로 설정</w:t>
+              <w:t xml:space="preserve">정부 일정·보도(13:19 기사)</w:t>
             </w:r>
           </w:p>
         </w:tc>
@@ -25712,39 +26173,39 @@
         </w:trPr>
         <w:tc>
           <w:tcPr>
-            <w:tcW w:type="dxa" w:w="2000"/>
-            <w:tcBorders>
-              <w:top w:val="single" w:color="000000" w:sz="4"/>
-              <w:left w:val="single" w:color="000000" w:sz="4"/>
-              <w:bottom w:val="single" w:color="000000" w:sz="4"/>
-              <w:right w:val="single" w:color="000000" w:sz="4"/>
-            </w:tcBorders>
-            <w:tcMar>
-              <w:top w:type="dxa" w:w="60"/>
-              <w:left w:type="dxa" w:w="80"/>
-              <w:bottom w:type="dxa" w:w="60"/>
-              <w:right w:type="dxa" w:w="80"/>
-            </w:tcMar>
-            <w:vAlign w:val="center"/>
-          </w:tcPr>
-          <w:p>
-            <w:pPr>
-              <w:spacing w:line="280" w:lineRule="auto"/>
-              <w:jc w:val="center"/>
-            </w:pPr>
-            <w:r>
-              <w:rPr>
-                <w:rFonts w:ascii="바탕" w:cs="바탕" w:eastAsia="바탕" w:hAnsi="바탕"/>
-                <w:sz w:val="19"/>
-                <w:szCs w:val="19"/>
-              </w:rPr>
-              <w:t xml:space="preserve">이종석 국정원장</w:t>
-            </w:r>
-          </w:p>
-        </w:tc>
-        <w:tc>
-          <w:tcPr>
-            <w:tcW w:type="dxa" w:w="5238"/>
+            <w:tcW w:type="dxa" w:w="1300"/>
+            <w:tcBorders>
+              <w:top w:val="single" w:color="000000" w:sz="4"/>
+              <w:left w:val="single" w:color="000000" w:sz="4"/>
+              <w:bottom w:val="single" w:color="000000" w:sz="4"/>
+              <w:right w:val="single" w:color="000000" w:sz="4"/>
+            </w:tcBorders>
+            <w:tcMar>
+              <w:top w:type="dxa" w:w="60"/>
+              <w:left w:type="dxa" w:w="80"/>
+              <w:bottom w:type="dxa" w:w="60"/>
+              <w:right w:type="dxa" w:w="80"/>
+            </w:tcMar>
+            <w:vAlign w:val="center"/>
+          </w:tcPr>
+          <w:p>
+            <w:pPr>
+              <w:spacing w:line="280" w:lineRule="auto"/>
+              <w:jc w:val="center"/>
+            </w:pPr>
+            <w:r>
+              <w:rPr>
+                <w:rFonts w:ascii="바탕" w:cs="바탕" w:eastAsia="바탕" w:hAnsi="바탕"/>
+                <w:sz w:val="19"/>
+                <w:szCs w:val="19"/>
+              </w:rPr>
+              <w:t xml:space="preserve">10:30경</w:t>
+            </w:r>
+          </w:p>
+        </w:tc>
+        <w:tc>
+          <w:tcPr>
+            <w:tcW w:type="dxa" w:w="6038"/>
             <w:tcBorders>
               <w:top w:val="single" w:color="000000" w:sz="4"/>
               <w:left w:val="single" w:color="000000" w:sz="4"/>
@@ -25770,13 +26231,13 @@
                 <w:sz w:val="19"/>
                 <w:szCs w:val="19"/>
               </w:rPr>
-              <w:t xml:space="preserve">10:00 국회 정보위 보고</w:t>
-            </w:r>
-          </w:p>
-        </w:tc>
-        <w:tc>
-          <w:tcPr>
-            <w:tcW w:type="dxa" w:w="2400"/>
+              <w:t xml:space="preserve">합참 작전본부장(강현우 중장) 입장문: 요새화 중단·사과 촉구</w:t>
+            </w:r>
+          </w:p>
+        </w:tc>
+        <w:tc>
+          <w:tcPr>
+            <w:tcW w:type="dxa" w:w="2300"/>
             <w:tcBorders>
               <w:top w:val="single" w:color="000000" w:sz="4"/>
               <w:left w:val="single" w:color="000000" w:sz="4"/>
@@ -25802,7 +26263,7 @@
                 <w:sz w:val="19"/>
                 <w:szCs w:val="19"/>
               </w:rPr>
-              <w:t xml:space="preserve">오후 가능</w:t>
+              <w:t xml:space="preserve">보도(10:43 기사)</w:t>
             </w:r>
           </w:p>
         </w:tc>
@@ -25813,39 +26274,39 @@
         </w:trPr>
         <w:tc>
           <w:tcPr>
-            <w:tcW w:type="dxa" w:w="2000"/>
-            <w:tcBorders>
-              <w:top w:val="single" w:color="000000" w:sz="4"/>
-              <w:left w:val="single" w:color="000000" w:sz="4"/>
-              <w:bottom w:val="single" w:color="000000" w:sz="4"/>
-              <w:right w:val="single" w:color="000000" w:sz="4"/>
-            </w:tcBorders>
-            <w:tcMar>
-              <w:top w:type="dxa" w:w="60"/>
-              <w:left w:type="dxa" w:w="80"/>
-              <w:bottom w:type="dxa" w:w="60"/>
-              <w:right w:type="dxa" w:w="80"/>
-            </w:tcMar>
-            <w:vAlign w:val="center"/>
-          </w:tcPr>
-          <w:p>
-            <w:pPr>
-              <w:spacing w:line="280" w:lineRule="auto"/>
-              <w:jc w:val="center"/>
-            </w:pPr>
-            <w:r>
-              <w:rPr>
-                <w:rFonts w:ascii="바탕" w:cs="바탕" w:eastAsia="바탕" w:hAnsi="바탕"/>
-                <w:sz w:val="19"/>
-                <w:szCs w:val="19"/>
-              </w:rPr>
-              <w:t xml:space="preserve">국가보훈부장관</w:t>
-            </w:r>
-          </w:p>
-        </w:tc>
-        <w:tc>
-          <w:tcPr>
-            <w:tcW w:type="dxa" w:w="5238"/>
+            <w:tcW w:type="dxa" w:w="1300"/>
+            <w:tcBorders>
+              <w:top w:val="single" w:color="000000" w:sz="4"/>
+              <w:left w:val="single" w:color="000000" w:sz="4"/>
+              <w:bottom w:val="single" w:color="000000" w:sz="4"/>
+              <w:right w:val="single" w:color="000000" w:sz="4"/>
+            </w:tcBorders>
+            <w:tcMar>
+              <w:top w:type="dxa" w:w="60"/>
+              <w:left w:type="dxa" w:w="80"/>
+              <w:bottom w:type="dxa" w:w="60"/>
+              <w:right w:type="dxa" w:w="80"/>
+            </w:tcMar>
+            <w:vAlign w:val="center"/>
+          </w:tcPr>
+          <w:p>
+            <w:pPr>
+              <w:spacing w:line="280" w:lineRule="auto"/>
+              <w:jc w:val="center"/>
+            </w:pPr>
+            <w:r>
+              <w:rPr>
+                <w:rFonts w:ascii="바탕" w:cs="바탕" w:eastAsia="바탕" w:hAnsi="바탕"/>
+                <w:sz w:val="19"/>
+                <w:szCs w:val="19"/>
+              </w:rPr>
+              <w:t xml:space="preserve">오전</w:t>
+            </w:r>
+          </w:p>
+        </w:tc>
+        <w:tc>
+          <w:tcPr>
+            <w:tcW w:type="dxa" w:w="6038"/>
             <w:tcBorders>
               <w:top w:val="single" w:color="000000" w:sz="4"/>
               <w:left w:val="single" w:color="000000" w:sz="4"/>
@@ -25871,13 +26332,13 @@
                 <w:sz w:val="19"/>
                 <w:szCs w:val="19"/>
               </w:rPr>
-              <w:t xml:space="preserve">16:00 미국 조지아주 보훈장관 접견</w:t>
-            </w:r>
-          </w:p>
-        </w:tc>
-        <w:tc>
-          <w:tcPr>
-            <w:tcW w:type="dxa" w:w="2400"/>
+              <w:t xml:space="preserve">이재명 대통령 국군수도병원 방문, DMZ 지뢰 부상 장병 위문</w:t>
+            </w:r>
+          </w:p>
+        </w:tc>
+        <w:tc>
+          <w:tcPr>
+            <w:tcW w:type="dxa" w:w="2300"/>
             <w:tcBorders>
               <w:top w:val="single" w:color="000000" w:sz="4"/>
               <w:left w:val="single" w:color="000000" w:sz="4"/>
@@ -25903,7 +26364,7 @@
                 <w:sz w:val="19"/>
                 <w:szCs w:val="19"/>
               </w:rPr>
-              <w:t xml:space="preserve">참석 대상 아님</w:t>
+              <w:t xml:space="preserve">홍보소통수석 브리핑</w:t>
             </w:r>
           </w:p>
         </w:tc>
@@ -25914,39 +26375,39 @@
         </w:trPr>
         <w:tc>
           <w:tcPr>
-            <w:tcW w:type="dxa" w:w="2000"/>
-            <w:tcBorders>
-              <w:top w:val="single" w:color="000000" w:sz="4"/>
-              <w:left w:val="single" w:color="000000" w:sz="4"/>
-              <w:bottom w:val="single" w:color="000000" w:sz="4"/>
-              <w:right w:val="single" w:color="000000" w:sz="4"/>
-            </w:tcBorders>
-            <w:tcMar>
-              <w:top w:type="dxa" w:w="60"/>
-              <w:left w:type="dxa" w:w="80"/>
-              <w:bottom w:type="dxa" w:w="60"/>
-              <w:right w:type="dxa" w:w="80"/>
-            </w:tcMar>
-            <w:vAlign w:val="center"/>
-          </w:tcPr>
-          <w:p>
-            <w:pPr>
-              <w:spacing w:line="280" w:lineRule="auto"/>
-              <w:jc w:val="center"/>
-            </w:pPr>
-            <w:r>
-              <w:rPr>
-                <w:rFonts w:ascii="바탕" w:cs="바탕" w:eastAsia="바탕" w:hAnsi="바탕"/>
-                <w:sz w:val="19"/>
-                <w:szCs w:val="19"/>
-              </w:rPr>
-              <w:t xml:space="preserve">이형일 경제부총리</w:t>
-            </w:r>
-          </w:p>
-        </w:tc>
-        <w:tc>
-          <w:tcPr>
-            <w:tcW w:type="dxa" w:w="5238"/>
+            <w:tcW w:type="dxa" w:w="1300"/>
+            <w:tcBorders>
+              <w:top w:val="single" w:color="000000" w:sz="4"/>
+              <w:left w:val="single" w:color="000000" w:sz="4"/>
+              <w:bottom w:val="single" w:color="000000" w:sz="4"/>
+              <w:right w:val="single" w:color="000000" w:sz="4"/>
+            </w:tcBorders>
+            <w:tcMar>
+              <w:top w:type="dxa" w:w="60"/>
+              <w:left w:type="dxa" w:w="80"/>
+              <w:bottom w:type="dxa" w:w="60"/>
+              <w:right w:type="dxa" w:w="80"/>
+            </w:tcMar>
+            <w:vAlign w:val="center"/>
+          </w:tcPr>
+          <w:p>
+            <w:pPr>
+              <w:spacing w:line="280" w:lineRule="auto"/>
+              <w:jc w:val="center"/>
+            </w:pPr>
+            <w:r>
+              <w:rPr>
+                <w:rFonts w:ascii="바탕" w:cs="바탕" w:eastAsia="바탕" w:hAnsi="바탕"/>
+                <w:sz w:val="19"/>
+                <w:szCs w:val="19"/>
+              </w:rPr>
+              <w:t xml:space="preserve">오전</w:t>
+            </w:r>
+          </w:p>
+        </w:tc>
+        <w:tc>
+          <w:tcPr>
+            <w:tcW w:type="dxa" w:w="6038"/>
             <w:tcBorders>
               <w:top w:val="single" w:color="000000" w:sz="4"/>
               <w:left w:val="single" w:color="000000" w:sz="4"/>
@@ -25972,13 +26433,13 @@
                 <w:sz w:val="19"/>
                 <w:szCs w:val="19"/>
               </w:rPr>
-              <w:t xml:space="preserve">9.22 취임 후 뉴욕 IR 참석, 이후 귀국(9.28 대미투자 관련 발언). 9.30 구체 일정 미확인</w:t>
-            </w:r>
-          </w:p>
-        </w:tc>
-        <w:tc>
-          <w:tcPr>
-            <w:tcW w:type="dxa" w:w="2400"/>
+              <w:t xml:space="preserve">이형일 부총리 확대 거시재정금융간담회 주재(정부서울청사, 이억원·박홍근·신현송 참석)</w:t>
+            </w:r>
+          </w:p>
+        </w:tc>
+        <w:tc>
+          <w:tcPr>
+            <w:tcW w:type="dxa" w:w="2300"/>
             <w:tcBorders>
               <w:top w:val="single" w:color="000000" w:sz="4"/>
               <w:left w:val="single" w:color="000000" w:sz="4"/>
@@ -26004,7 +26465,1689 @@
                 <w:sz w:val="19"/>
                 <w:szCs w:val="19"/>
               </w:rPr>
-              <w:t xml:space="preserve">참석 가능으로 설정(추정)</w:t>
+              <w:t xml:space="preserve">시각 미확인</w:t>
+            </w:r>
+          </w:p>
+        </w:tc>
+      </w:tr>
+      <w:tr>
+        <w:trPr>
+          <w:cantSplit/>
+        </w:trPr>
+        <w:tc>
+          <w:tcPr>
+            <w:tcW w:type="dxa" w:w="1300"/>
+            <w:tcBorders>
+              <w:top w:val="single" w:color="000000" w:sz="4"/>
+              <w:left w:val="single" w:color="000000" w:sz="4"/>
+              <w:bottom w:val="single" w:color="000000" w:sz="4"/>
+              <w:right w:val="single" w:color="000000" w:sz="4"/>
+            </w:tcBorders>
+            <w:tcMar>
+              <w:top w:type="dxa" w:w="60"/>
+              <w:left w:type="dxa" w:w="80"/>
+              <w:bottom w:type="dxa" w:w="60"/>
+              <w:right w:type="dxa" w:w="80"/>
+            </w:tcMar>
+            <w:vAlign w:val="center"/>
+          </w:tcPr>
+          <w:p>
+            <w:pPr>
+              <w:spacing w:line="280" w:lineRule="auto"/>
+              <w:jc w:val="center"/>
+            </w:pPr>
+            <w:r>
+              <w:rPr>
+                <w:rFonts w:ascii="바탕" w:cs="바탕" w:eastAsia="바탕" w:hAnsi="바탕"/>
+                <w:sz w:val="19"/>
+                <w:szCs w:val="19"/>
+              </w:rPr>
+              <w:t xml:space="preserve">13시대</w:t>
+            </w:r>
+          </w:p>
+        </w:tc>
+        <w:tc>
+          <w:tcPr>
+            <w:tcW w:type="dxa" w:w="6038"/>
+            <w:tcBorders>
+              <w:top w:val="single" w:color="000000" w:sz="4"/>
+              <w:left w:val="single" w:color="000000" w:sz="4"/>
+              <w:bottom w:val="single" w:color="000000" w:sz="4"/>
+              <w:right w:val="single" w:color="000000" w:sz="4"/>
+            </w:tcBorders>
+            <w:tcMar>
+              <w:top w:type="dxa" w:w="60"/>
+              <w:left w:type="dxa" w:w="80"/>
+              <w:bottom w:type="dxa" w:w="60"/>
+              <w:right w:type="dxa" w:w="80"/>
+            </w:tcMar>
+            <w:vAlign w:val="center"/>
+          </w:tcPr>
+          <w:p>
+            <w:pPr>
+              <w:spacing w:line="280" w:lineRule="auto"/>
+              <w:jc w:val="left"/>
+            </w:pPr>
+            <w:r>
+              <w:rPr>
+                <w:rFonts w:ascii="바탕" w:cs="바탕" w:eastAsia="바탕" w:hAnsi="바탕"/>
+                <w:sz w:val="19"/>
+                <w:szCs w:val="19"/>
+              </w:rPr>
+              <w:t xml:space="preserve">이재명 대통령 울산 HD현대중공업 대호김종서함 진수식 주관(축사 기사 13:51~14:25)</w:t>
+            </w:r>
+          </w:p>
+        </w:tc>
+        <w:tc>
+          <w:tcPr>
+            <w:tcW w:type="dxa" w:w="2300"/>
+            <w:tcBorders>
+              <w:top w:val="single" w:color="000000" w:sz="4"/>
+              <w:left w:val="single" w:color="000000" w:sz="4"/>
+              <w:bottom w:val="single" w:color="000000" w:sz="4"/>
+              <w:right w:val="single" w:color="000000" w:sz="4"/>
+            </w:tcBorders>
+            <w:tcMar>
+              <w:top w:type="dxa" w:w="60"/>
+              <w:left w:type="dxa" w:w="80"/>
+              <w:bottom w:type="dxa" w:w="60"/>
+              <w:right w:type="dxa" w:w="80"/>
+            </w:tcMar>
+            <w:vAlign w:val="center"/>
+          </w:tcPr>
+          <w:p>
+            <w:pPr>
+              <w:spacing w:line="280" w:lineRule="auto"/>
+              <w:jc w:val="left"/>
+            </w:pPr>
+            <w:r>
+              <w:rPr>
+                <w:rFonts w:ascii="바탕" w:cs="바탕" w:eastAsia="바탕" w:hAnsi="바탕"/>
+                <w:sz w:val="19"/>
+                <w:szCs w:val="19"/>
+              </w:rPr>
+              <w:t xml:space="preserve">보도</w:t>
+            </w:r>
+          </w:p>
+        </w:tc>
+      </w:tr>
+      <w:tr>
+        <w:trPr>
+          <w:cantSplit/>
+        </w:trPr>
+        <w:tc>
+          <w:tcPr>
+            <w:tcW w:type="dxa" w:w="1300"/>
+            <w:tcBorders>
+              <w:top w:val="single" w:color="000000" w:sz="4"/>
+              <w:left w:val="single" w:color="000000" w:sz="4"/>
+              <w:bottom w:val="single" w:color="000000" w:sz="4"/>
+              <w:right w:val="single" w:color="000000" w:sz="4"/>
+            </w:tcBorders>
+            <w:tcMar>
+              <w:top w:type="dxa" w:w="60"/>
+              <w:left w:type="dxa" w:w="80"/>
+              <w:bottom w:type="dxa" w:w="60"/>
+              <w:right w:type="dxa" w:w="80"/>
+            </w:tcMar>
+            <w:vAlign w:val="center"/>
+          </w:tcPr>
+          <w:p>
+            <w:pPr>
+              <w:spacing w:line="280" w:lineRule="auto"/>
+              <w:jc w:val="center"/>
+            </w:pPr>
+            <w:r>
+              <w:rPr>
+                <w:rFonts w:ascii="바탕" w:cs="바탕" w:eastAsia="바탕" w:hAnsi="바탕"/>
+                <w:sz w:val="19"/>
+                <w:szCs w:val="19"/>
+              </w:rPr>
+              <w:t xml:space="preserve">14:00</w:t>
+            </w:r>
+          </w:p>
+        </w:tc>
+        <w:tc>
+          <w:tcPr>
+            <w:tcW w:type="dxa" w:w="6038"/>
+            <w:tcBorders>
+              <w:top w:val="single" w:color="000000" w:sz="4"/>
+              <w:left w:val="single" w:color="000000" w:sz="4"/>
+              <w:bottom w:val="single" w:color="000000" w:sz="4"/>
+              <w:right w:val="single" w:color="000000" w:sz="4"/>
+            </w:tcBorders>
+            <w:tcMar>
+              <w:top w:type="dxa" w:w="60"/>
+              <w:left w:type="dxa" w:w="80"/>
+              <w:bottom w:type="dxa" w:w="60"/>
+              <w:right w:type="dxa" w:w="80"/>
+            </w:tcMar>
+            <w:vAlign w:val="center"/>
+          </w:tcPr>
+          <w:p>
+            <w:pPr>
+              <w:spacing w:line="280" w:lineRule="auto"/>
+              <w:jc w:val="left"/>
+            </w:pPr>
+            <w:r>
+              <w:rPr>
+                <w:rFonts w:ascii="바탕" w:cs="바탕" w:eastAsia="바탕" w:hAnsi="바탕"/>
+                <w:sz w:val="19"/>
+                <w:szCs w:val="19"/>
+              </w:rPr>
+              <w:t xml:space="preserve">국회 외통위 전체회의(본관 401호), 야당 단독 개의, 정부·여당 불참, 40여 분 만에 종료</w:t>
+            </w:r>
+          </w:p>
+        </w:tc>
+        <w:tc>
+          <w:tcPr>
+            <w:tcW w:type="dxa" w:w="2300"/>
+            <w:tcBorders>
+              <w:top w:val="single" w:color="000000" w:sz="4"/>
+              <w:left w:val="single" w:color="000000" w:sz="4"/>
+              <w:bottom w:val="single" w:color="000000" w:sz="4"/>
+              <w:right w:val="single" w:color="000000" w:sz="4"/>
+            </w:tcBorders>
+            <w:tcMar>
+              <w:top w:type="dxa" w:w="60"/>
+              <w:left w:type="dxa" w:w="80"/>
+              <w:bottom w:type="dxa" w:w="60"/>
+              <w:right w:type="dxa" w:w="80"/>
+            </w:tcMar>
+            <w:vAlign w:val="center"/>
+          </w:tcPr>
+          <w:p>
+            <w:pPr>
+              <w:spacing w:line="280" w:lineRule="auto"/>
+              <w:jc w:val="left"/>
+            </w:pPr>
+            <w:r>
+              <w:rPr>
+                <w:rFonts w:ascii="바탕" w:cs="바탕" w:eastAsia="바탕" w:hAnsi="바탕"/>
+                <w:sz w:val="19"/>
+                <w:szCs w:val="19"/>
+              </w:rPr>
+              <w:t xml:space="preserve">국회 일정·보도</w:t>
+            </w:r>
+          </w:p>
+        </w:tc>
+      </w:tr>
+      <w:tr>
+        <w:trPr>
+          <w:cantSplit/>
+        </w:trPr>
+        <w:tc>
+          <w:tcPr>
+            <w:tcW w:type="dxa" w:w="1300"/>
+            <w:tcBorders>
+              <w:top w:val="single" w:color="000000" w:sz="4"/>
+              <w:left w:val="single" w:color="000000" w:sz="4"/>
+              <w:bottom w:val="single" w:color="000000" w:sz="4"/>
+              <w:right w:val="single" w:color="000000" w:sz="4"/>
+            </w:tcBorders>
+            <w:tcMar>
+              <w:top w:type="dxa" w:w="60"/>
+              <w:left w:type="dxa" w:w="80"/>
+              <w:bottom w:type="dxa" w:w="60"/>
+              <w:right w:type="dxa" w:w="80"/>
+            </w:tcMar>
+            <w:vAlign w:val="center"/>
+          </w:tcPr>
+          <w:p>
+            <w:pPr>
+              <w:spacing w:line="280" w:lineRule="auto"/>
+              <w:jc w:val="center"/>
+            </w:pPr>
+            <w:r>
+              <w:rPr>
+                <w:rFonts w:ascii="바탕" w:cs="바탕" w:eastAsia="바탕" w:hAnsi="바탕"/>
+                <w:sz w:val="19"/>
+                <w:szCs w:val="19"/>
+              </w:rPr>
+              <w:t xml:space="preserve">14:00</w:t>
+            </w:r>
+          </w:p>
+        </w:tc>
+        <w:tc>
+          <w:tcPr>
+            <w:tcW w:type="dxa" w:w="6038"/>
+            <w:tcBorders>
+              <w:top w:val="single" w:color="000000" w:sz="4"/>
+              <w:left w:val="single" w:color="000000" w:sz="4"/>
+              <w:bottom w:val="single" w:color="000000" w:sz="4"/>
+              <w:right w:val="single" w:color="000000" w:sz="4"/>
+            </w:tcBorders>
+            <w:tcMar>
+              <w:top w:type="dxa" w:w="60"/>
+              <w:left w:type="dxa" w:w="80"/>
+              <w:bottom w:type="dxa" w:w="60"/>
+              <w:right w:type="dxa" w:w="80"/>
+            </w:tcMar>
+            <w:vAlign w:val="center"/>
+          </w:tcPr>
+          <w:p>
+            <w:pPr>
+              <w:spacing w:line="280" w:lineRule="auto"/>
+              <w:jc w:val="left"/>
+            </w:pPr>
+            <w:r>
+              <w:rPr>
+                <w:rFonts w:ascii="바탕" w:cs="바탕" w:eastAsia="바탕" w:hAnsi="바탕"/>
+                <w:sz w:val="19"/>
+                <w:szCs w:val="19"/>
+              </w:rPr>
+              <w:t xml:space="preserve">한성숙 국무총리 제9차 국가첨단전략산업위원회 주재(정부서울청사)</w:t>
+            </w:r>
+          </w:p>
+        </w:tc>
+        <w:tc>
+          <w:tcPr>
+            <w:tcW w:type="dxa" w:w="2300"/>
+            <w:tcBorders>
+              <w:top w:val="single" w:color="000000" w:sz="4"/>
+              <w:left w:val="single" w:color="000000" w:sz="4"/>
+              <w:bottom w:val="single" w:color="000000" w:sz="4"/>
+              <w:right w:val="single" w:color="000000" w:sz="4"/>
+            </w:tcBorders>
+            <w:tcMar>
+              <w:top w:type="dxa" w:w="60"/>
+              <w:left w:type="dxa" w:w="80"/>
+              <w:bottom w:type="dxa" w:w="60"/>
+              <w:right w:type="dxa" w:w="80"/>
+            </w:tcMar>
+            <w:vAlign w:val="center"/>
+          </w:tcPr>
+          <w:p>
+            <w:pPr>
+              <w:spacing w:line="280" w:lineRule="auto"/>
+              <w:jc w:val="left"/>
+            </w:pPr>
+            <w:r>
+              <w:rPr>
+                <w:rFonts w:ascii="바탕" w:cs="바탕" w:eastAsia="바탕" w:hAnsi="바탕"/>
+                <w:sz w:val="19"/>
+                <w:szCs w:val="19"/>
+              </w:rPr>
+              <w:t xml:space="preserve">정부 일정</w:t>
+            </w:r>
+          </w:p>
+        </w:tc>
+      </w:tr>
+      <w:tr>
+        <w:trPr>
+          <w:cantSplit/>
+        </w:trPr>
+        <w:tc>
+          <w:tcPr>
+            <w:tcW w:type="dxa" w:w="1300"/>
+            <w:tcBorders>
+              <w:top w:val="single" w:color="000000" w:sz="4"/>
+              <w:left w:val="single" w:color="000000" w:sz="4"/>
+              <w:bottom w:val="single" w:color="000000" w:sz="4"/>
+              <w:right w:val="single" w:color="000000" w:sz="4"/>
+            </w:tcBorders>
+            <w:tcMar>
+              <w:top w:type="dxa" w:w="60"/>
+              <w:left w:type="dxa" w:w="80"/>
+              <w:bottom w:type="dxa" w:w="60"/>
+              <w:right w:type="dxa" w:w="80"/>
+            </w:tcMar>
+            <w:vAlign w:val="center"/>
+          </w:tcPr>
+          <w:p>
+            <w:pPr>
+              <w:spacing w:line="280" w:lineRule="auto"/>
+              <w:jc w:val="center"/>
+            </w:pPr>
+            <w:r>
+              <w:rPr>
+                <w:rFonts w:ascii="바탕" w:cs="바탕" w:eastAsia="바탕" w:hAnsi="바탕"/>
+                <w:sz w:val="19"/>
+                <w:szCs w:val="19"/>
+              </w:rPr>
+              <w:t xml:space="preserve">15:50</w:t>
+            </w:r>
+          </w:p>
+        </w:tc>
+        <w:tc>
+          <w:tcPr>
+            <w:tcW w:type="dxa" w:w="6038"/>
+            <w:tcBorders>
+              <w:top w:val="single" w:color="000000" w:sz="4"/>
+              <w:left w:val="single" w:color="000000" w:sz="4"/>
+              <w:bottom w:val="single" w:color="000000" w:sz="4"/>
+              <w:right w:val="single" w:color="000000" w:sz="4"/>
+            </w:tcBorders>
+            <w:tcMar>
+              <w:top w:type="dxa" w:w="60"/>
+              <w:left w:type="dxa" w:w="80"/>
+              <w:bottom w:type="dxa" w:w="60"/>
+              <w:right w:type="dxa" w:w="80"/>
+            </w:tcMar>
+            <w:vAlign w:val="center"/>
+          </w:tcPr>
+          <w:p>
+            <w:pPr>
+              <w:spacing w:line="280" w:lineRule="auto"/>
+              <w:jc w:val="left"/>
+            </w:pPr>
+            <w:r>
+              <w:rPr>
+                <w:rFonts w:ascii="바탕" w:cs="바탕" w:eastAsia="바탕" w:hAnsi="바탕"/>
+                <w:sz w:val="19"/>
+                <w:szCs w:val="19"/>
+              </w:rPr>
+              <w:t xml:space="preserve">한성숙 국무총리 주택정책관계장관 간담회</w:t>
+            </w:r>
+          </w:p>
+        </w:tc>
+        <w:tc>
+          <w:tcPr>
+            <w:tcW w:type="dxa" w:w="2300"/>
+            <w:tcBorders>
+              <w:top w:val="single" w:color="000000" w:sz="4"/>
+              <w:left w:val="single" w:color="000000" w:sz="4"/>
+              <w:bottom w:val="single" w:color="000000" w:sz="4"/>
+              <w:right w:val="single" w:color="000000" w:sz="4"/>
+            </w:tcBorders>
+            <w:tcMar>
+              <w:top w:type="dxa" w:w="60"/>
+              <w:left w:type="dxa" w:w="80"/>
+              <w:bottom w:type="dxa" w:w="60"/>
+              <w:right w:type="dxa" w:w="80"/>
+            </w:tcMar>
+            <w:vAlign w:val="center"/>
+          </w:tcPr>
+          <w:p>
+            <w:pPr>
+              <w:spacing w:line="280" w:lineRule="auto"/>
+              <w:jc w:val="left"/>
+            </w:pPr>
+            <w:r>
+              <w:rPr>
+                <w:rFonts w:ascii="바탕" w:cs="바탕" w:eastAsia="바탕" w:hAnsi="바탕"/>
+                <w:sz w:val="19"/>
+                <w:szCs w:val="19"/>
+              </w:rPr>
+              <w:t xml:space="preserve">정부 일정</w:t>
+            </w:r>
+          </w:p>
+        </w:tc>
+      </w:tr>
+      <w:tr>
+        <w:trPr>
+          <w:cantSplit/>
+        </w:trPr>
+        <w:tc>
+          <w:tcPr>
+            <w:tcW w:type="dxa" w:w="1300"/>
+            <w:tcBorders>
+              <w:top w:val="single" w:color="000000" w:sz="4"/>
+              <w:left w:val="single" w:color="000000" w:sz="4"/>
+              <w:bottom w:val="single" w:color="000000" w:sz="4"/>
+              <w:right w:val="single" w:color="000000" w:sz="4"/>
+            </w:tcBorders>
+            <w:tcMar>
+              <w:top w:type="dxa" w:w="60"/>
+              <w:left w:type="dxa" w:w="80"/>
+              <w:bottom w:type="dxa" w:w="60"/>
+              <w:right w:type="dxa" w:w="80"/>
+            </w:tcMar>
+            <w:vAlign w:val="center"/>
+          </w:tcPr>
+          <w:p>
+            <w:pPr>
+              <w:spacing w:line="280" w:lineRule="auto"/>
+              <w:jc w:val="center"/>
+            </w:pPr>
+            <w:r>
+              <w:rPr>
+                <w:rFonts w:ascii="바탕" w:cs="바탕" w:eastAsia="바탕" w:hAnsi="바탕"/>
+                <w:sz w:val="19"/>
+                <w:szCs w:val="19"/>
+              </w:rPr>
+              <w:t xml:space="preserve">16:30</w:t>
+            </w:r>
+          </w:p>
+        </w:tc>
+        <w:tc>
+          <w:tcPr>
+            <w:tcW w:type="dxa" w:w="6038"/>
+            <w:tcBorders>
+              <w:top w:val="single" w:color="000000" w:sz="4"/>
+              <w:left w:val="single" w:color="000000" w:sz="4"/>
+              <w:bottom w:val="single" w:color="000000" w:sz="4"/>
+              <w:right w:val="single" w:color="000000" w:sz="4"/>
+            </w:tcBorders>
+            <w:tcMar>
+              <w:top w:type="dxa" w:w="60"/>
+              <w:left w:type="dxa" w:w="80"/>
+              <w:bottom w:type="dxa" w:w="60"/>
+              <w:right w:type="dxa" w:w="80"/>
+            </w:tcMar>
+            <w:vAlign w:val="center"/>
+          </w:tcPr>
+          <w:p>
+            <w:pPr>
+              <w:spacing w:line="280" w:lineRule="auto"/>
+              <w:jc w:val="left"/>
+            </w:pPr>
+            <w:r>
+              <w:rPr>
+                <w:rFonts w:ascii="바탕" w:cs="바탕" w:eastAsia="바탕" w:hAnsi="바탕"/>
+                <w:sz w:val="19"/>
+                <w:szCs w:val="19"/>
+              </w:rPr>
+              <w:t xml:space="preserve">제3차 범부처 주택 신속공급 점검회의(총리 주재, 이형일 부총리 참석)</w:t>
+            </w:r>
+          </w:p>
+        </w:tc>
+        <w:tc>
+          <w:tcPr>
+            <w:tcW w:type="dxa" w:w="2300"/>
+            <w:tcBorders>
+              <w:top w:val="single" w:color="000000" w:sz="4"/>
+              <w:left w:val="single" w:color="000000" w:sz="4"/>
+              <w:bottom w:val="single" w:color="000000" w:sz="4"/>
+              <w:right w:val="single" w:color="000000" w:sz="4"/>
+            </w:tcBorders>
+            <w:tcMar>
+              <w:top w:type="dxa" w:w="60"/>
+              <w:left w:type="dxa" w:w="80"/>
+              <w:bottom w:type="dxa" w:w="60"/>
+              <w:right w:type="dxa" w:w="80"/>
+            </w:tcMar>
+            <w:vAlign w:val="center"/>
+          </w:tcPr>
+          <w:p>
+            <w:pPr>
+              <w:spacing w:line="280" w:lineRule="auto"/>
+              <w:jc w:val="left"/>
+            </w:pPr>
+            <w:r>
+              <w:rPr>
+                <w:rFonts w:ascii="바탕" w:cs="바탕" w:eastAsia="바탕" w:hAnsi="바탕"/>
+                <w:sz w:val="19"/>
+                <w:szCs w:val="19"/>
+              </w:rPr>
+              <w:t xml:space="preserve">정부 일정·보도</w:t>
+            </w:r>
+          </w:p>
+        </w:tc>
+      </w:tr>
+      <w:tr>
+        <w:trPr>
+          <w:cantSplit/>
+        </w:trPr>
+        <w:tc>
+          <w:tcPr>
+            <w:tcW w:type="dxa" w:w="1300"/>
+            <w:tcBorders>
+              <w:top w:val="single" w:color="000000" w:sz="4"/>
+              <w:left w:val="single" w:color="000000" w:sz="4"/>
+              <w:bottom w:val="single" w:color="000000" w:sz="4"/>
+              <w:right w:val="single" w:color="000000" w:sz="4"/>
+            </w:tcBorders>
+            <w:tcMar>
+              <w:top w:type="dxa" w:w="60"/>
+              <w:left w:type="dxa" w:w="80"/>
+              <w:bottom w:type="dxa" w:w="60"/>
+              <w:right w:type="dxa" w:w="80"/>
+            </w:tcMar>
+            <w:vAlign w:val="center"/>
+          </w:tcPr>
+          <w:p>
+            <w:pPr>
+              <w:spacing w:line="280" w:lineRule="auto"/>
+              <w:jc w:val="center"/>
+            </w:pPr>
+            <w:r>
+              <w:rPr>
+                <w:rFonts w:ascii="바탕" w:cs="바탕" w:eastAsia="바탕" w:hAnsi="바탕"/>
+                <w:sz w:val="19"/>
+                <w:szCs w:val="19"/>
+              </w:rPr>
+              <w:t xml:space="preserve">밤</w:t>
+            </w:r>
+          </w:p>
+        </w:tc>
+        <w:tc>
+          <w:tcPr>
+            <w:tcW w:type="dxa" w:w="6038"/>
+            <w:tcBorders>
+              <w:top w:val="single" w:color="000000" w:sz="4"/>
+              <w:left w:val="single" w:color="000000" w:sz="4"/>
+              <w:bottom w:val="single" w:color="000000" w:sz="4"/>
+              <w:right w:val="single" w:color="000000" w:sz="4"/>
+            </w:tcBorders>
+            <w:tcMar>
+              <w:top w:type="dxa" w:w="60"/>
+              <w:left w:type="dxa" w:w="80"/>
+              <w:bottom w:type="dxa" w:w="60"/>
+              <w:right w:type="dxa" w:w="80"/>
+            </w:tcMar>
+            <w:vAlign w:val="center"/>
+          </w:tcPr>
+          <w:p>
+            <w:pPr>
+              <w:spacing w:line="280" w:lineRule="auto"/>
+              <w:jc w:val="left"/>
+            </w:pPr>
+            <w:r>
+              <w:rPr>
+                <w:rFonts w:ascii="바탕" w:cs="바탕" w:eastAsia="바탕" w:hAnsi="바탕"/>
+                <w:sz w:val="19"/>
+                <w:szCs w:val="19"/>
+              </w:rPr>
+              <w:t xml:space="preserve">정동영 통일부장관 조기 귀국(10.1) 보도 22:18, 청와대 홍보소통수석 “미온적이지 않다” 발언 보도 22:12~23:13</w:t>
+            </w:r>
+          </w:p>
+        </w:tc>
+        <w:tc>
+          <w:tcPr>
+            <w:tcW w:type="dxa" w:w="2300"/>
+            <w:tcBorders>
+              <w:top w:val="single" w:color="000000" w:sz="4"/>
+              <w:left w:val="single" w:color="000000" w:sz="4"/>
+              <w:bottom w:val="single" w:color="000000" w:sz="4"/>
+              <w:right w:val="single" w:color="000000" w:sz="4"/>
+            </w:tcBorders>
+            <w:tcMar>
+              <w:top w:type="dxa" w:w="60"/>
+              <w:left w:type="dxa" w:w="80"/>
+              <w:bottom w:type="dxa" w:w="60"/>
+              <w:right w:type="dxa" w:w="80"/>
+            </w:tcMar>
+            <w:vAlign w:val="center"/>
+          </w:tcPr>
+          <w:p>
+            <w:pPr>
+              <w:spacing w:line="280" w:lineRule="auto"/>
+              <w:jc w:val="left"/>
+            </w:pPr>
+            <w:r>
+              <w:rPr>
+                <w:rFonts w:ascii="바탕" w:cs="바탕" w:eastAsia="바탕" w:hAnsi="바탕"/>
+                <w:sz w:val="19"/>
+                <w:szCs w:val="19"/>
+              </w:rPr>
+              <w:t xml:space="preserve">보도</w:t>
+            </w:r>
+          </w:p>
+        </w:tc>
+      </w:tr>
+    </w:tbl>
+    <w:p>
+      <w:pPr>
+        <w:spacing w:after="80" w:line="200"/>
+      </w:pPr>
+      <w:r>
+        <w:rPr>
+          <w:rFonts w:ascii="바탕" w:cs="바탕" w:eastAsia="바탕" w:hAnsi="바탕"/>
+          <w:sz w:val="22"/>
+          <w:szCs w:val="22"/>
+        </w:rPr>
+        <w:t xml:space="preserve"/>
+      </w:r>
+    </w:p>
+    <w:p>
+      <w:pPr>
+        <w:keepNext/>
+        <w:spacing w:after="140" w:before="240"/>
+      </w:pPr>
+      <w:r>
+        <w:rPr>
+          <w:rFonts w:ascii="맑은 고딕" w:cs="맑은 고딕" w:eastAsia="맑은 고딕" w:hAnsi="맑은 고딕"/>
+          <w:b/>
+          <w:bCs/>
+          <w:sz w:val="26"/>
+          <w:szCs w:val="26"/>
+        </w:rPr>
+        <w:t xml:space="preserve">□ </w:t>
+      </w:r>
+      <w:r>
+        <w:rPr>
+          <w:rFonts w:ascii="맑은 고딕" w:cs="맑은 고딕" w:eastAsia="맑은 고딕" w:hAnsi="맑은 고딕"/>
+          <w:b/>
+          <w:bCs/>
+          <w:sz w:val="26"/>
+          <w:szCs w:val="26"/>
+        </w:rPr>
+        <w:t xml:space="preserve">1-1. 인물별 개의 가능성 분석(18:30 기준)</w:t>
+      </w:r>
+    </w:p>
+    <w:tbl>
+      <w:tblPr>
+        <w:tblW w:type="dxa" w:w="9638"/>
+        <w:tblBorders>
+          <w:top w:val="single" w:color="auto" w:sz="4"/>
+          <w:left w:val="single" w:color="auto" w:sz="4"/>
+          <w:bottom w:val="single" w:color="auto" w:sz="4"/>
+          <w:right w:val="single" w:color="auto" w:sz="4"/>
+          <w:insideH w:val="single" w:color="auto" w:sz="4"/>
+          <w:insideV w:val="single" w:color="auto" w:sz="4"/>
+        </w:tblBorders>
+      </w:tblPr>
+      <w:tblGrid>
+        <w:gridCol w:w="2100"/>
+        <w:gridCol w:w="4238"/>
+        <w:gridCol w:w="3300"/>
+      </w:tblGrid>
+      <w:tr>
+        <w:trPr>
+          <w:tblHeader/>
+        </w:trPr>
+        <w:tc>
+          <w:tcPr>
+            <w:tcW w:type="dxa" w:w="2100"/>
+            <w:tcBorders>
+              <w:top w:val="single" w:color="000000" w:sz="4"/>
+              <w:left w:val="single" w:color="000000" w:sz="4"/>
+              <w:bottom w:val="single" w:color="000000" w:sz="4"/>
+              <w:right w:val="single" w:color="000000" w:sz="4"/>
+            </w:tcBorders>
+            <w:shd w:fill="E7E6E6" w:color="auto" w:val="clear"/>
+            <w:tcMar>
+              <w:top w:type="dxa" w:w="60"/>
+              <w:left w:type="dxa" w:w="80"/>
+              <w:bottom w:type="dxa" w:w="60"/>
+              <w:right w:type="dxa" w:w="80"/>
+            </w:tcMar>
+            <w:vAlign w:val="center"/>
+          </w:tcPr>
+          <w:p>
+            <w:pPr>
+              <w:spacing w:line="280" w:lineRule="auto"/>
+              <w:jc w:val="center"/>
+            </w:pPr>
+            <w:r>
+              <w:rPr>
+                <w:rFonts w:ascii="맑은 고딕" w:cs="맑은 고딕" w:eastAsia="맑은 고딕" w:hAnsi="맑은 고딕"/>
+                <w:b/>
+                <w:bCs/>
+                <w:sz w:val="19"/>
+                <w:szCs w:val="19"/>
+              </w:rPr>
+              <w:t xml:space="preserve">인 물</w:t>
+            </w:r>
+          </w:p>
+        </w:tc>
+        <w:tc>
+          <w:tcPr>
+            <w:tcW w:type="dxa" w:w="4238"/>
+            <w:tcBorders>
+              <w:top w:val="single" w:color="000000" w:sz="4"/>
+              <w:left w:val="single" w:color="000000" w:sz="4"/>
+              <w:bottom w:val="single" w:color="000000" w:sz="4"/>
+              <w:right w:val="single" w:color="000000" w:sz="4"/>
+            </w:tcBorders>
+            <w:shd w:fill="E7E6E6" w:color="auto" w:val="clear"/>
+            <w:tcMar>
+              <w:top w:type="dxa" w:w="60"/>
+              <w:left w:type="dxa" w:w="80"/>
+              <w:bottom w:type="dxa" w:w="60"/>
+              <w:right w:type="dxa" w:w="80"/>
+            </w:tcMar>
+            <w:vAlign w:val="center"/>
+          </w:tcPr>
+          <w:p>
+            <w:pPr>
+              <w:spacing w:line="280" w:lineRule="auto"/>
+              <w:jc w:val="center"/>
+            </w:pPr>
+            <w:r>
+              <w:rPr>
+                <w:rFonts w:ascii="맑은 고딕" w:cs="맑은 고딕" w:eastAsia="맑은 고딕" w:hAnsi="맑은 고딕"/>
+                <w:b/>
+                <w:bCs/>
+                <w:sz w:val="19"/>
+                <w:szCs w:val="19"/>
+              </w:rPr>
+              <w:t xml:space="preserve">직전 일정과 위치</w:t>
+            </w:r>
+          </w:p>
+        </w:tc>
+        <w:tc>
+          <w:tcPr>
+            <w:tcW w:type="dxa" w:w="3300"/>
+            <w:tcBorders>
+              <w:top w:val="single" w:color="000000" w:sz="4"/>
+              <w:left w:val="single" w:color="000000" w:sz="4"/>
+              <w:bottom w:val="single" w:color="000000" w:sz="4"/>
+              <w:right w:val="single" w:color="000000" w:sz="4"/>
+            </w:tcBorders>
+            <w:shd w:fill="E7E6E6" w:color="auto" w:val="clear"/>
+            <w:tcMar>
+              <w:top w:type="dxa" w:w="60"/>
+              <w:left w:type="dxa" w:w="80"/>
+              <w:bottom w:type="dxa" w:w="60"/>
+              <w:right w:type="dxa" w:w="80"/>
+            </w:tcMar>
+            <w:vAlign w:val="center"/>
+          </w:tcPr>
+          <w:p>
+            <w:pPr>
+              <w:spacing w:line="280" w:lineRule="auto"/>
+              <w:jc w:val="center"/>
+            </w:pPr>
+            <w:r>
+              <w:rPr>
+                <w:rFonts w:ascii="맑은 고딕" w:cs="맑은 고딕" w:eastAsia="맑은 고딕" w:hAnsi="맑은 고딕"/>
+                <w:b/>
+                <w:bCs/>
+                <w:sz w:val="19"/>
+                <w:szCs w:val="19"/>
+              </w:rPr>
+              <w:t xml:space="preserve">18:30 참석 판단</w:t>
+            </w:r>
+          </w:p>
+        </w:tc>
+      </w:tr>
+      <w:tr>
+        <w:trPr>
+          <w:cantSplit/>
+        </w:trPr>
+        <w:tc>
+          <w:tcPr>
+            <w:tcW w:type="dxa" w:w="2100"/>
+            <w:tcBorders>
+              <w:top w:val="single" w:color="000000" w:sz="4"/>
+              <w:left w:val="single" w:color="000000" w:sz="4"/>
+              <w:bottom w:val="single" w:color="000000" w:sz="4"/>
+              <w:right w:val="single" w:color="000000" w:sz="4"/>
+            </w:tcBorders>
+            <w:tcMar>
+              <w:top w:type="dxa" w:w="60"/>
+              <w:left w:type="dxa" w:w="80"/>
+              <w:bottom w:type="dxa" w:w="60"/>
+              <w:right w:type="dxa" w:w="80"/>
+            </w:tcMar>
+            <w:vAlign w:val="center"/>
+          </w:tcPr>
+          <w:p>
+            <w:pPr>
+              <w:spacing w:line="280" w:lineRule="auto"/>
+              <w:jc w:val="center"/>
+            </w:pPr>
+            <w:r>
+              <w:rPr>
+                <w:rFonts w:ascii="바탕" w:cs="바탕" w:eastAsia="바탕" w:hAnsi="바탕"/>
+                <w:sz w:val="19"/>
+                <w:szCs w:val="19"/>
+              </w:rPr>
+              <w:t xml:space="preserve">이재명 대통령</w:t>
+            </w:r>
+          </w:p>
+        </w:tc>
+        <w:tc>
+          <w:tcPr>
+            <w:tcW w:type="dxa" w:w="4238"/>
+            <w:tcBorders>
+              <w:top w:val="single" w:color="000000" w:sz="4"/>
+              <w:left w:val="single" w:color="000000" w:sz="4"/>
+              <w:bottom w:val="single" w:color="000000" w:sz="4"/>
+              <w:right w:val="single" w:color="000000" w:sz="4"/>
+            </w:tcBorders>
+            <w:tcMar>
+              <w:top w:type="dxa" w:w="60"/>
+              <w:left w:type="dxa" w:w="80"/>
+              <w:bottom w:type="dxa" w:w="60"/>
+              <w:right w:type="dxa" w:w="80"/>
+            </w:tcMar>
+            <w:vAlign w:val="center"/>
+          </w:tcPr>
+          <w:p>
+            <w:pPr>
+              <w:spacing w:line="280" w:lineRule="auto"/>
+              <w:jc w:val="left"/>
+            </w:pPr>
+            <w:r>
+              <w:rPr>
+                <w:rFonts w:ascii="바탕" w:cs="바탕" w:eastAsia="바탕" w:hAnsi="바탕"/>
+                <w:sz w:val="19"/>
+                <w:szCs w:val="19"/>
+              </w:rPr>
+              <w:t xml:space="preserve">오전 성남 국군수도병원 → 13시대 울산 진수식 → 귀경(이동 수단·도착 시각 미확인)</w:t>
+            </w:r>
+          </w:p>
+        </w:tc>
+        <w:tc>
+          <w:tcPr>
+            <w:tcW w:type="dxa" w:w="3300"/>
+            <w:tcBorders>
+              <w:top w:val="single" w:color="000000" w:sz="4"/>
+              <w:left w:val="single" w:color="000000" w:sz="4"/>
+              <w:bottom w:val="single" w:color="000000" w:sz="4"/>
+              <w:right w:val="single" w:color="000000" w:sz="4"/>
+            </w:tcBorders>
+            <w:tcMar>
+              <w:top w:type="dxa" w:w="60"/>
+              <w:left w:type="dxa" w:w="80"/>
+              <w:bottom w:type="dxa" w:w="60"/>
+              <w:right w:type="dxa" w:w="80"/>
+            </w:tcMar>
+            <w:vAlign w:val="center"/>
+          </w:tcPr>
+          <w:p>
+            <w:pPr>
+              <w:spacing w:line="280" w:lineRule="auto"/>
+              <w:jc w:val="left"/>
+            </w:pPr>
+            <w:r>
+              <w:rPr>
+                <w:rFonts w:ascii="바탕" w:cs="바탕" w:eastAsia="바탕" w:hAnsi="바탕"/>
+                <w:sz w:val="19"/>
+                <w:szCs w:val="19"/>
+              </w:rPr>
+              <w:t xml:space="preserve">오후 2시 반경 울산 출발로 가정 시 17시대 청와대 도착 가능. 18:30은 여유 확보 시각</w:t>
+            </w:r>
+          </w:p>
+        </w:tc>
+      </w:tr>
+      <w:tr>
+        <w:trPr>
+          <w:cantSplit/>
+        </w:trPr>
+        <w:tc>
+          <w:tcPr>
+            <w:tcW w:type="dxa" w:w="2100"/>
+            <w:tcBorders>
+              <w:top w:val="single" w:color="000000" w:sz="4"/>
+              <w:left w:val="single" w:color="000000" w:sz="4"/>
+              <w:bottom w:val="single" w:color="000000" w:sz="4"/>
+              <w:right w:val="single" w:color="000000" w:sz="4"/>
+            </w:tcBorders>
+            <w:tcMar>
+              <w:top w:type="dxa" w:w="60"/>
+              <w:left w:type="dxa" w:w="80"/>
+              <w:bottom w:type="dxa" w:w="60"/>
+              <w:right w:type="dxa" w:w="80"/>
+            </w:tcMar>
+            <w:vAlign w:val="center"/>
+          </w:tcPr>
+          <w:p>
+            <w:pPr>
+              <w:spacing w:line="280" w:lineRule="auto"/>
+              <w:jc w:val="center"/>
+            </w:pPr>
+            <w:r>
+              <w:rPr>
+                <w:rFonts w:ascii="바탕" w:cs="바탕" w:eastAsia="바탕" w:hAnsi="바탕"/>
+                <w:sz w:val="19"/>
+                <w:szCs w:val="19"/>
+              </w:rPr>
+              <w:t xml:space="preserve">한성숙 총리</w:t>
+            </w:r>
+          </w:p>
+        </w:tc>
+        <w:tc>
+          <w:tcPr>
+            <w:tcW w:type="dxa" w:w="4238"/>
+            <w:tcBorders>
+              <w:top w:val="single" w:color="000000" w:sz="4"/>
+              <w:left w:val="single" w:color="000000" w:sz="4"/>
+              <w:bottom w:val="single" w:color="000000" w:sz="4"/>
+              <w:right w:val="single" w:color="000000" w:sz="4"/>
+            </w:tcBorders>
+            <w:tcMar>
+              <w:top w:type="dxa" w:w="60"/>
+              <w:left w:type="dxa" w:w="80"/>
+              <w:bottom w:type="dxa" w:w="60"/>
+              <w:right w:type="dxa" w:w="80"/>
+            </w:tcMar>
+            <w:vAlign w:val="center"/>
+          </w:tcPr>
+          <w:p>
+            <w:pPr>
+              <w:spacing w:line="280" w:lineRule="auto"/>
+              <w:jc w:val="left"/>
+            </w:pPr>
+            <w:r>
+              <w:rPr>
+                <w:rFonts w:ascii="바탕" w:cs="바탕" w:eastAsia="바탕" w:hAnsi="바탕"/>
+                <w:sz w:val="19"/>
+                <w:szCs w:val="19"/>
+              </w:rPr>
+              <w:t xml:space="preserve">16:30 주택 신속공급 점검회의(약 1시간 가정) 종료 후 이동</w:t>
+            </w:r>
+          </w:p>
+        </w:tc>
+        <w:tc>
+          <w:tcPr>
+            <w:tcW w:type="dxa" w:w="3300"/>
+            <w:tcBorders>
+              <w:top w:val="single" w:color="000000" w:sz="4"/>
+              <w:left w:val="single" w:color="000000" w:sz="4"/>
+              <w:bottom w:val="single" w:color="000000" w:sz="4"/>
+              <w:right w:val="single" w:color="000000" w:sz="4"/>
+            </w:tcBorders>
+            <w:tcMar>
+              <w:top w:type="dxa" w:w="60"/>
+              <w:left w:type="dxa" w:w="80"/>
+              <w:bottom w:type="dxa" w:w="60"/>
+              <w:right w:type="dxa" w:w="80"/>
+            </w:tcMar>
+            <w:vAlign w:val="center"/>
+          </w:tcPr>
+          <w:p>
+            <w:pPr>
+              <w:spacing w:line="280" w:lineRule="auto"/>
+              <w:jc w:val="left"/>
+            </w:pPr>
+            <w:r>
+              <w:rPr>
+                <w:rFonts w:ascii="바탕" w:cs="바탕" w:eastAsia="바탕" w:hAnsi="바탕"/>
+                <w:sz w:val="19"/>
+                <w:szCs w:val="19"/>
+              </w:rPr>
+              <w:t xml:space="preserve">17:30 이후 종료. 18:30 개의 가능</w:t>
+            </w:r>
+          </w:p>
+        </w:tc>
+      </w:tr>
+      <w:tr>
+        <w:trPr>
+          <w:cantSplit/>
+        </w:trPr>
+        <w:tc>
+          <w:tcPr>
+            <w:tcW w:type="dxa" w:w="2100"/>
+            <w:tcBorders>
+              <w:top w:val="single" w:color="000000" w:sz="4"/>
+              <w:left w:val="single" w:color="000000" w:sz="4"/>
+              <w:bottom w:val="single" w:color="000000" w:sz="4"/>
+              <w:right w:val="single" w:color="000000" w:sz="4"/>
+            </w:tcBorders>
+            <w:tcMar>
+              <w:top w:type="dxa" w:w="60"/>
+              <w:left w:type="dxa" w:w="80"/>
+              <w:bottom w:type="dxa" w:w="60"/>
+              <w:right w:type="dxa" w:w="80"/>
+            </w:tcMar>
+            <w:vAlign w:val="center"/>
+          </w:tcPr>
+          <w:p>
+            <w:pPr>
+              <w:spacing w:line="280" w:lineRule="auto"/>
+              <w:jc w:val="center"/>
+            </w:pPr>
+            <w:r>
+              <w:rPr>
+                <w:rFonts w:ascii="바탕" w:cs="바탕" w:eastAsia="바탕" w:hAnsi="바탕"/>
+                <w:sz w:val="19"/>
+                <w:szCs w:val="19"/>
+              </w:rPr>
+              <w:t xml:space="preserve">이형일 부총리</w:t>
+            </w:r>
+          </w:p>
+        </w:tc>
+        <w:tc>
+          <w:tcPr>
+            <w:tcW w:type="dxa" w:w="4238"/>
+            <w:tcBorders>
+              <w:top w:val="single" w:color="000000" w:sz="4"/>
+              <w:left w:val="single" w:color="000000" w:sz="4"/>
+              <w:bottom w:val="single" w:color="000000" w:sz="4"/>
+              <w:right w:val="single" w:color="000000" w:sz="4"/>
+            </w:tcBorders>
+            <w:tcMar>
+              <w:top w:type="dxa" w:w="60"/>
+              <w:left w:type="dxa" w:w="80"/>
+              <w:bottom w:type="dxa" w:w="60"/>
+              <w:right w:type="dxa" w:w="80"/>
+            </w:tcMar>
+            <w:vAlign w:val="center"/>
+          </w:tcPr>
+          <w:p>
+            <w:pPr>
+              <w:spacing w:line="280" w:lineRule="auto"/>
+              <w:jc w:val="left"/>
+            </w:pPr>
+            <w:r>
+              <w:rPr>
+                <w:rFonts w:ascii="바탕" w:cs="바탕" w:eastAsia="바탕" w:hAnsi="바탕"/>
+                <w:sz w:val="19"/>
+                <w:szCs w:val="19"/>
+              </w:rPr>
+              <w:t xml:space="preserve">같은 16:30 회의 참석, 오전 간담회 주재</w:t>
+            </w:r>
+          </w:p>
+        </w:tc>
+        <w:tc>
+          <w:tcPr>
+            <w:tcW w:type="dxa" w:w="3300"/>
+            <w:tcBorders>
+              <w:top w:val="single" w:color="000000" w:sz="4"/>
+              <w:left w:val="single" w:color="000000" w:sz="4"/>
+              <w:bottom w:val="single" w:color="000000" w:sz="4"/>
+              <w:right w:val="single" w:color="000000" w:sz="4"/>
+            </w:tcBorders>
+            <w:tcMar>
+              <w:top w:type="dxa" w:w="60"/>
+              <w:left w:type="dxa" w:w="80"/>
+              <w:bottom w:type="dxa" w:w="60"/>
+              <w:right w:type="dxa" w:w="80"/>
+            </w:tcMar>
+            <w:vAlign w:val="center"/>
+          </w:tcPr>
+          <w:p>
+            <w:pPr>
+              <w:spacing w:line="280" w:lineRule="auto"/>
+              <w:jc w:val="left"/>
+            </w:pPr>
+            <w:r>
+              <w:rPr>
+                <w:rFonts w:ascii="바탕" w:cs="바탕" w:eastAsia="바탕" w:hAnsi="바탕"/>
+                <w:sz w:val="19"/>
+                <w:szCs w:val="19"/>
+              </w:rPr>
+              <w:t xml:space="preserve">총리와 함께 이동 가능</w:t>
+            </w:r>
+          </w:p>
+        </w:tc>
+      </w:tr>
+      <w:tr>
+        <w:trPr>
+          <w:cantSplit/>
+        </w:trPr>
+        <w:tc>
+          <w:tcPr>
+            <w:tcW w:type="dxa" w:w="2100"/>
+            <w:tcBorders>
+              <w:top w:val="single" w:color="000000" w:sz="4"/>
+              <w:left w:val="single" w:color="000000" w:sz="4"/>
+              <w:bottom w:val="single" w:color="000000" w:sz="4"/>
+              <w:right w:val="single" w:color="000000" w:sz="4"/>
+            </w:tcBorders>
+            <w:tcMar>
+              <w:top w:type="dxa" w:w="60"/>
+              <w:left w:type="dxa" w:w="80"/>
+              <w:bottom w:type="dxa" w:w="60"/>
+              <w:right w:type="dxa" w:w="80"/>
+            </w:tcMar>
+            <w:vAlign w:val="center"/>
+          </w:tcPr>
+          <w:p>
+            <w:pPr>
+              <w:spacing w:line="280" w:lineRule="auto"/>
+              <w:jc w:val="center"/>
+            </w:pPr>
+            <w:r>
+              <w:rPr>
+                <w:rFonts w:ascii="바탕" w:cs="바탕" w:eastAsia="바탕" w:hAnsi="바탕"/>
+                <w:sz w:val="19"/>
+                <w:szCs w:val="19"/>
+              </w:rPr>
+              <w:t xml:space="preserve">강신철 국방부장관</w:t>
+            </w:r>
+          </w:p>
+        </w:tc>
+        <w:tc>
+          <w:tcPr>
+            <w:tcW w:type="dxa" w:w="4238"/>
+            <w:tcBorders>
+              <w:top w:val="single" w:color="000000" w:sz="4"/>
+              <w:left w:val="single" w:color="000000" w:sz="4"/>
+              <w:bottom w:val="single" w:color="000000" w:sz="4"/>
+              <w:right w:val="single" w:color="000000" w:sz="4"/>
+            </w:tcBorders>
+            <w:tcMar>
+              <w:top w:type="dxa" w:w="60"/>
+              <w:left w:type="dxa" w:w="80"/>
+              <w:bottom w:type="dxa" w:w="60"/>
+              <w:right w:type="dxa" w:w="80"/>
+            </w:tcMar>
+            <w:vAlign w:val="center"/>
+          </w:tcPr>
+          <w:p>
+            <w:pPr>
+              <w:spacing w:line="280" w:lineRule="auto"/>
+              <w:jc w:val="left"/>
+            </w:pPr>
+            <w:r>
+              <w:rPr>
+                <w:rFonts w:ascii="바탕" w:cs="바탕" w:eastAsia="바탕" w:hAnsi="바탕"/>
+                <w:sz w:val="19"/>
+                <w:szCs w:val="19"/>
+              </w:rPr>
+              <w:t xml:space="preserve">부산 해군작전사령부(오전~낮) → 서울 이동</w:t>
+            </w:r>
+          </w:p>
+        </w:tc>
+        <w:tc>
+          <w:tcPr>
+            <w:tcW w:type="dxa" w:w="3300"/>
+            <w:tcBorders>
+              <w:top w:val="single" w:color="000000" w:sz="4"/>
+              <w:left w:val="single" w:color="000000" w:sz="4"/>
+              <w:bottom w:val="single" w:color="000000" w:sz="4"/>
+              <w:right w:val="single" w:color="000000" w:sz="4"/>
+            </w:tcBorders>
+            <w:tcMar>
+              <w:top w:type="dxa" w:w="60"/>
+              <w:left w:type="dxa" w:w="80"/>
+              <w:bottom w:type="dxa" w:w="60"/>
+              <w:right w:type="dxa" w:w="80"/>
+            </w:tcMar>
+            <w:vAlign w:val="center"/>
+          </w:tcPr>
+          <w:p>
+            <w:pPr>
+              <w:spacing w:line="280" w:lineRule="auto"/>
+              <w:jc w:val="left"/>
+            </w:pPr>
+            <w:r>
+              <w:rPr>
+                <w:rFonts w:ascii="바탕" w:cs="바탕" w:eastAsia="바탕" w:hAnsi="바탕"/>
+                <w:sz w:val="19"/>
+                <w:szCs w:val="19"/>
+              </w:rPr>
+              <w:t xml:space="preserve">항공·철도 이동 시 오후 도착 가능</w:t>
+            </w:r>
+          </w:p>
+        </w:tc>
+      </w:tr>
+      <w:tr>
+        <w:trPr>
+          <w:cantSplit/>
+        </w:trPr>
+        <w:tc>
+          <w:tcPr>
+            <w:tcW w:type="dxa" w:w="2100"/>
+            <w:tcBorders>
+              <w:top w:val="single" w:color="000000" w:sz="4"/>
+              <w:left w:val="single" w:color="000000" w:sz="4"/>
+              <w:bottom w:val="single" w:color="000000" w:sz="4"/>
+              <w:right w:val="single" w:color="000000" w:sz="4"/>
+            </w:tcBorders>
+            <w:tcMar>
+              <w:top w:type="dxa" w:w="60"/>
+              <w:left w:type="dxa" w:w="80"/>
+              <w:bottom w:type="dxa" w:w="60"/>
+              <w:right w:type="dxa" w:w="80"/>
+            </w:tcMar>
+            <w:vAlign w:val="center"/>
+          </w:tcPr>
+          <w:p>
+            <w:pPr>
+              <w:spacing w:line="280" w:lineRule="auto"/>
+              <w:jc w:val="center"/>
+            </w:pPr>
+            <w:r>
+              <w:rPr>
+                <w:rFonts w:ascii="바탕" w:cs="바탕" w:eastAsia="바탕" w:hAnsi="바탕"/>
+                <w:sz w:val="19"/>
+                <w:szCs w:val="19"/>
+              </w:rPr>
+              <w:t xml:space="preserve">이종석 국정원장</w:t>
+            </w:r>
+          </w:p>
+        </w:tc>
+        <w:tc>
+          <w:tcPr>
+            <w:tcW w:type="dxa" w:w="4238"/>
+            <w:tcBorders>
+              <w:top w:val="single" w:color="000000" w:sz="4"/>
+              <w:left w:val="single" w:color="000000" w:sz="4"/>
+              <w:bottom w:val="single" w:color="000000" w:sz="4"/>
+              <w:right w:val="single" w:color="000000" w:sz="4"/>
+            </w:tcBorders>
+            <w:tcMar>
+              <w:top w:type="dxa" w:w="60"/>
+              <w:left w:type="dxa" w:w="80"/>
+              <w:bottom w:type="dxa" w:w="60"/>
+              <w:right w:type="dxa" w:w="80"/>
+            </w:tcMar>
+            <w:vAlign w:val="center"/>
+          </w:tcPr>
+          <w:p>
+            <w:pPr>
+              <w:spacing w:line="280" w:lineRule="auto"/>
+              <w:jc w:val="left"/>
+            </w:pPr>
+            <w:r>
+              <w:rPr>
+                <w:rFonts w:ascii="바탕" w:cs="바탕" w:eastAsia="바탕" w:hAnsi="바탕"/>
+                <w:sz w:val="19"/>
+                <w:szCs w:val="19"/>
+              </w:rPr>
+              <w:t xml:space="preserve">정보위 10:00~낮</w:t>
+            </w:r>
+          </w:p>
+        </w:tc>
+        <w:tc>
+          <w:tcPr>
+            <w:tcW w:type="dxa" w:w="3300"/>
+            <w:tcBorders>
+              <w:top w:val="single" w:color="000000" w:sz="4"/>
+              <w:left w:val="single" w:color="000000" w:sz="4"/>
+              <w:bottom w:val="single" w:color="000000" w:sz="4"/>
+              <w:right w:val="single" w:color="000000" w:sz="4"/>
+            </w:tcBorders>
+            <w:tcMar>
+              <w:top w:type="dxa" w:w="60"/>
+              <w:left w:type="dxa" w:w="80"/>
+              <w:bottom w:type="dxa" w:w="60"/>
+              <w:right w:type="dxa" w:w="80"/>
+            </w:tcMar>
+            <w:vAlign w:val="center"/>
+          </w:tcPr>
+          <w:p>
+            <w:pPr>
+              <w:spacing w:line="280" w:lineRule="auto"/>
+              <w:jc w:val="left"/>
+            </w:pPr>
+            <w:r>
+              <w:rPr>
+                <w:rFonts w:ascii="바탕" w:cs="바탕" w:eastAsia="바탕" w:hAnsi="바탕"/>
+                <w:sz w:val="19"/>
+                <w:szCs w:val="19"/>
+              </w:rPr>
+              <w:t xml:space="preserve">오후 자유</w:t>
+            </w:r>
+          </w:p>
+        </w:tc>
+      </w:tr>
+      <w:tr>
+        <w:trPr>
+          <w:cantSplit/>
+        </w:trPr>
+        <w:tc>
+          <w:tcPr>
+            <w:tcW w:type="dxa" w:w="2100"/>
+            <w:tcBorders>
+              <w:top w:val="single" w:color="000000" w:sz="4"/>
+              <w:left w:val="single" w:color="000000" w:sz="4"/>
+              <w:bottom w:val="single" w:color="000000" w:sz="4"/>
+              <w:right w:val="single" w:color="000000" w:sz="4"/>
+            </w:tcBorders>
+            <w:tcMar>
+              <w:top w:type="dxa" w:w="60"/>
+              <w:left w:type="dxa" w:w="80"/>
+              <w:bottom w:type="dxa" w:w="60"/>
+              <w:right w:type="dxa" w:w="80"/>
+            </w:tcMar>
+            <w:vAlign w:val="center"/>
+          </w:tcPr>
+          <w:p>
+            <w:pPr>
+              <w:spacing w:line="280" w:lineRule="auto"/>
+              <w:jc w:val="center"/>
+            </w:pPr>
+            <w:r>
+              <w:rPr>
+                <w:rFonts w:ascii="바탕" w:cs="바탕" w:eastAsia="바탕" w:hAnsi="바탕"/>
+                <w:sz w:val="19"/>
+                <w:szCs w:val="19"/>
+              </w:rPr>
+              <w:t xml:space="preserve">조현 외교부장관</w:t>
+            </w:r>
+          </w:p>
+        </w:tc>
+        <w:tc>
+          <w:tcPr>
+            <w:tcW w:type="dxa" w:w="4238"/>
+            <w:tcBorders>
+              <w:top w:val="single" w:color="000000" w:sz="4"/>
+              <w:left w:val="single" w:color="000000" w:sz="4"/>
+              <w:bottom w:val="single" w:color="000000" w:sz="4"/>
+              <w:right w:val="single" w:color="000000" w:sz="4"/>
+            </w:tcBorders>
+            <w:tcMar>
+              <w:top w:type="dxa" w:w="60"/>
+              <w:left w:type="dxa" w:w="80"/>
+              <w:bottom w:type="dxa" w:w="60"/>
+              <w:right w:type="dxa" w:w="80"/>
+            </w:tcMar>
+            <w:vAlign w:val="center"/>
+          </w:tcPr>
+          <w:p>
+            <w:pPr>
+              <w:spacing w:line="280" w:lineRule="auto"/>
+              <w:jc w:val="left"/>
+            </w:pPr>
+            <w:r>
+              <w:rPr>
+                <w:rFonts w:ascii="바탕" w:cs="바탕" w:eastAsia="바탕" w:hAnsi="바탕"/>
+                <w:sz w:val="19"/>
+                <w:szCs w:val="19"/>
+              </w:rPr>
+              <w:t xml:space="preserve">공개 일정 없음(통상업무)</w:t>
+            </w:r>
+          </w:p>
+        </w:tc>
+        <w:tc>
+          <w:tcPr>
+            <w:tcW w:type="dxa" w:w="3300"/>
+            <w:tcBorders>
+              <w:top w:val="single" w:color="000000" w:sz="4"/>
+              <w:left w:val="single" w:color="000000" w:sz="4"/>
+              <w:bottom w:val="single" w:color="000000" w:sz="4"/>
+              <w:right w:val="single" w:color="000000" w:sz="4"/>
+            </w:tcBorders>
+            <w:tcMar>
+              <w:top w:type="dxa" w:w="60"/>
+              <w:left w:type="dxa" w:w="80"/>
+              <w:bottom w:type="dxa" w:w="60"/>
+              <w:right w:type="dxa" w:w="80"/>
+            </w:tcMar>
+            <w:vAlign w:val="center"/>
+          </w:tcPr>
+          <w:p>
+            <w:pPr>
+              <w:spacing w:line="280" w:lineRule="auto"/>
+              <w:jc w:val="left"/>
+            </w:pPr>
+            <w:r>
+              <w:rPr>
+                <w:rFonts w:ascii="바탕" w:cs="바탕" w:eastAsia="바탕" w:hAnsi="바탕"/>
+                <w:sz w:val="19"/>
+                <w:szCs w:val="19"/>
+              </w:rPr>
+              <w:t xml:space="preserve">가능</w:t>
+            </w:r>
+          </w:p>
+        </w:tc>
+      </w:tr>
+      <w:tr>
+        <w:trPr>
+          <w:cantSplit/>
+        </w:trPr>
+        <w:tc>
+          <w:tcPr>
+            <w:tcW w:type="dxa" w:w="2100"/>
+            <w:tcBorders>
+              <w:top w:val="single" w:color="000000" w:sz="4"/>
+              <w:left w:val="single" w:color="000000" w:sz="4"/>
+              <w:bottom w:val="single" w:color="000000" w:sz="4"/>
+              <w:right w:val="single" w:color="000000" w:sz="4"/>
+            </w:tcBorders>
+            <w:tcMar>
+              <w:top w:type="dxa" w:w="60"/>
+              <w:left w:type="dxa" w:w="80"/>
+              <w:bottom w:type="dxa" w:w="60"/>
+              <w:right w:type="dxa" w:w="80"/>
+            </w:tcMar>
+            <w:vAlign w:val="center"/>
+          </w:tcPr>
+          <w:p>
+            <w:pPr>
+              <w:spacing w:line="280" w:lineRule="auto"/>
+              <w:jc w:val="center"/>
+            </w:pPr>
+            <w:r>
+              <w:rPr>
+                <w:rFonts w:ascii="바탕" w:cs="바탕" w:eastAsia="바탕" w:hAnsi="바탕"/>
+                <w:sz w:val="19"/>
+                <w:szCs w:val="19"/>
+              </w:rPr>
+              <w:t xml:space="preserve">위성락 안보실장</w:t>
+            </w:r>
+          </w:p>
+        </w:tc>
+        <w:tc>
+          <w:tcPr>
+            <w:tcW w:type="dxa" w:w="4238"/>
+            <w:tcBorders>
+              <w:top w:val="single" w:color="000000" w:sz="4"/>
+              <w:left w:val="single" w:color="000000" w:sz="4"/>
+              <w:bottom w:val="single" w:color="000000" w:sz="4"/>
+              <w:right w:val="single" w:color="000000" w:sz="4"/>
+            </w:tcBorders>
+            <w:tcMar>
+              <w:top w:type="dxa" w:w="60"/>
+              <w:left w:type="dxa" w:w="80"/>
+              <w:bottom w:type="dxa" w:w="60"/>
+              <w:right w:type="dxa" w:w="80"/>
+            </w:tcMar>
+            <w:vAlign w:val="center"/>
+          </w:tcPr>
+          <w:p>
+            <w:pPr>
+              <w:spacing w:line="280" w:lineRule="auto"/>
+              <w:jc w:val="left"/>
+            </w:pPr>
+            <w:r>
+              <w:rPr>
+                <w:rFonts w:ascii="바탕" w:cs="바탕" w:eastAsia="바탕" w:hAnsi="바탕"/>
+                <w:sz w:val="19"/>
+                <w:szCs w:val="19"/>
+              </w:rPr>
+              <w:t xml:space="preserve">공개 일정 미확인</w:t>
+            </w:r>
+          </w:p>
+        </w:tc>
+        <w:tc>
+          <w:tcPr>
+            <w:tcW w:type="dxa" w:w="3300"/>
+            <w:tcBorders>
+              <w:top w:val="single" w:color="000000" w:sz="4"/>
+              <w:left w:val="single" w:color="000000" w:sz="4"/>
+              <w:bottom w:val="single" w:color="000000" w:sz="4"/>
+              <w:right w:val="single" w:color="000000" w:sz="4"/>
+            </w:tcBorders>
+            <w:tcMar>
+              <w:top w:type="dxa" w:w="60"/>
+              <w:left w:type="dxa" w:w="80"/>
+              <w:bottom w:type="dxa" w:w="60"/>
+              <w:right w:type="dxa" w:w="80"/>
+            </w:tcMar>
+            <w:vAlign w:val="center"/>
+          </w:tcPr>
+          <w:p>
+            <w:pPr>
+              <w:spacing w:line="280" w:lineRule="auto"/>
+              <w:jc w:val="left"/>
+            </w:pPr>
+            <w:r>
+              <w:rPr>
+                <w:rFonts w:ascii="바탕" w:cs="바탕" w:eastAsia="바탕" w:hAnsi="바탕"/>
+                <w:sz w:val="19"/>
+                <w:szCs w:val="19"/>
+              </w:rPr>
+              <w:t xml:space="preserve">가능으로 설정</w:t>
+            </w:r>
+          </w:p>
+        </w:tc>
+      </w:tr>
+      <w:tr>
+        <w:trPr>
+          <w:cantSplit/>
+        </w:trPr>
+        <w:tc>
+          <w:tcPr>
+            <w:tcW w:type="dxa" w:w="2100"/>
+            <w:tcBorders>
+              <w:top w:val="single" w:color="000000" w:sz="4"/>
+              <w:left w:val="single" w:color="000000" w:sz="4"/>
+              <w:bottom w:val="single" w:color="000000" w:sz="4"/>
+              <w:right w:val="single" w:color="000000" w:sz="4"/>
+            </w:tcBorders>
+            <w:tcMar>
+              <w:top w:type="dxa" w:w="60"/>
+              <w:left w:type="dxa" w:w="80"/>
+              <w:bottom w:type="dxa" w:w="60"/>
+              <w:right w:type="dxa" w:w="80"/>
+            </w:tcMar>
+            <w:vAlign w:val="center"/>
+          </w:tcPr>
+          <w:p>
+            <w:pPr>
+              <w:spacing w:line="280" w:lineRule="auto"/>
+              <w:jc w:val="center"/>
+            </w:pPr>
+            <w:r>
+              <w:rPr>
+                <w:rFonts w:ascii="바탕" w:cs="바탕" w:eastAsia="바탕" w:hAnsi="바탕"/>
+                <w:sz w:val="19"/>
+                <w:szCs w:val="19"/>
+              </w:rPr>
+              <w:t xml:space="preserve">정동영 통일부장관</w:t>
+            </w:r>
+          </w:p>
+        </w:tc>
+        <w:tc>
+          <w:tcPr>
+            <w:tcW w:type="dxa" w:w="4238"/>
+            <w:tcBorders>
+              <w:top w:val="single" w:color="000000" w:sz="4"/>
+              <w:left w:val="single" w:color="000000" w:sz="4"/>
+              <w:bottom w:val="single" w:color="000000" w:sz="4"/>
+              <w:right w:val="single" w:color="000000" w:sz="4"/>
+            </w:tcBorders>
+            <w:tcMar>
+              <w:top w:type="dxa" w:w="60"/>
+              <w:left w:type="dxa" w:w="80"/>
+              <w:bottom w:type="dxa" w:w="60"/>
+              <w:right w:type="dxa" w:w="80"/>
+            </w:tcMar>
+            <w:vAlign w:val="center"/>
+          </w:tcPr>
+          <w:p>
+            <w:pPr>
+              <w:spacing w:line="280" w:lineRule="auto"/>
+              <w:jc w:val="left"/>
+            </w:pPr>
+            <w:r>
+              <w:rPr>
+                <w:rFonts w:ascii="바탕" w:cs="바탕" w:eastAsia="바탕" w:hAnsi="바탕"/>
+                <w:sz w:val="19"/>
+                <w:szCs w:val="19"/>
+              </w:rPr>
+              <w:t xml:space="preserve">북아일랜드 현지(UTC+1, 한국보다 8시간 느림). 18:30 KST = 10:30 현지</w:t>
+            </w:r>
+          </w:p>
+        </w:tc>
+        <w:tc>
+          <w:tcPr>
+            <w:tcW w:type="dxa" w:w="3300"/>
+            <w:tcBorders>
+              <w:top w:val="single" w:color="000000" w:sz="4"/>
+              <w:left w:val="single" w:color="000000" w:sz="4"/>
+              <w:bottom w:val="single" w:color="000000" w:sz="4"/>
+              <w:right w:val="single" w:color="000000" w:sz="4"/>
+            </w:tcBorders>
+            <w:tcMar>
+              <w:top w:type="dxa" w:w="60"/>
+              <w:left w:type="dxa" w:w="80"/>
+              <w:bottom w:type="dxa" w:w="60"/>
+              <w:right w:type="dxa" w:w="80"/>
+            </w:tcMar>
+            <w:vAlign w:val="center"/>
+          </w:tcPr>
+          <w:p>
+            <w:pPr>
+              <w:spacing w:line="280" w:lineRule="auto"/>
+              <w:jc w:val="left"/>
+            </w:pPr>
+            <w:r>
+              <w:rPr>
+                <w:rFonts w:ascii="바탕" w:cs="바탕" w:eastAsia="바탕" w:hAnsi="바탕"/>
+                <w:sz w:val="19"/>
+                <w:szCs w:val="19"/>
+              </w:rPr>
+              <w:t xml:space="preserve">현지 오전이므로 화상 참석 가능</w:t>
+            </w:r>
+          </w:p>
+        </w:tc>
+      </w:tr>
+      <w:tr>
+        <w:trPr>
+          <w:cantSplit/>
+        </w:trPr>
+        <w:tc>
+          <w:tcPr>
+            <w:tcW w:type="dxa" w:w="2100"/>
+            <w:tcBorders>
+              <w:top w:val="single" w:color="000000" w:sz="4"/>
+              <w:left w:val="single" w:color="000000" w:sz="4"/>
+              <w:bottom w:val="single" w:color="000000" w:sz="4"/>
+              <w:right w:val="single" w:color="000000" w:sz="4"/>
+            </w:tcBorders>
+            <w:tcMar>
+              <w:top w:type="dxa" w:w="60"/>
+              <w:left w:type="dxa" w:w="80"/>
+              <w:bottom w:type="dxa" w:w="60"/>
+              <w:right w:type="dxa" w:w="80"/>
+            </w:tcMar>
+            <w:vAlign w:val="center"/>
+          </w:tcPr>
+          <w:p>
+            <w:pPr>
+              <w:spacing w:line="280" w:lineRule="auto"/>
+              <w:jc w:val="center"/>
+            </w:pPr>
+            <w:r>
+              <w:rPr>
+                <w:rFonts w:ascii="바탕" w:cs="바탕" w:eastAsia="바탕" w:hAnsi="바탕"/>
+                <w:sz w:val="19"/>
+                <w:szCs w:val="19"/>
+              </w:rPr>
+              <w:t xml:space="preserve">이진수 법무차관</w:t>
+            </w:r>
+          </w:p>
+        </w:tc>
+        <w:tc>
+          <w:tcPr>
+            <w:tcW w:type="dxa" w:w="4238"/>
+            <w:tcBorders>
+              <w:top w:val="single" w:color="000000" w:sz="4"/>
+              <w:left w:val="single" w:color="000000" w:sz="4"/>
+              <w:bottom w:val="single" w:color="000000" w:sz="4"/>
+              <w:right w:val="single" w:color="000000" w:sz="4"/>
+            </w:tcBorders>
+            <w:tcMar>
+              <w:top w:type="dxa" w:w="60"/>
+              <w:left w:type="dxa" w:w="80"/>
+              <w:bottom w:type="dxa" w:w="60"/>
+              <w:right w:type="dxa" w:w="80"/>
+            </w:tcMar>
+            <w:vAlign w:val="center"/>
+          </w:tcPr>
+          <w:p>
+            <w:pPr>
+              <w:spacing w:line="280" w:lineRule="auto"/>
+              <w:jc w:val="left"/>
+            </w:pPr>
+            <w:r>
+              <w:rPr>
+                <w:rFonts w:ascii="바탕" w:cs="바탕" w:eastAsia="바탕" w:hAnsi="바탕"/>
+                <w:sz w:val="19"/>
+                <w:szCs w:val="19"/>
+              </w:rPr>
+              <w:t xml:space="preserve">공개 일정 미확인(직무대행)</w:t>
+            </w:r>
+          </w:p>
+        </w:tc>
+        <w:tc>
+          <w:tcPr>
+            <w:tcW w:type="dxa" w:w="3300"/>
+            <w:tcBorders>
+              <w:top w:val="single" w:color="000000" w:sz="4"/>
+              <w:left w:val="single" w:color="000000" w:sz="4"/>
+              <w:bottom w:val="single" w:color="000000" w:sz="4"/>
+              <w:right w:val="single" w:color="000000" w:sz="4"/>
+            </w:tcBorders>
+            <w:tcMar>
+              <w:top w:type="dxa" w:w="60"/>
+              <w:left w:type="dxa" w:w="80"/>
+              <w:bottom w:type="dxa" w:w="60"/>
+              <w:right w:type="dxa" w:w="80"/>
+            </w:tcMar>
+            <w:vAlign w:val="center"/>
+          </w:tcPr>
+          <w:p>
+            <w:pPr>
+              <w:spacing w:line="280" w:lineRule="auto"/>
+              <w:jc w:val="left"/>
+            </w:pPr>
+            <w:r>
+              <w:rPr>
+                <w:rFonts w:ascii="바탕" w:cs="바탕" w:eastAsia="바탕" w:hAnsi="바탕"/>
+                <w:sz w:val="19"/>
+                <w:szCs w:val="19"/>
+              </w:rPr>
+              <w:t xml:space="preserve">가능으로 설정</w:t>
             </w:r>
           </w:p>
         </w:tc>
@@ -26034,7 +28177,21 @@
           <w:sz w:val="20"/>
           <w:szCs w:val="20"/>
         </w:rPr>
-        <w:t xml:space="preserve">저녁 18시 개의로 정한 이유는 총리 일정이 17:30까지 이어지고, 유엔사 발표(오전)와 합참 입장, 김여정 담화, 국정원 정보위 보고가 모두 끝난 뒤에야 종합 판단이 가능하기 때문입니다. 정동영 장관의 조기 귀국 결정은 이날 밤 보도되었으므로 회의 시점에는 “조치 중”으로 처리했습니다.</w:t>
+        <w:t xml:space="preserve">이전 버전에서는 18:00 개의로 설정했으나, 대통령이 울산 진수식 후 귀경해야 하고 총리·부총리가 16:30 회의에 참석한 점을 반영해 18:30 개의로 조정했습니다. 18:30이면 현지 시각 10:30인 통일부장관의 화상 참석도 무리가 없습니다. 이전 버전에서 “대통령 통상업무”로 쓴 것은 정정합니다. 대통령은 오전에 군 병원을 방문하고 오후에 울산에서 진수식에 참석했습니다. 또한 외교부장관이 과학기술관계장관회의에 간 것으로 쓴 것도 정정합니다. 해당 회의에는 2차관이 참석했습니다.</w:t>
+      </w:r>
+    </w:p>
+    <w:p>
+      <w:pPr>
+        <w:spacing w:after="120" w:line="350" w:lineRule="auto"/>
+        <w:jc w:val="both"/>
+      </w:pPr>
+      <w:r>
+        <w:rPr>
+          <w:rFonts w:ascii="바탕" w:cs="바탕" w:eastAsia="바탕" w:hAnsi="바탕"/>
+          <w:sz w:val="20"/>
+          <w:szCs w:val="20"/>
+        </w:rPr>
+        <w:t xml:space="preserve">참고로 실제로는 이날 저녁 NSC 전체회의 소집 보도를 찾지 못했고, 홍보소통수석이 밤에 “미온적이지 않다”는 입장을 밝혔습니다. 정동영 장관 조기 귀국 결정은 22:18 보도되었는데, 이 회의록에서는 같은 시각대(회의 종료 직전)에 대통령 지시로 귀국을 단축하는 것으로 설정했습니다.</w:t>
       </w:r>
     </w:p>
     <w:p>
@@ -26589,7 +28746,7 @@
                 <w:sz w:val="19"/>
                 <w:szCs w:val="19"/>
               </w:rPr>
-              <w:t xml:space="preserve">정정. 이전 버전의 정성호는 오류. 정성호 퇴임 후 후보자 김승원이 9.19 자진 사퇴. 회의에는 차관(직무대행)으로 표기, 성명 미확인</w:t>
+              <w:t xml:space="preserve">정정. 이전 버전의 정성호는 오류. 정성호 사의 수리(8.24) 후 후보자 김승원이 9.19 자진 사퇴</w:t>
             </w:r>
           </w:p>
         </w:tc>
@@ -26626,7 +28783,7 @@
                 <w:sz w:val="19"/>
                 <w:szCs w:val="19"/>
               </w:rPr>
-              <w:t xml:space="preserve">국방부장관</w:t>
+              <w:t xml:space="preserve">법무부차관(장관 직무대행)</w:t>
             </w:r>
           </w:p>
         </w:tc>
@@ -26658,7 +28815,7 @@
                 <w:sz w:val="19"/>
                 <w:szCs w:val="19"/>
               </w:rPr>
-              <w:t xml:space="preserve">강신철</w:t>
+              <w:t xml:space="preserve">이진수</w:t>
             </w:r>
           </w:p>
         </w:tc>
@@ -26690,7 +28847,7 @@
                 <w:sz w:val="19"/>
                 <w:szCs w:val="19"/>
               </w:rPr>
-              <w:t xml:space="preserve">확인. 8.30 지명, 9.29 국회 국방위 출석. 이전 문서의 안규백은 이전 장관</w:t>
+              <w:t xml:space="preserve">확인. 9월 국회 법사위·대정부질문에 직무대행으로 출석 보도(사용자 확인 반영)</w:t>
             </w:r>
           </w:p>
         </w:tc>
@@ -26727,6 +28884,208 @@
                 <w:sz w:val="19"/>
                 <w:szCs w:val="19"/>
               </w:rPr>
+              <w:t xml:space="preserve">대통령비서실 홍보소통수석</w:t>
+            </w:r>
+          </w:p>
+        </w:tc>
+        <w:tc>
+          <w:tcPr>
+            <w:tcW w:type="dxa" w:w="1500"/>
+            <w:tcBorders>
+              <w:top w:val="single" w:color="000000" w:sz="4"/>
+              <w:left w:val="single" w:color="000000" w:sz="4"/>
+              <w:bottom w:val="single" w:color="000000" w:sz="4"/>
+              <w:right w:val="single" w:color="000000" w:sz="4"/>
+            </w:tcBorders>
+            <w:tcMar>
+              <w:top w:type="dxa" w:w="60"/>
+              <w:left w:type="dxa" w:w="80"/>
+              <w:bottom w:type="dxa" w:w="60"/>
+              <w:right w:type="dxa" w:w="80"/>
+            </w:tcMar>
+            <w:vAlign w:val="center"/>
+          </w:tcPr>
+          <w:p>
+            <w:pPr>
+              <w:spacing w:line="280" w:lineRule="auto"/>
+              <w:jc w:val="center"/>
+            </w:pPr>
+            <w:r>
+              <w:rPr>
+                <w:rFonts w:ascii="바탕" w:cs="바탕" w:eastAsia="바탕" w:hAnsi="바탕"/>
+                <w:sz w:val="19"/>
+                <w:szCs w:val="19"/>
+              </w:rPr>
+              <w:t xml:space="preserve">성기홍</w:t>
+            </w:r>
+          </w:p>
+        </w:tc>
+        <w:tc>
+          <w:tcPr>
+            <w:tcW w:type="dxa" w:w="5438"/>
+            <w:tcBorders>
+              <w:top w:val="single" w:color="000000" w:sz="4"/>
+              <w:left w:val="single" w:color="000000" w:sz="4"/>
+              <w:bottom w:val="single" w:color="000000" w:sz="4"/>
+              <w:right w:val="single" w:color="000000" w:sz="4"/>
+            </w:tcBorders>
+            <w:tcMar>
+              <w:top w:type="dxa" w:w="60"/>
+              <w:left w:type="dxa" w:w="80"/>
+              <w:bottom w:type="dxa" w:w="60"/>
+              <w:right w:type="dxa" w:w="80"/>
+            </w:tcMar>
+            <w:vAlign w:val="center"/>
+          </w:tcPr>
+          <w:p>
+            <w:pPr>
+              <w:spacing w:line="280" w:lineRule="auto"/>
+              <w:jc w:val="left"/>
+            </w:pPr>
+            <w:r>
+              <w:rPr>
+                <w:rFonts w:ascii="바탕" w:cs="바탕" w:eastAsia="바탕" w:hAnsi="바탕"/>
+                <w:sz w:val="19"/>
+                <w:szCs w:val="19"/>
+              </w:rPr>
+              <w:t xml:space="preserve">확인(9.21 사의 브리핑, 9.30 청와대 입장 전달)</w:t>
+            </w:r>
+          </w:p>
+        </w:tc>
+      </w:tr>
+      <w:tr>
+        <w:trPr>
+          <w:cantSplit/>
+        </w:trPr>
+        <w:tc>
+          <w:tcPr>
+            <w:tcW w:type="dxa" w:w="2700"/>
+            <w:tcBorders>
+              <w:top w:val="single" w:color="000000" w:sz="4"/>
+              <w:left w:val="single" w:color="000000" w:sz="4"/>
+              <w:bottom w:val="single" w:color="000000" w:sz="4"/>
+              <w:right w:val="single" w:color="000000" w:sz="4"/>
+            </w:tcBorders>
+            <w:tcMar>
+              <w:top w:type="dxa" w:w="60"/>
+              <w:left w:type="dxa" w:w="80"/>
+              <w:bottom w:type="dxa" w:w="60"/>
+              <w:right w:type="dxa" w:w="80"/>
+            </w:tcMar>
+            <w:vAlign w:val="center"/>
+          </w:tcPr>
+          <w:p>
+            <w:pPr>
+              <w:spacing w:line="280" w:lineRule="auto"/>
+              <w:jc w:val="left"/>
+            </w:pPr>
+            <w:r>
+              <w:rPr>
+                <w:rFonts w:ascii="바탕" w:cs="바탕" w:eastAsia="바탕" w:hAnsi="바탕"/>
+                <w:sz w:val="19"/>
+                <w:szCs w:val="19"/>
+              </w:rPr>
+              <w:t xml:space="preserve">국방부장관</w:t>
+            </w:r>
+          </w:p>
+        </w:tc>
+        <w:tc>
+          <w:tcPr>
+            <w:tcW w:type="dxa" w:w="1500"/>
+            <w:tcBorders>
+              <w:top w:val="single" w:color="000000" w:sz="4"/>
+              <w:left w:val="single" w:color="000000" w:sz="4"/>
+              <w:bottom w:val="single" w:color="000000" w:sz="4"/>
+              <w:right w:val="single" w:color="000000" w:sz="4"/>
+            </w:tcBorders>
+            <w:tcMar>
+              <w:top w:type="dxa" w:w="60"/>
+              <w:left w:type="dxa" w:w="80"/>
+              <w:bottom w:type="dxa" w:w="60"/>
+              <w:right w:type="dxa" w:w="80"/>
+            </w:tcMar>
+            <w:vAlign w:val="center"/>
+          </w:tcPr>
+          <w:p>
+            <w:pPr>
+              <w:spacing w:line="280" w:lineRule="auto"/>
+              <w:jc w:val="center"/>
+            </w:pPr>
+            <w:r>
+              <w:rPr>
+                <w:rFonts w:ascii="바탕" w:cs="바탕" w:eastAsia="바탕" w:hAnsi="바탕"/>
+                <w:sz w:val="19"/>
+                <w:szCs w:val="19"/>
+              </w:rPr>
+              <w:t xml:space="preserve">강신철</w:t>
+            </w:r>
+          </w:p>
+        </w:tc>
+        <w:tc>
+          <w:tcPr>
+            <w:tcW w:type="dxa" w:w="5438"/>
+            <w:tcBorders>
+              <w:top w:val="single" w:color="000000" w:sz="4"/>
+              <w:left w:val="single" w:color="000000" w:sz="4"/>
+              <w:bottom w:val="single" w:color="000000" w:sz="4"/>
+              <w:right w:val="single" w:color="000000" w:sz="4"/>
+            </w:tcBorders>
+            <w:tcMar>
+              <w:top w:type="dxa" w:w="60"/>
+              <w:left w:type="dxa" w:w="80"/>
+              <w:bottom w:type="dxa" w:w="60"/>
+              <w:right w:type="dxa" w:w="80"/>
+            </w:tcMar>
+            <w:vAlign w:val="center"/>
+          </w:tcPr>
+          <w:p>
+            <w:pPr>
+              <w:spacing w:line="280" w:lineRule="auto"/>
+              <w:jc w:val="left"/>
+            </w:pPr>
+            <w:r>
+              <w:rPr>
+                <w:rFonts w:ascii="바탕" w:cs="바탕" w:eastAsia="바탕" w:hAnsi="바탕"/>
+                <w:sz w:val="19"/>
+                <w:szCs w:val="19"/>
+              </w:rPr>
+              <w:t xml:space="preserve">확인. 8.30 지명, 9.29 국회 국방위 출석. 이전 문서의 안규백은 이전 장관</w:t>
+            </w:r>
+          </w:p>
+        </w:tc>
+      </w:tr>
+      <w:tr>
+        <w:trPr>
+          <w:cantSplit/>
+        </w:trPr>
+        <w:tc>
+          <w:tcPr>
+            <w:tcW w:type="dxa" w:w="2700"/>
+            <w:tcBorders>
+              <w:top w:val="single" w:color="000000" w:sz="4"/>
+              <w:left w:val="single" w:color="000000" w:sz="4"/>
+              <w:bottom w:val="single" w:color="000000" w:sz="4"/>
+              <w:right w:val="single" w:color="000000" w:sz="4"/>
+            </w:tcBorders>
+            <w:tcMar>
+              <w:top w:type="dxa" w:w="60"/>
+              <w:left w:type="dxa" w:w="80"/>
+              <w:bottom w:type="dxa" w:w="60"/>
+              <w:right w:type="dxa" w:w="80"/>
+            </w:tcMar>
+            <w:vAlign w:val="center"/>
+          </w:tcPr>
+          <w:p>
+            <w:pPr>
+              <w:spacing w:line="280" w:lineRule="auto"/>
+              <w:jc w:val="left"/>
+            </w:pPr>
+            <w:r>
+              <w:rPr>
+                <w:rFonts w:ascii="바탕" w:cs="바탕" w:eastAsia="바탕" w:hAnsi="바탕"/>
+                <w:sz w:val="19"/>
+                <w:szCs w:val="19"/>
+              </w:rPr>
               <w:t xml:space="preserve">외교부장관</w:t>
             </w:r>
           </w:p>
@@ -26791,7 +29150,7 @@
                 <w:sz w:val="19"/>
                 <w:szCs w:val="19"/>
               </w:rPr>
-              <w:t xml:space="preserve">확인. 9.30 외통위 불참 보도</w:t>
+              <w:t xml:space="preserve">확인. 9.30 통상업무, 외통위 불참. 10:00 과학기술장관회의는 김진아 2차관 참석</w:t>
             </w:r>
           </w:p>
         </w:tc>
@@ -29116,6 +31475,208 @@
                 <w:sz w:val="19"/>
                 <w:szCs w:val="19"/>
               </w:rPr>
+              <w:t xml:space="preserve">10.1 국군의 날</w:t>
+            </w:r>
+          </w:p>
+        </w:tc>
+        <w:tc>
+          <w:tcPr>
+            <w:tcW w:type="dxa" w:w="5538"/>
+            <w:tcBorders>
+              <w:top w:val="single" w:color="000000" w:sz="4"/>
+              <w:left w:val="single" w:color="000000" w:sz="4"/>
+              <w:bottom w:val="single" w:color="000000" w:sz="4"/>
+              <w:right w:val="single" w:color="000000" w:sz="4"/>
+            </w:tcBorders>
+            <w:tcMar>
+              <w:top w:type="dxa" w:w="60"/>
+              <w:left w:type="dxa" w:w="80"/>
+              <w:bottom w:type="dxa" w:w="60"/>
+              <w:right w:type="dxa" w:w="80"/>
+            </w:tcMar>
+            <w:vAlign w:val="center"/>
+          </w:tcPr>
+          <w:p>
+            <w:pPr>
+              <w:spacing w:line="280" w:lineRule="auto"/>
+              <w:jc w:val="left"/>
+            </w:pPr>
+            <w:r>
+              <w:rPr>
+                <w:rFonts w:ascii="바탕" w:cs="바탕" w:eastAsia="바탕" w:hAnsi="바탕"/>
+                <w:sz w:val="19"/>
+                <w:szCs w:val="19"/>
+              </w:rPr>
+              <w:t xml:space="preserve">제78주년 기념식, 대통령 참석, 부상 장병 위로·긴장 완화 조치 지속·대화 복원 촉구</w:t>
+            </w:r>
+          </w:p>
+        </w:tc>
+        <w:tc>
+          <w:tcPr>
+            <w:tcW w:type="dxa" w:w="2300"/>
+            <w:tcBorders>
+              <w:top w:val="single" w:color="000000" w:sz="4"/>
+              <w:left w:val="single" w:color="000000" w:sz="4"/>
+              <w:bottom w:val="single" w:color="000000" w:sz="4"/>
+              <w:right w:val="single" w:color="000000" w:sz="4"/>
+            </w:tcBorders>
+            <w:tcMar>
+              <w:top w:type="dxa" w:w="60"/>
+              <w:left w:type="dxa" w:w="80"/>
+              <w:bottom w:type="dxa" w:w="60"/>
+              <w:right w:type="dxa" w:w="80"/>
+            </w:tcMar>
+            <w:vAlign w:val="center"/>
+          </w:tcPr>
+          <w:p>
+            <w:pPr>
+              <w:spacing w:line="280" w:lineRule="auto"/>
+              <w:jc w:val="left"/>
+            </w:pPr>
+            <w:r>
+              <w:rPr>
+                <w:rFonts w:ascii="바탕" w:cs="바탕" w:eastAsia="바탕" w:hAnsi="바탕"/>
+                <w:sz w:val="19"/>
+                <w:szCs w:val="19"/>
+              </w:rPr>
+              <w:t xml:space="preserve">사후 확인(회의록 설정과 방향 일치)</w:t>
+            </w:r>
+          </w:p>
+        </w:tc>
+      </w:tr>
+      <w:tr>
+        <w:trPr>
+          <w:cantSplit/>
+        </w:trPr>
+        <w:tc>
+          <w:tcPr>
+            <w:tcW w:type="dxa" w:w="1800"/>
+            <w:tcBorders>
+              <w:top w:val="single" w:color="000000" w:sz="4"/>
+              <w:left w:val="single" w:color="000000" w:sz="4"/>
+              <w:bottom w:val="single" w:color="000000" w:sz="4"/>
+              <w:right w:val="single" w:color="000000" w:sz="4"/>
+            </w:tcBorders>
+            <w:tcMar>
+              <w:top w:type="dxa" w:w="60"/>
+              <w:left w:type="dxa" w:w="80"/>
+              <w:bottom w:type="dxa" w:w="60"/>
+              <w:right w:type="dxa" w:w="80"/>
+            </w:tcMar>
+            <w:vAlign w:val="center"/>
+          </w:tcPr>
+          <w:p>
+            <w:pPr>
+              <w:spacing w:line="280" w:lineRule="auto"/>
+              <w:jc w:val="center"/>
+            </w:pPr>
+            <w:r>
+              <w:rPr>
+                <w:rFonts w:ascii="바탕" w:cs="바탕" w:eastAsia="바탕" w:hAnsi="바탕"/>
+                <w:sz w:val="19"/>
+                <w:szCs w:val="19"/>
+              </w:rPr>
+              <w:t xml:space="preserve">9.17 NSC 상임위</w:t>
+            </w:r>
+          </w:p>
+        </w:tc>
+        <w:tc>
+          <w:tcPr>
+            <w:tcW w:type="dxa" w:w="5538"/>
+            <w:tcBorders>
+              <w:top w:val="single" w:color="000000" w:sz="4"/>
+              <w:left w:val="single" w:color="000000" w:sz="4"/>
+              <w:bottom w:val="single" w:color="000000" w:sz="4"/>
+              <w:right w:val="single" w:color="000000" w:sz="4"/>
+            </w:tcBorders>
+            <w:tcMar>
+              <w:top w:type="dxa" w:w="60"/>
+              <w:left w:type="dxa" w:w="80"/>
+              <w:bottom w:type="dxa" w:w="60"/>
+              <w:right w:type="dxa" w:w="80"/>
+            </w:tcMar>
+            <w:vAlign w:val="center"/>
+          </w:tcPr>
+          <w:p>
+            <w:pPr>
+              <w:spacing w:line="280" w:lineRule="auto"/>
+              <w:jc w:val="left"/>
+            </w:pPr>
+            <w:r>
+              <w:rPr>
+                <w:rFonts w:ascii="바탕" w:cs="바탕" w:eastAsia="바탕" w:hAnsi="바탕"/>
+                <w:sz w:val="19"/>
+                <w:szCs w:val="19"/>
+              </w:rPr>
+              <w:t xml:space="preserve">위성락 안보실장 주재 상임위 순연(호르무즈, 조현 방미 후로)</w:t>
+            </w:r>
+          </w:p>
+        </w:tc>
+        <w:tc>
+          <w:tcPr>
+            <w:tcW w:type="dxa" w:w="2300"/>
+            <w:tcBorders>
+              <w:top w:val="single" w:color="000000" w:sz="4"/>
+              <w:left w:val="single" w:color="000000" w:sz="4"/>
+              <w:bottom w:val="single" w:color="000000" w:sz="4"/>
+              <w:right w:val="single" w:color="000000" w:sz="4"/>
+            </w:tcBorders>
+            <w:tcMar>
+              <w:top w:type="dxa" w:w="60"/>
+              <w:left w:type="dxa" w:w="80"/>
+              <w:bottom w:type="dxa" w:w="60"/>
+              <w:right w:type="dxa" w:w="80"/>
+            </w:tcMar>
+            <w:vAlign w:val="center"/>
+          </w:tcPr>
+          <w:p>
+            <w:pPr>
+              <w:spacing w:line="280" w:lineRule="auto"/>
+              <w:jc w:val="left"/>
+            </w:pPr>
+            <w:r>
+              <w:rPr>
+                <w:rFonts w:ascii="바탕" w:cs="바탕" w:eastAsia="바탕" w:hAnsi="바탕"/>
+                <w:sz w:val="19"/>
+                <w:szCs w:val="19"/>
+              </w:rPr>
+              <w:t xml:space="preserve">보도</w:t>
+            </w:r>
+          </w:p>
+        </w:tc>
+      </w:tr>
+      <w:tr>
+        <w:trPr>
+          <w:cantSplit/>
+        </w:trPr>
+        <w:tc>
+          <w:tcPr>
+            <w:tcW w:type="dxa" w:w="1800"/>
+            <w:tcBorders>
+              <w:top w:val="single" w:color="000000" w:sz="4"/>
+              <w:left w:val="single" w:color="000000" w:sz="4"/>
+              <w:bottom w:val="single" w:color="000000" w:sz="4"/>
+              <w:right w:val="single" w:color="000000" w:sz="4"/>
+            </w:tcBorders>
+            <w:tcMar>
+              <w:top w:type="dxa" w:w="60"/>
+              <w:left w:type="dxa" w:w="80"/>
+              <w:bottom w:type="dxa" w:w="60"/>
+              <w:right w:type="dxa" w:w="80"/>
+            </w:tcMar>
+            <w:vAlign w:val="center"/>
+          </w:tcPr>
+          <w:p>
+            <w:pPr>
+              <w:spacing w:line="280" w:lineRule="auto"/>
+              <w:jc w:val="center"/>
+            </w:pPr>
+            <w:r>
+              <w:rPr>
+                <w:rFonts w:ascii="바탕" w:cs="바탕" w:eastAsia="바탕" w:hAnsi="바탕"/>
+                <w:sz w:val="19"/>
+                <w:szCs w:val="19"/>
+              </w:rPr>
               <w:t xml:space="preserve">전작권·SCM</w:t>
             </w:r>
           </w:p>
@@ -30596,6 +33157,309 @@
                 <w:sz w:val="19"/>
                 <w:szCs w:val="19"/>
               </w:rPr>
+              <w:t xml:space="preserve">조현 외교부장관 일정</w:t>
+            </w:r>
+          </w:p>
+        </w:tc>
+        <w:tc>
+          <w:tcPr>
+            <w:tcW w:type="dxa" w:w="2300"/>
+            <w:tcBorders>
+              <w:top w:val="single" w:color="000000" w:sz="4"/>
+              <w:left w:val="single" w:color="000000" w:sz="4"/>
+              <w:bottom w:val="single" w:color="000000" w:sz="4"/>
+              <w:right w:val="single" w:color="000000" w:sz="4"/>
+            </w:tcBorders>
+            <w:tcMar>
+              <w:top w:type="dxa" w:w="60"/>
+              <w:left w:type="dxa" w:w="80"/>
+              <w:bottom w:type="dxa" w:w="60"/>
+              <w:right w:type="dxa" w:w="80"/>
+            </w:tcMar>
+            <w:vAlign w:val="center"/>
+          </w:tcPr>
+          <w:p>
+            <w:pPr>
+              <w:spacing w:line="280" w:lineRule="auto"/>
+              <w:jc w:val="center"/>
+            </w:pPr>
+            <w:r>
+              <w:rPr>
+                <w:rFonts w:ascii="바탕" w:cs="바탕" w:eastAsia="바탕" w:hAnsi="바탕"/>
+                <w:sz w:val="19"/>
+                <w:szCs w:val="19"/>
+              </w:rPr>
+              <w:t xml:space="preserve">이전 버전: 10:00 과학기술장관회의</w:t>
+            </w:r>
+          </w:p>
+        </w:tc>
+        <w:tc>
+          <w:tcPr>
+            <w:tcW w:type="dxa" w:w="5538"/>
+            <w:tcBorders>
+              <w:top w:val="single" w:color="000000" w:sz="4"/>
+              <w:left w:val="single" w:color="000000" w:sz="4"/>
+              <w:bottom w:val="single" w:color="000000" w:sz="4"/>
+              <w:right w:val="single" w:color="000000" w:sz="4"/>
+            </w:tcBorders>
+            <w:tcMar>
+              <w:top w:type="dxa" w:w="60"/>
+              <w:left w:type="dxa" w:w="80"/>
+              <w:bottom w:type="dxa" w:w="60"/>
+              <w:right w:type="dxa" w:w="80"/>
+            </w:tcMar>
+            <w:vAlign w:val="center"/>
+          </w:tcPr>
+          <w:p>
+            <w:pPr>
+              <w:spacing w:line="280" w:lineRule="auto"/>
+              <w:jc w:val="left"/>
+            </w:pPr>
+            <w:r>
+              <w:rPr>
+                <w:rFonts w:ascii="바탕" w:cs="바탕" w:eastAsia="바탕" w:hAnsi="바탕"/>
+                <w:sz w:val="19"/>
+                <w:szCs w:val="19"/>
+              </w:rPr>
+              <w:t xml:space="preserve">2차관 참석으로 정정. 조현 장관은 공개 일정 없음</w:t>
+            </w:r>
+          </w:p>
+        </w:tc>
+      </w:tr>
+      <w:tr>
+        <w:trPr>
+          <w:cantSplit/>
+        </w:trPr>
+        <w:tc>
+          <w:tcPr>
+            <w:tcW w:type="dxa" w:w="1800"/>
+            <w:tcBorders>
+              <w:top w:val="single" w:color="000000" w:sz="4"/>
+              <w:left w:val="single" w:color="000000" w:sz="4"/>
+              <w:bottom w:val="single" w:color="000000" w:sz="4"/>
+              <w:right w:val="single" w:color="000000" w:sz="4"/>
+            </w:tcBorders>
+            <w:tcMar>
+              <w:top w:type="dxa" w:w="60"/>
+              <w:left w:type="dxa" w:w="80"/>
+              <w:bottom w:type="dxa" w:w="60"/>
+              <w:right w:type="dxa" w:w="80"/>
+            </w:tcMar>
+            <w:vAlign w:val="center"/>
+          </w:tcPr>
+          <w:p>
+            <w:pPr>
+              <w:spacing w:line="280" w:lineRule="auto"/>
+              <w:jc w:val="center"/>
+            </w:pPr>
+            <w:r>
+              <w:rPr>
+                <w:rFonts w:ascii="바탕" w:cs="바탕" w:eastAsia="바탕" w:hAnsi="바탕"/>
+                <w:sz w:val="19"/>
+                <w:szCs w:val="19"/>
+              </w:rPr>
+              <w:t xml:space="preserve">대통령 9.30 일정</w:t>
+            </w:r>
+          </w:p>
+        </w:tc>
+        <w:tc>
+          <w:tcPr>
+            <w:tcW w:type="dxa" w:w="2300"/>
+            <w:tcBorders>
+              <w:top w:val="single" w:color="000000" w:sz="4"/>
+              <w:left w:val="single" w:color="000000" w:sz="4"/>
+              <w:bottom w:val="single" w:color="000000" w:sz="4"/>
+              <w:right w:val="single" w:color="000000" w:sz="4"/>
+            </w:tcBorders>
+            <w:tcMar>
+              <w:top w:type="dxa" w:w="60"/>
+              <w:left w:type="dxa" w:w="80"/>
+              <w:bottom w:type="dxa" w:w="60"/>
+              <w:right w:type="dxa" w:w="80"/>
+            </w:tcMar>
+            <w:vAlign w:val="center"/>
+          </w:tcPr>
+          <w:p>
+            <w:pPr>
+              <w:spacing w:line="280" w:lineRule="auto"/>
+              <w:jc w:val="center"/>
+            </w:pPr>
+            <w:r>
+              <w:rPr>
+                <w:rFonts w:ascii="바탕" w:cs="바탕" w:eastAsia="바탕" w:hAnsi="바탕"/>
+                <w:sz w:val="19"/>
+                <w:szCs w:val="19"/>
+              </w:rPr>
+              <w:t xml:space="preserve">이전 버전: 통상업무</w:t>
+            </w:r>
+          </w:p>
+        </w:tc>
+        <w:tc>
+          <w:tcPr>
+            <w:tcW w:type="dxa" w:w="5538"/>
+            <w:tcBorders>
+              <w:top w:val="single" w:color="000000" w:sz="4"/>
+              <w:left w:val="single" w:color="000000" w:sz="4"/>
+              <w:bottom w:val="single" w:color="000000" w:sz="4"/>
+              <w:right w:val="single" w:color="000000" w:sz="4"/>
+            </w:tcBorders>
+            <w:tcMar>
+              <w:top w:type="dxa" w:w="60"/>
+              <w:left w:type="dxa" w:w="80"/>
+              <w:bottom w:type="dxa" w:w="60"/>
+              <w:right w:type="dxa" w:w="80"/>
+            </w:tcMar>
+            <w:vAlign w:val="center"/>
+          </w:tcPr>
+          <w:p>
+            <w:pPr>
+              <w:spacing w:line="280" w:lineRule="auto"/>
+              <w:jc w:val="left"/>
+            </w:pPr>
+            <w:r>
+              <w:rPr>
+                <w:rFonts w:ascii="바탕" w:cs="바탕" w:eastAsia="바탕" w:hAnsi="바탕"/>
+                <w:sz w:val="19"/>
+                <w:szCs w:val="19"/>
+              </w:rPr>
+              <w:t xml:space="preserve">오전 국군수도병원 위문, 오후 울산 진수식으로 정정</w:t>
+            </w:r>
+          </w:p>
+        </w:tc>
+      </w:tr>
+      <w:tr>
+        <w:trPr>
+          <w:cantSplit/>
+        </w:trPr>
+        <w:tc>
+          <w:tcPr>
+            <w:tcW w:type="dxa" w:w="1800"/>
+            <w:tcBorders>
+              <w:top w:val="single" w:color="000000" w:sz="4"/>
+              <w:left w:val="single" w:color="000000" w:sz="4"/>
+              <w:bottom w:val="single" w:color="000000" w:sz="4"/>
+              <w:right w:val="single" w:color="000000" w:sz="4"/>
+            </w:tcBorders>
+            <w:tcMar>
+              <w:top w:type="dxa" w:w="60"/>
+              <w:left w:type="dxa" w:w="80"/>
+              <w:bottom w:type="dxa" w:w="60"/>
+              <w:right w:type="dxa" w:w="80"/>
+            </w:tcMar>
+            <w:vAlign w:val="center"/>
+          </w:tcPr>
+          <w:p>
+            <w:pPr>
+              <w:spacing w:line="280" w:lineRule="auto"/>
+              <w:jc w:val="center"/>
+            </w:pPr>
+            <w:r>
+              <w:rPr>
+                <w:rFonts w:ascii="바탕" w:cs="바탕" w:eastAsia="바탕" w:hAnsi="바탕"/>
+                <w:sz w:val="19"/>
+                <w:szCs w:val="19"/>
+              </w:rPr>
+              <w:t xml:space="preserve">개의 시각</w:t>
+            </w:r>
+          </w:p>
+        </w:tc>
+        <w:tc>
+          <w:tcPr>
+            <w:tcW w:type="dxa" w:w="2300"/>
+            <w:tcBorders>
+              <w:top w:val="single" w:color="000000" w:sz="4"/>
+              <w:left w:val="single" w:color="000000" w:sz="4"/>
+              <w:bottom w:val="single" w:color="000000" w:sz="4"/>
+              <w:right w:val="single" w:color="000000" w:sz="4"/>
+            </w:tcBorders>
+            <w:tcMar>
+              <w:top w:type="dxa" w:w="60"/>
+              <w:left w:type="dxa" w:w="80"/>
+              <w:bottom w:type="dxa" w:w="60"/>
+              <w:right w:type="dxa" w:w="80"/>
+            </w:tcMar>
+            <w:vAlign w:val="center"/>
+          </w:tcPr>
+          <w:p>
+            <w:pPr>
+              <w:spacing w:line="280" w:lineRule="auto"/>
+              <w:jc w:val="center"/>
+            </w:pPr>
+            <w:r>
+              <w:rPr>
+                <w:rFonts w:ascii="바탕" w:cs="바탕" w:eastAsia="바탕" w:hAnsi="바탕"/>
+                <w:sz w:val="19"/>
+                <w:szCs w:val="19"/>
+              </w:rPr>
+              <w:t xml:space="preserve">이전 버전: 18:00</w:t>
+            </w:r>
+          </w:p>
+        </w:tc>
+        <w:tc>
+          <w:tcPr>
+            <w:tcW w:type="dxa" w:w="5538"/>
+            <w:tcBorders>
+              <w:top w:val="single" w:color="000000" w:sz="4"/>
+              <w:left w:val="single" w:color="000000" w:sz="4"/>
+              <w:bottom w:val="single" w:color="000000" w:sz="4"/>
+              <w:right w:val="single" w:color="000000" w:sz="4"/>
+            </w:tcBorders>
+            <w:tcMar>
+              <w:top w:type="dxa" w:w="60"/>
+              <w:left w:type="dxa" w:w="80"/>
+              <w:bottom w:type="dxa" w:w="60"/>
+              <w:right w:type="dxa" w:w="80"/>
+            </w:tcMar>
+            <w:vAlign w:val="center"/>
+          </w:tcPr>
+          <w:p>
+            <w:pPr>
+              <w:spacing w:line="280" w:lineRule="auto"/>
+              <w:jc w:val="left"/>
+            </w:pPr>
+            <w:r>
+              <w:rPr>
+                <w:rFonts w:ascii="바탕" w:cs="바탕" w:eastAsia="바탕" w:hAnsi="바탕"/>
+                <w:sz w:val="19"/>
+                <w:szCs w:val="19"/>
+              </w:rPr>
+              <w:t xml:space="preserve">18:30으로 조정(귀경·총리 일정 반영)</w:t>
+            </w:r>
+          </w:p>
+        </w:tc>
+      </w:tr>
+      <w:tr>
+        <w:trPr>
+          <w:cantSplit/>
+        </w:trPr>
+        <w:tc>
+          <w:tcPr>
+            <w:tcW w:type="dxa" w:w="1800"/>
+            <w:tcBorders>
+              <w:top w:val="single" w:color="000000" w:sz="4"/>
+              <w:left w:val="single" w:color="000000" w:sz="4"/>
+              <w:bottom w:val="single" w:color="000000" w:sz="4"/>
+              <w:right w:val="single" w:color="000000" w:sz="4"/>
+            </w:tcBorders>
+            <w:tcMar>
+              <w:top w:type="dxa" w:w="60"/>
+              <w:left w:type="dxa" w:w="80"/>
+              <w:bottom w:type="dxa" w:w="60"/>
+              <w:right w:type="dxa" w:w="80"/>
+            </w:tcMar>
+            <w:vAlign w:val="center"/>
+          </w:tcPr>
+          <w:p>
+            <w:pPr>
+              <w:spacing w:line="280" w:lineRule="auto"/>
+              <w:jc w:val="center"/>
+            </w:pPr>
+            <w:r>
+              <w:rPr>
+                <w:rFonts w:ascii="바탕" w:cs="바탕" w:eastAsia="바탕" w:hAnsi="바탕"/>
+                <w:sz w:val="19"/>
+                <w:szCs w:val="19"/>
+              </w:rPr>
               <w:t xml:space="preserve">경제부총리·법무부장관</w:t>
             </w:r>
           </w:p>
@@ -30628,7 +33492,7 @@
                 <w:sz w:val="19"/>
                 <w:szCs w:val="19"/>
               </w:rPr>
-              <w:t xml:space="preserve">이전 버전: 구윤철·정성호</w:t>
+              <w:t xml:space="preserve">이전 버전: 구윤철·정성호(법무 대행 미표기)</w:t>
             </w:r>
           </w:p>
         </w:tc>
@@ -31232,7 +34096,7 @@
                 <w:sz w:val="19"/>
                 <w:szCs w:val="19"/>
               </w:rPr>
-              <w:t xml:space="preserve">회의 개최 자체, 18:00~21:40 시간표, 모든 대사와 의견 대립, 대통령의 질책과 지시, 결정사항, 합참의 경계태세·작전 조정 설명, 플라스틱 지뢰 탐지 한계 설명, 정동영 장관 출장 취지, 비서실장·안보실장 책임 인정 발언, 호르무즈 옵션별 장단점 평가, 법무부 법리 설명, NSC 24시간 소집 기준, 시나리오 가능성 판단</w:t>
+              <w:t xml:space="preserve">회의 개최 자체, 18:30~22:10 시간표, 모든 대사와 의견 대립, 대통령의 질책과 지시, 결정사항, 합참의 경계태세·작전 조정 설명, 플라스틱 지뢰 탐지 한계 설명, 정동영 장관 출장 취지, 비서실장·안보실장 책임 인정 발언, 호르무즈 옵션별 장단점 평가, 법무부 법리 설명, NSC 24시간 소집 기준, 시나리오 가능성 판단</w:t>
             </w:r>
           </w:p>
         </w:tc>
@@ -31943,6 +34807,160 @@
           <w:szCs w:val="17"/>
         </w:rPr>
         <w:t xml:space="preserve">· 주간경향 대통령 발언(책임 있는 사람의 이상한 소리): https://weekly.khan.co.kr/article/202607161556001/</w:t>
+      </w:r>
+    </w:p>
+    <w:p>
+      <w:pPr>
+        <w:spacing w:after="40" w:line="260" w:lineRule="auto"/>
+        <w:ind w:left="200" w:hanging="200"/>
+      </w:pPr>
+      <w:r>
+        <w:rPr>
+          <w:rFonts w:ascii="바탕" w:cs="바탕" w:eastAsia="바탕" w:hAnsi="바탕"/>
+          <w:sz w:val="17"/>
+          <w:szCs w:val="17"/>
+        </w:rPr>
+        <w:t xml:space="preserve">· 뉴스핌 대통령 부상 장병 위문: https://www.newspim.com/news/view/20260930000842</w:t>
+      </w:r>
+    </w:p>
+    <w:p>
+      <w:pPr>
+        <w:spacing w:after="40" w:line="260" w:lineRule="auto"/>
+        <w:ind w:left="200" w:hanging="200"/>
+      </w:pPr>
+      <w:r>
+        <w:rPr>
+          <w:rFonts w:ascii="바탕" w:cs="바탕" w:eastAsia="바탕" w:hAnsi="바탕"/>
+          <w:sz w:val="17"/>
+          <w:szCs w:val="17"/>
+        </w:rPr>
+        <w:t xml:space="preserve">· 경향신문 대통령 부상 장병 “충분한 예우”: https://www.khan.co.kr/article/202609302148025/</w:t>
+      </w:r>
+    </w:p>
+    <w:p>
+      <w:pPr>
+        <w:spacing w:after="40" w:line="260" w:lineRule="auto"/>
+        <w:ind w:left="200" w:hanging="200"/>
+      </w:pPr>
+      <w:r>
+        <w:rPr>
+          <w:rFonts w:ascii="바탕" w:cs="바탕" w:eastAsia="바탕" w:hAnsi="바탕"/>
+          <w:sz w:val="17"/>
+          <w:szCs w:val="17"/>
+        </w:rPr>
+        <w:t xml:space="preserve">· 아시아경제 대호김종서함 진수식 대통령 주관: https://view.asiae.co.kr/article/2026093013150349254</w:t>
+      </w:r>
+    </w:p>
+    <w:p>
+      <w:pPr>
+        <w:spacing w:after="40" w:line="260" w:lineRule="auto"/>
+        <w:ind w:left="200" w:hanging="200"/>
+      </w:pPr>
+      <w:r>
+        <w:rPr>
+          <w:rFonts w:ascii="바탕" w:cs="바탕" w:eastAsia="바탕" w:hAnsi="바탕"/>
+          <w:sz w:val="17"/>
+          <w:szCs w:val="17"/>
+        </w:rPr>
+        <w:t xml:space="preserve">· 뉴스핌 강신철 해작사 점검: https://www.newspim.com/news/view/20260930000919</w:t>
+      </w:r>
+    </w:p>
+    <w:p>
+      <w:pPr>
+        <w:spacing w:after="40" w:line="260" w:lineRule="auto"/>
+        <w:ind w:left="200" w:hanging="200"/>
+      </w:pPr>
+      <w:r>
+        <w:rPr>
+          <w:rFonts w:ascii="바탕" w:cs="바탕" w:eastAsia="바탕" w:hAnsi="바탕"/>
+          <w:sz w:val="17"/>
+          <w:szCs w:val="17"/>
+        </w:rPr>
+        <w:t xml:space="preserve">· 국제뉴스 해작사·청해부대 49진 점검: https://www.gukjenews.com/news/articleView.html?idxno=3709450</w:t>
+      </w:r>
+    </w:p>
+    <w:p>
+      <w:pPr>
+        <w:spacing w:after="40" w:line="260" w:lineRule="auto"/>
+        <w:ind w:left="200" w:hanging="200"/>
+      </w:pPr>
+      <w:r>
+        <w:rPr>
+          <w:rFonts w:ascii="바탕" w:cs="바탕" w:eastAsia="바탕" w:hAnsi="바탕"/>
+          <w:sz w:val="17"/>
+          <w:szCs w:val="17"/>
+        </w:rPr>
+        <w:t xml:space="preserve">· 뉴스핌 확대 거시재정금융간담회: https://www.newspim.com/news/view/20260930000194</w:t>
+      </w:r>
+    </w:p>
+    <w:p>
+      <w:pPr>
+        <w:spacing w:after="40" w:line="260" w:lineRule="auto"/>
+        <w:ind w:left="200" w:hanging="200"/>
+      </w:pPr>
+      <w:r>
+        <w:rPr>
+          <w:rFonts w:ascii="바탕" w:cs="바탕" w:eastAsia="바탕" w:hAnsi="바탕"/>
+          <w:sz w:val="17"/>
+          <w:szCs w:val="17"/>
+        </w:rPr>
+        <w:t xml:space="preserve">· 뉴스핌 과학기술관계장관회의 2차관 참석: https://newspim.com/news/view/20260930000785</w:t>
+      </w:r>
+    </w:p>
+    <w:p>
+      <w:pPr>
+        <w:spacing w:after="40" w:line="260" w:lineRule="auto"/>
+        <w:ind w:left="200" w:hanging="200"/>
+      </w:pPr>
+      <w:r>
+        <w:rPr>
+          <w:rFonts w:ascii="바탕" w:cs="바탕" w:eastAsia="바탕" w:hAnsi="바탕"/>
+          <w:sz w:val="17"/>
+          <w:szCs w:val="17"/>
+        </w:rPr>
+        <w:t xml:space="preserve">· 네이트뉴스 이진수 법무부 장관 직무대행: https://m.news.nate.com/view/20260917n19775</w:t>
+      </w:r>
+    </w:p>
+    <w:p>
+      <w:pPr>
+        <w:spacing w:after="40" w:line="260" w:lineRule="auto"/>
+        <w:ind w:left="200" w:hanging="200"/>
+      </w:pPr>
+      <w:r>
+        <w:rPr>
+          <w:rFonts w:ascii="바탕" w:cs="바탕" w:eastAsia="바탕" w:hAnsi="바탕"/>
+          <w:sz w:val="17"/>
+          <w:szCs w:val="17"/>
+        </w:rPr>
+        <w:t xml:space="preserve">· 파이낸셜뉴스 청와대 “미온적 대응 아니다”: https://www.fnnews.com/news/202609302313083057</w:t>
+      </w:r>
+    </w:p>
+    <w:p>
+      <w:pPr>
+        <w:spacing w:after="40" w:line="260" w:lineRule="auto"/>
+        <w:ind w:left="200" w:hanging="200"/>
+      </w:pPr>
+      <w:r>
+        <w:rPr>
+          <w:rFonts w:ascii="바탕" w:cs="바탕" w:eastAsia="바탕" w:hAnsi="바탕"/>
+          <w:sz w:val="17"/>
+          <w:szCs w:val="17"/>
+        </w:rPr>
+        <w:t xml:space="preserve">· 아시아경제 국군의 날 기념식(10.1): https://view.asiae.co.kr/article/2026100109512898704</w:t>
+      </w:r>
+    </w:p>
+    <w:p>
+      <w:pPr>
+        <w:spacing w:after="40" w:line="260" w:lineRule="auto"/>
+        <w:ind w:left="200" w:hanging="200"/>
+      </w:pPr>
+      <w:r>
+        <w:rPr>
+          <w:rFonts w:ascii="바탕" w:cs="바탕" w:eastAsia="바탕" w:hAnsi="바탕"/>
+          <w:sz w:val="17"/>
+          <w:szCs w:val="17"/>
+        </w:rPr>
+        <w:t xml:space="preserve">· 뉴스핌 NSC 상임위 순연(9.17): https://www.newspim.com/news/view/20260917001012</w:t>
       </w:r>
     </w:p>
     <w:sectPr>

</xml_diff>

<commit_message>
Rewrite presidential remarks in minutes-style narrative (음슴체)
Co-Authored-By: Claude Sonnet 5.5 <noreply@anthropic.com>
Claude-Session: https://claude.ai/code/session_01SU68m6ZzGQrirKhNBvPqFV
</commit_message>
<xml_diff>
--- a/NSC_전체회의_회의록_2026-09-30_시뮬레이션.docx
+++ b/NSC_전체회의_회의록_2026-09-30_시뮬레이션.docx
@@ -5184,11 +5184,7 @@
     </w:p>
     <w:p>
       <w:pPr>
-        <w:pBdr>
-          <w:left w:val="single" w:color="1F2F6B" w:sz="18" w:space="8"/>
-        </w:pBdr>
         <w:spacing w:after="120" w:line="350" w:lineRule="auto"/>
-        <w:ind w:left="200"/>
         <w:jc w:val="both"/>
       </w:pPr>
       <w:r>
@@ -5197,16 +5193,12 @@
           <w:sz w:val="22"/>
           <w:szCs w:val="22"/>
         </w:rPr>
-        <w:t xml:space="preserve">먼저 오늘 오전에 국군수도병원에 가서 다친 장병들과 가족분들을 만나고 왔습니다. 치료와 재활은 물론이고 군 생활을 계속할 수 있도록 충분히 예우하겠다고 약속드렸습니다. 이건 말로 끝나면 안 되는 약속입니다. 국가가 보낸 길에서 다쳤으면 국가가 끝까지 책임지는 게 맞습니다. 치료, 보상, 복귀 지원, 하나도 빠짐없이 챙기세요.</w:t>
-      </w:r>
-    </w:p>
-    <w:p>
-      <w:pPr>
-        <w:pBdr>
-          <w:left w:val="single" w:color="1F2F6B" w:sz="18" w:space="8"/>
-        </w:pBdr>
+        <w:t xml:space="preserve">먼저 오늘 오전 국군수도병원을 방문하여 부상 장병과 가족들을 만나고 왔음. 치료와 재활은 물론 군 생활을 계속할 수 있도록 충분히 예우하겠다고 약속하였음. 이는 말로 끝나서는 안 되는 약속임. 국가가 보낸 길에서 다쳤다면 국가가 끝까지 책임지는 것이 맞음. 치료, 보상, 복귀 지원을 하나도 빠짐없이 챙겨 주시기 바람.</w:t>
+      </w:r>
+    </w:p>
+    <w:p>
+      <w:pPr>
         <w:spacing w:after="120" w:line="350" w:lineRule="auto"/>
-        <w:ind w:left="200"/>
         <w:jc w:val="both"/>
       </w:pPr>
       <w:r>
@@ -5215,16 +5207,12 @@
           <w:sz w:val="22"/>
           <w:szCs w:val="22"/>
         </w:rPr>
-        <w:t xml:space="preserve">그리고 오늘 이 회의를 왜 이제야 열게 됐는지, 그것부터 짚겠습니다. 장병이 지뢰에 크게 다친 지 벌써 9일입니다. 그동안 NSC 전체회의가 한 번도 안 열렸다, 이런 비판이 나오는데, 저는 그 비판이 틀렸다고 말하기 어렵습니다. 제가 순방 중이었다는 건 변명이 안 됩니다. 대통령이 자리를 비웠다고 안보 컨트롤타워가 멈춰 서 있으면 그게 무슨 컨트롤타워입니까? 책임은 일차적으로 저한테 있고, 그다음이 이 자리에 앉아 계신 분들입니다.</w:t>
-      </w:r>
-    </w:p>
-    <w:p>
-      <w:pPr>
-        <w:pBdr>
-          <w:left w:val="single" w:color="1F2F6B" w:sz="18" w:space="8"/>
-        </w:pBdr>
+        <w:t xml:space="preserve">또한 이 회의가 왜 이제야 열리게 되었는지부터 짚고자 함. 장병이 지뢰에 크게 다친 지 벌써 9일이 지났음. 그동안 NSC 전체회의가 한 번도 열리지 않았다는 비판이 나오고 있는데, 그 비판이 틀렸다고 말하기 어려움. 순방 중이었다는 것은 변명이 되지 않음. 대통령이 자리를 비웠다고 안보 컨트롤타워가 멈춰 있다면 그것이 무슨 컨트롤타워인지? 책임은 일차적으로 대통령에게 있고, 그다음이 이 자리에 있는 참석자들임.</w:t>
+      </w:r>
+    </w:p>
+    <w:p>
+      <w:pPr>
         <w:spacing w:after="120" w:line="350" w:lineRule="auto"/>
-        <w:ind w:left="200"/>
         <w:jc w:val="both"/>
       </w:pPr>
       <w:r>
@@ -5233,16 +5221,12 @@
           <w:sz w:val="22"/>
           <w:szCs w:val="22"/>
         </w:rPr>
-        <w:t xml:space="preserve">오후에는 울산에서 이지스구축함 진수식에 갔습니다. 거기서 자주국방은 곧 주권이라고 말씀드렸는데, 우리 DMZ 안에 북한 지뢰가 1년 넘게 있었다는 걸 확인하고 나니 그 말이 참 무겁게 들립니다. 남의 힘에 기대지 않고 스스로 지킬 수 있어야 한다면서, 정작 우리 장병이 다니는 길 하나를 못 지켰다는 겁니다.</w:t>
-      </w:r>
-    </w:p>
-    <w:p>
-      <w:pPr>
-        <w:pBdr>
-          <w:left w:val="single" w:color="1F2F6B" w:sz="18" w:space="8"/>
-        </w:pBdr>
+        <w:t xml:space="preserve">오후에는 울산에서 이지스구축함 진수식에 참석하였음. 그 자리에서 자주국방은 곧 주권이라고 말하였는데, 우리 DMZ 안에 북한 지뢰가 1년 넘게 있었다는 사실을 확인하고 나니 그 말이 무겁게 느껴짐. 남의 힘에 기대지 않고 스스로 지킬 수 있어야 한다면서, 정작 우리 장병이 다니는 길 하나를 지키지 못한 것임.</w:t>
+      </w:r>
+    </w:p>
+    <w:p>
+      <w:pPr>
         <w:spacing w:after="120" w:line="350" w:lineRule="auto"/>
-        <w:ind w:left="200"/>
         <w:jc w:val="both"/>
       </w:pPr>
       <w:r>
@@ -5251,16 +5235,12 @@
           <w:sz w:val="22"/>
           <w:szCs w:val="22"/>
         </w:rPr>
-        <w:t xml:space="preserve">어제 국무회의에서도 말씀드렸지만, 사실관계가 확인되면 필요한 조치를 하겠다는 게 정부 입장이었습니다. 오늘 유엔사가 정전협정 위반을 공식 발표했고 합참도 북한에 사과를 요구했습니다. 사실이 확인된 겁니다. 그러면 이제 말이 아니라 행동으로 보여드려야 합니다.</w:t>
-      </w:r>
-    </w:p>
-    <w:p>
-      <w:pPr>
-        <w:pBdr>
-          <w:left w:val="single" w:color="1F2F6B" w:sz="18" w:space="8"/>
-        </w:pBdr>
+        <w:t xml:space="preserve">어제 국무회의에서 밝혔듯이 사실관계가 확인되면 필요한 조치를 하겠다는 것이 정부 입장이었음. 오늘 유엔사가 정전협정 위반을 공식 발표하였고 합참도 북한에 사과를 요구하였음. 사실이 확인된 것임. 이제는 말이 아니라 행동으로 보여야 함.</w:t>
+      </w:r>
+    </w:p>
+    <w:p>
+      <w:pPr>
         <w:spacing w:after="120" w:line="350" w:lineRule="auto"/>
-        <w:ind w:left="200"/>
         <w:jc w:val="both"/>
       </w:pPr>
       <w:r>
@@ -5269,16 +5249,12 @@
           <w:sz w:val="22"/>
           <w:szCs w:val="22"/>
         </w:rPr>
-        <w:t xml:space="preserve">오늘 아침에는 김여정 총무부장이 담화를 냈습니다. 자작극이라고 합니다. 우리 장병이 크게 다쳤는데 자작극이라니, 이게 사람이 할 소리입니까? 이 부분은 국민도 분노하실 일입니다. 다만 우리가 분노만 하고 있을 수는 없습니다. 분노하되 감정적으로 대응하지는 마십시오. 감정으로 움직이면 지는 겁니다. 냉정하고 단호하게, 필요한 만큼 정확하게 대응하는 게 국익에 맞습니다.</w:t>
-      </w:r>
-    </w:p>
-    <w:p>
-      <w:pPr>
-        <w:pBdr>
-          <w:left w:val="single" w:color="1F2F6B" w:sz="18" w:space="8"/>
-        </w:pBdr>
+        <w:t xml:space="preserve">오늘 아침 김여정 총무부장이 담화를 통해 자작극이라고 주장하였음. 우리 장병이 크게 다쳤는데 자작극이라고 하는 것은 사람으로서 할 소리가 아님. 국민도 분노할 일임. 다만 분노만 하고 있을 수는 없음. 분노하되 감정적으로 대응하지 않기 바람. 감정으로 움직이면 지게 되어 있음. 냉정하고 단호하게, 필요한 만큼 정확하게 대응하는 것이 국익에 부합함.</w:t>
+      </w:r>
+    </w:p>
+    <w:p>
+      <w:pPr>
         <w:spacing w:after="120" w:line="350" w:lineRule="auto"/>
-        <w:ind w:left="200"/>
         <w:jc w:val="both"/>
       </w:pPr>
       <w:r>
@@ -5287,16 +5263,12 @@
           <w:sz w:val="22"/>
           <w:szCs w:val="22"/>
         </w:rPr>
-        <w:t xml:space="preserve">오늘 다룰 것은 여섯 가지입니다. 지뢰와 김여정 담화, 북한군 포로 문제, 호르무즈, 미중 정상회담 이후 정세와 동맹 현안, 금융시장과 공급망, 그리고 국회와 국민에 대한 설명입니다. 하나같이 어느 한쪽만 보고 결정할 수 있는 문제가 아닙니다.</w:t>
-      </w:r>
-    </w:p>
-    <w:p>
-      <w:pPr>
-        <w:pBdr>
-          <w:left w:val="single" w:color="1F2F6B" w:sz="18" w:space="8"/>
-        </w:pBdr>
+        <w:t xml:space="preserve">오늘 다룰 사안은 여섯 가지임. 지뢰와 김여정 담화, 북한군 포로 문제, 호르무즈, 미중 정상회담 이후 정세와 동맹 현안, 금융시장과 공급망, 국회와 국민에 대한 설명임. 어느 하나 한쪽만 보고 결정할 수 있는 문제가 아님.</w:t>
+      </w:r>
+    </w:p>
+    <w:p>
+      <w:pPr>
         <w:spacing w:after="120" w:line="350" w:lineRule="auto"/>
-        <w:ind w:left="200"/>
         <w:jc w:val="both"/>
       </w:pPr>
       <w:r>
@@ -5305,7 +5277,7 @@
           <w:sz w:val="22"/>
           <w:szCs w:val="22"/>
         </w:rPr>
-        <w:t xml:space="preserve">당부 하나 드리겠습니다. 오늘 회의에서는 보기 좋은 말 하지 마십시오. 부처 입장 방어하는 데 시간 쓰지 마시고, 모르는 건 모른다고 하고, 잘못한 건 잘못했다고 하고, 대안이 있으면 대안을 말씀해 주세요. 지지부진하게 미루는 건 안 하는 거랑 똑같습니다. 안보에는 여야가 따로 없고, 대통령과 장관 사이에도 눈치 볼 일이 없습니다. 그럼 사실관계부터 보고받겠습니다.</w:t>
+        <w:t xml:space="preserve">당부 사항이 있음. 오늘 회의에서는 보기 좋은 말을 하지 말기 바람. 부처 입장을 방어하는 데 시간을 쓰지 말고, 모르는 것은 모른다고 하고, 잘못한 것은 잘못했다고 하고, 대안이 있으면 대안을 말하기 바람. 지지부진하게 미루는 것은 안 하는 것과 같음. 안보에는 여야가 따로 없고, 대통령과 장관 사이에도 눈치 볼 일이 없음. 사실관계부터 보고받겠음.</w:t>
       </w:r>
     </w:p>
     <w:p>
@@ -6228,11 +6200,7 @@
     </w:p>
     <w:p>
       <w:pPr>
-        <w:pBdr>
-          <w:left w:val="single" w:color="1F2F6B" w:sz="18" w:space="8"/>
-        </w:pBdr>
         <w:spacing w:after="120" w:line="350" w:lineRule="auto"/>
-        <w:ind w:left="200"/>
         <w:jc w:val="both"/>
       </w:pPr>
       <w:r>
@@ -6241,7 +6209,7 @@
           <w:sz w:val="22"/>
           <w:szCs w:val="22"/>
         </w:rPr>
-        <w:t xml:space="preserve">방금 보고에서 대통령이 순방 떠난 날 사고가 났고, 그 주 내내 NSC가 열리지 않았다는 얘기가 그대로 들어 있네요. 나중에 따로 따지겠습니다. 국방부장관, 사고 내용부터 보고하세요.</w:t>
+        <w:t xml:space="preserve">방금 보고에서 대통령이 순방을 떠난 날 사고가 났고 그 주 내내 NSC가 열리지 않았다는 내용이 그대로 확인됨. 이 부분은 나중에 따로 따지겠음. 국방부장관은 사고 내용부터 보고하기 바람.</w:t>
       </w:r>
     </w:p>
     <w:p>
@@ -6851,11 +6819,7 @@
     </w:p>
     <w:p>
       <w:pPr>
-        <w:pBdr>
-          <w:left w:val="single" w:color="1F2F6B" w:sz="18" w:space="8"/>
-        </w:pBdr>
         <w:spacing w:after="120" w:line="350" w:lineRule="auto"/>
-        <w:ind w:left="200"/>
         <w:jc w:val="both"/>
       </w:pPr>
       <w:r>
@@ -6864,7 +6828,7 @@
           <w:sz w:val="22"/>
           <w:szCs w:val="22"/>
         </w:rPr>
-        <w:t xml:space="preserve">잠깐 정리하겠습니다. 지난해 9월 이전에 묻은 지뢰라고 하셨죠. 그러면 1년이 넘게 우리 DMZ 안에 북한 지뢰가 있었다는 얘기입니다. 그 길로 우리 장병들이 그동안 몇 번을 오갔습니까? 그걸 지금까지 몰랐다는 겁니까, 알면서 방치했다는 겁니까? 어느 쪽이든 심각한 문제인데, 군에서는 이걸 어떻게 인식하고 있습니까?</w:t>
+        <w:t xml:space="preserve">정리하겠음. 지난해 9월 이전에 매설된 것으로 추정한다고 하였는데, 그렇다면 1년이 넘게 우리 DMZ 안에 북한 지뢰가 있었다는 것임. 그 길을 우리 장병들이 그동안 몇 번이나 오갔는지? 지금까지 몰랐던 것인지, 알면서 방치한 것인지? 어느 쪽이든 심각한 문제인데 군은 이를 어떻게 인식하고 있는지?</w:t>
       </w:r>
     </w:p>
     <w:p>
@@ -6911,11 +6875,7 @@
     </w:p>
     <w:p>
       <w:pPr>
-        <w:pBdr>
-          <w:left w:val="single" w:color="1F2F6B" w:sz="18" w:space="8"/>
-        </w:pBdr>
         <w:spacing w:after="120" w:line="350" w:lineRule="auto"/>
-        <w:ind w:left="200"/>
         <w:jc w:val="both"/>
       </w:pPr>
       <w:r>
@@ -6924,7 +6884,7 @@
           <w:sz w:val="22"/>
           <w:szCs w:val="22"/>
         </w:rPr>
-        <w:t xml:space="preserve">감찰만 하고 끝낼 겁니까? 감찰 결과에 따라 지휘 책임이 있으면 엄정하게 물으세요. 장병이 다쳤는데 책임지는 사람이 아무도 없다, 그건 안 됩니다. 신상필벌은 군이라고 예외가 아닙니다. 그리고 지금 말씀하신 걸 보고서에 쓰세요. 나중에 말이 달라지지 않게.</w:t>
+        <w:t xml:space="preserve">감찰만 하고 끝낼 것인지? 감찰 결과 지휘 책임이 있으면 엄정하게 묻기 바람. 장병이 다쳤는데 책임지는 사람이 아무도 없다는 것은 안 됨. 신상필벌은 군도 예외가 아님. 그리고 방금 보고한 내용은 보고서에 그대로 기재하기 바람. 나중에 말이 달라지지 않도록 하기 바람.</w:t>
       </w:r>
     </w:p>
     <w:p>
@@ -7057,11 +7017,7 @@
     </w:p>
     <w:p>
       <w:pPr>
-        <w:pBdr>
-          <w:left w:val="single" w:color="1F2F6B" w:sz="18" w:space="8"/>
-        </w:pBdr>
         <w:spacing w:after="120" w:line="350" w:lineRule="auto"/>
-        <w:ind w:left="200"/>
         <w:jc w:val="both"/>
       </w:pPr>
       <w:r>
@@ -7070,7 +7026,7 @@
           <w:sz w:val="22"/>
           <w:szCs w:val="22"/>
         </w:rPr>
-        <w:t xml:space="preserve">작전본부장, 하나만 묻겠습니다. 이번에 장병들이 수색로 개척 작전을 나갔다가 당했는데, 그 작전을 그 시점에 하기로 한 건 누가 결정했습니까? 그리고 사전에 지뢰 탐지는 어떻게 했습니까? 탐지 장비는 있었습니까, 없었습니까?</w:t>
+        <w:t xml:space="preserve">작전본부장에게 하나 묻겠음. 이번에 장병들이 수색로 개척 작전을 나갔다가 당하였는데, 그 작전을 그 시점에 하기로 한 것은 누가 결정하였는지? 사전 지뢰 탐지는 어떻게 하였는지? 탐지 장비는 있었는지, 없었는지?</w:t>
       </w:r>
     </w:p>
     <w:p>
@@ -7117,11 +7073,7 @@
     </w:p>
     <w:p>
       <w:pPr>
-        <w:pBdr>
-          <w:left w:val="single" w:color="1F2F6B" w:sz="18" w:space="8"/>
-        </w:pBdr>
         <w:spacing w:after="120" w:line="350" w:lineRule="auto"/>
-        <w:ind w:left="200"/>
         <w:jc w:val="both"/>
       </w:pPr>
       <w:r>
@@ -7130,7 +7082,7 @@
           <w:sz w:val="22"/>
           <w:szCs w:val="22"/>
         </w:rPr>
-        <w:t xml:space="preserve">한계가 있었다, 장비가 부족했다. 그런 얘기는 사고가 나기 전에 했어야죠. 사고 나고 나서 한계가 있었다고 하면 그건 변명으로 들립니다. 장비 요청이 올라온 적이 있었는지, 올라왔는데 묵살됐는지, 그것도 같이 확인해서 보고하세요. 장병이 위험한 임무를 나가는데 제대로 된 장비를 안 쥐여주는 게 말이 됩니까?</w:t>
+        <w:t xml:space="preserve">한계가 있었다, 장비가 부족했다는 말은 사고가 나기 전에 했어야 함. 사고 후에 한계가 있었다고 하면 변명으로 들림. 장비 요청이 올라온 적이 있는지, 올라왔다면 묵살된 것은 아닌지도 함께 확인하여 보고하기 바람. 장병이 위험한 임무에 나가는데 제대로 된 장비를 쥐여주지 않는 것이 말이 되는 일인지?</w:t>
       </w:r>
     </w:p>
     <w:p>
@@ -7263,11 +7215,7 @@
     </w:p>
     <w:p>
       <w:pPr>
-        <w:pBdr>
-          <w:left w:val="single" w:color="1F2F6B" w:sz="18" w:space="8"/>
-        </w:pBdr>
         <w:spacing w:after="120" w:line="350" w:lineRule="auto"/>
-        <w:ind w:left="200"/>
         <w:jc w:val="both"/>
       </w:pPr>
       <w:r>
@@ -7276,7 +7224,7 @@
           <w:sz w:val="22"/>
           <w:szCs w:val="22"/>
         </w:rPr>
-        <w:t xml:space="preserve">국정원장님, “로우키”라는 표현이 신문에 나왔더군요. 정보기관이 현 상황을 로우키로 평가했다는 거죠? 그런데 우리 장병이 지뢰에 크게 다쳤고, 북한은 자작극이라고 하면서 실사격하면 보복하겠다고 합니다. 이게 국민 눈높이에서 로우키입니까? 정보 평가는 평가대로 하더라도, 대외적으로 그렇게 표현할 때는 신중해야 하는 것 아닙니까? 위기를 축소한다는 비판이 바로 나오지 않습니까?</w:t>
+        <w:t xml:space="preserve">국정원장에게 확인하겠음. 정보기관이 현 상황을 “로우키”로 평가하였다는 내용이 언론에 나왔는데 사실인지? 우리 장병이 지뢰에 크게 다쳤고 북한은 자작극이라고 하면서 실사격하면 보복하겠다고 하고 있음. 이것이 국민 눈높이에서 로우키로 받아들여지는지? 정보 평가는 평가대로 하더라도 대외적으로 그렇게 표현할 때에는 신중해야 하는 것 아닌지? 위기를 축소한다는 비판이 바로 나오지 않겠는지?</w:t>
       </w:r>
     </w:p>
     <w:p>
@@ -7323,11 +7271,7 @@
     </w:p>
     <w:p>
       <w:pPr>
-        <w:pBdr>
-          <w:left w:val="single" w:color="1F2F6B" w:sz="18" w:space="8"/>
-        </w:pBdr>
         <w:spacing w:after="120" w:line="350" w:lineRule="auto"/>
-        <w:ind w:left="200"/>
         <w:jc w:val="both"/>
       </w:pPr>
       <w:r>
@@ -7336,7 +7280,7 @@
           <w:sz w:val="22"/>
           <w:szCs w:val="22"/>
         </w:rPr>
-        <w:t xml:space="preserve">설명 방식이 문제가 아니라 정보 판단이 정확하냐의 문제입니다. 로우키라고 보고 방심했다가 다음에 더 큰 게 오면 그때는 어떻게 책임질 겁니까? 평가는 정확해야 하고, 국민에게 전달될 때는 오해가 없어야 합니다. 이 부분 분명히 하세요.</w:t>
+        <w:t xml:space="preserve">설명 방식의 문제가 아니라 정보 판단이 정확한가의 문제임. 로우키라고 보고 방심했다가 다음에 더 큰 일이 오면 누가 책임질 것인지? 평가는 정확해야 하고, 국민에게 전달될 때에는 오해가 없어야 함. 이 부분을 분명히 하기 바람.</w:t>
       </w:r>
     </w:p>
     <w:p>
@@ -7383,11 +7327,7 @@
     </w:p>
     <w:p>
       <w:pPr>
-        <w:pBdr>
-          <w:left w:val="single" w:color="1F2F6B" w:sz="18" w:space="8"/>
-        </w:pBdr>
         <w:spacing w:after="120" w:line="350" w:lineRule="auto"/>
-        <w:ind w:left="200"/>
         <w:jc w:val="both"/>
       </w:pPr>
       <w:r>
@@ -7396,7 +7336,7 @@
           <w:sz w:val="22"/>
           <w:szCs w:val="22"/>
         </w:rPr>
-        <w:t xml:space="preserve">안보실장님, NSC가 안 열린 경위를 설명해 주시기 바랍니다.</w:t>
+        <w:t xml:space="preserve">안보실장은 NSC가 열리지 않은 경위를 설명하기 바람.</w:t>
       </w:r>
     </w:p>
     <w:p>
@@ -7443,11 +7383,7 @@
     </w:p>
     <w:p>
       <w:pPr>
-        <w:pBdr>
-          <w:left w:val="single" w:color="1F2F6B" w:sz="18" w:space="8"/>
-        </w:pBdr>
         <w:spacing w:after="120" w:line="350" w:lineRule="auto"/>
-        <w:ind w:left="200"/>
         <w:jc w:val="both"/>
       </w:pPr>
       <w:r>
@@ -7456,7 +7392,7 @@
           <w:sz w:val="22"/>
           <w:szCs w:val="22"/>
         </w:rPr>
-        <w:t xml:space="preserve">사실관계가 확정되기 전이라서 안 열었다. 그러면 확정되면 열 생각이었다는 거죠. 사실관계를 확정하기 위해서 모이는 게 NSC 아닙니까? 안보실이 건의했어야죠. 안보실이 대통령이 순방 중이라고 위축돼서 손 놓고 있었다면, 안보실의 존재 이유가 뭡니까? 건의했는데 제가 안 받아들인 것도 아니고요. 다시 한번 묻겠습니다. 이건 판단 착오입니까, 아니면 안일함입니까?</w:t>
+        <w:t xml:space="preserve">사실관계가 확정되기 전이라 열지 않았다는 것은, 확정되면 열 생각이었다는 것인지? 사실관계를 확정하기 위해 모이는 것이 NSC 아닌지? 안보실이 건의했어야 함. 대통령이 순방 중이라고 위축되어 손을 놓고 있었다면 안보실의 존재 이유가 무엇인지? 건의하였는데 대통령이 받아들이지 않은 것도 아님. 다시 묻겠음. 이것은 판단 착오인지, 안일함인지?</w:t>
       </w:r>
     </w:p>
     <w:p>
@@ -7503,11 +7439,7 @@
     </w:p>
     <w:p>
       <w:pPr>
-        <w:pBdr>
-          <w:left w:val="single" w:color="1F2F6B" w:sz="18" w:space="8"/>
-        </w:pBdr>
         <w:spacing w:after="120" w:line="350" w:lineRule="auto"/>
-        <w:ind w:left="200"/>
         <w:jc w:val="both"/>
       </w:pPr>
       <w:r>
@@ -7516,7 +7448,7 @@
           <w:sz w:val="22"/>
           <w:szCs w:val="22"/>
         </w:rPr>
-        <w:t xml:space="preserve">그렇게 얘기하시니 더 이상은 묻지 않겠습니다. 다만 앞으로는 인명 피해가 나는 북한 관련 사건은 사실 확인 중이어도 바로 소집하세요. 이 건은 나중에 소집 기준을 만들어서 보고해 주시고요.</w:t>
+        <w:t xml:space="preserve">그렇게 답변하니 더 이상 묻지 않겠음. 다만 앞으로 인명 피해가 나는 북한 관련 사건은 사실 확인 중이라도 바로 소집하기 바람. 소집 기준은 만들어서 보고하기 바람.</w:t>
       </w:r>
     </w:p>
     <w:p>
@@ -7563,11 +7495,7 @@
     </w:p>
     <w:p>
       <w:pPr>
-        <w:pBdr>
-          <w:left w:val="single" w:color="1F2F6B" w:sz="18" w:space="8"/>
-        </w:pBdr>
         <w:spacing w:after="120" w:line="350" w:lineRule="auto"/>
-        <w:ind w:left="200"/>
         <w:jc w:val="both"/>
       </w:pPr>
       <w:r>
@@ -7576,7 +7504,7 @@
           <w:sz w:val="22"/>
           <w:szCs w:val="22"/>
         </w:rPr>
-        <w:t xml:space="preserve">통일부장관님, 질책부터 하겠습니다. 장병이 지뢰에 다치고 대통령이 해외 순방을 다녀온 지 하루 만에 통일부장관이 또 유럽으로 나갔습니다. 야당이 외유라고 공격하는 걸 정당하다고 하지는 않겠습니다. 다만 국민 눈에 어떻게 비치겠습니까? 통일부가 이 상황에서 할 일이 해외에 있었습니까? 그리고 오늘 외통위에는 왜 안 갔습니까? 국회가 부르면 가는 겁니다. 정부가 국회를 무시한다는 소리 들으면 정작 해야 할 말도 신뢰를 잃습니다.</w:t>
+        <w:t xml:space="preserve">통일부장관에게 질책부터 하겠음. 장병이 지뢰에 다치고 대통령이 해외 순방에서 돌아온 지 하루 만에 통일부장관이 다시 유럽으로 나갔음. 야당이 외유라고 공격하는 것을 정당하다고 하지는 않겠음. 다만 국민 눈에 어떻게 비치겠는지? 이 상황에서 통일부가 할 일이 해외에 있었는지? 그리고 오늘 외통위에는 왜 출석하지 않았는지? 국회가 부르면 가는 것이 맞음. 정부가 국회를 무시한다는 말이 나오면 정작 해야 할 말도 신뢰를 잃게 됨.</w:t>
       </w:r>
     </w:p>
     <w:p>
@@ -7623,11 +7551,7 @@
     </w:p>
     <w:p>
       <w:pPr>
-        <w:pBdr>
-          <w:left w:val="single" w:color="1F2F6B" w:sz="18" w:space="8"/>
-        </w:pBdr>
         <w:spacing w:after="120" w:line="350" w:lineRule="auto"/>
-        <w:ind w:left="200"/>
         <w:jc w:val="both"/>
       </w:pPr>
       <w:r>
@@ -7636,7 +7560,7 @@
           <w:sz w:val="22"/>
           <w:szCs w:val="22"/>
         </w:rPr>
-        <w:t xml:space="preserve">판단이 부족했다고 하셨으니 그 말을 기억하겠습니다. 단축을 검토할 단계가 아닙니다. 아일랜드, 독일 일정은 취소하고 내일 들어오세요. 들어오는 즉시 국회에 가서 설명하시고요. 그리고 장관님, 평화 얘기하는 건 좋은데, 평화공존이 구호가 돼서는 안 됩니다. 국민의 안전이 담보되지 않는 평화는 평화가 아닙니다. 그 점은 장관님도 동의하시죠?</w:t>
+        <w:t xml:space="preserve">판단이 부족했다고 하였으니 그 말을 기억하겠음. 단축을 검토할 단계가 아님. 아일랜드와 독일 일정은 취소하고 내일 귀국하기 바람. 귀국 즉시 국회에 가서 설명하기 바람. 또한 평화를 말하는 것은 좋으나 평화공존이 구호가 되어서는 안 됨. 국민의 안전이 담보되지 않는 평화는 평화가 아님. 이 점은 통일부장관도 동의하는지?</w:t>
       </w:r>
     </w:p>
     <w:p>
@@ -7862,11 +7786,7 @@
     </w:p>
     <w:p>
       <w:pPr>
-        <w:pBdr>
-          <w:left w:val="single" w:color="1F2F6B" w:sz="18" w:space="8"/>
-        </w:pBdr>
         <w:spacing w:after="120" w:line="350" w:lineRule="auto"/>
-        <w:ind w:left="200"/>
         <w:jc w:val="both"/>
       </w:pPr>
       <w:r>
@@ -7875,7 +7795,7 @@
           <w:sz w:val="22"/>
           <w:szCs w:val="22"/>
         </w:rPr>
-        <w:t xml:space="preserve">북측이 서한을 받지 않으면 어떻게 됩니까? 받지도 않을 서한을 보내는 게 무슨 의미가 있습니까? 그리고 사과를 요구하는 건 좋은데, 사과를 안 하면 그다음은 뭡니까? 요구만 하고 끝나면 우리가 손에 쥐는 게 없잖아요.</w:t>
+        <w:t xml:space="preserve">북측이 서한을 받지 않으면 어떻게 되는지? 받지도 않을 서한을 보내는 것이 무슨 의미가 있는지? 또한 사과를 요구하는 것은 좋으나 사과를 하지 않으면 그다음은 무엇인지? 요구만 하고 끝나면 우리가 손에 쥐는 것이 없음.</w:t>
       </w:r>
     </w:p>
     <w:p>
@@ -7964,11 +7884,7 @@
     </w:p>
     <w:p>
       <w:pPr>
-        <w:pBdr>
-          <w:left w:val="single" w:color="1F2F6B" w:sz="18" w:space="8"/>
-        </w:pBdr>
         <w:spacing w:after="120" w:line="350" w:lineRule="auto"/>
-        <w:ind w:left="200"/>
         <w:jc w:val="both"/>
       </w:pPr>
       <w:r>
@@ -7977,7 +7893,7 @@
           <w:sz w:val="22"/>
           <w:szCs w:val="22"/>
         </w:rPr>
-        <w:t xml:space="preserve">그렇죠. 그게 맞는 얘기입니다. 사과 안 한다고 손 놓고 있으면 안 되고, 안 할 거라는 걸 전제로 다음 수를 미리 준비하세요. 외교부는 말이 아니라 결과를 가져와야 합니다.</w:t>
+        <w:t xml:space="preserve">그것이 맞는 말임. 사과를 하지 않는다고 손을 놓고 있어서는 안 되고, 하지 않을 것을 전제로 다음 수를 미리 준비하기 바람. 외교부는 말이 아니라 결과를 가져와야 함.</w:t>
       </w:r>
     </w:p>
     <w:p>
@@ -8635,11 +8551,7 @@
     </w:p>
     <w:p>
       <w:pPr>
-        <w:pBdr>
-          <w:left w:val="single" w:color="1F2F6B" w:sz="18" w:space="8"/>
-        </w:pBdr>
         <w:spacing w:after="120" w:line="350" w:lineRule="auto"/>
-        <w:ind w:left="200"/>
         <w:jc w:val="both"/>
       </w:pPr>
       <w:r>
@@ -8648,7 +8560,7 @@
           <w:sz w:val="22"/>
           <w:szCs w:val="22"/>
         </w:rPr>
-        <w:t xml:space="preserve">국방부장관 의견부터 듣겠습니다.</w:t>
+        <w:t xml:space="preserve">국방부장관 의견부터 듣겠음.</w:t>
       </w:r>
     </w:p>
     <w:p>
@@ -8710,11 +8622,7 @@
     </w:p>
     <w:p>
       <w:pPr>
-        <w:pBdr>
-          <w:left w:val="single" w:color="1F2F6B" w:sz="18" w:space="8"/>
-        </w:pBdr>
         <w:spacing w:after="120" w:line="350" w:lineRule="auto"/>
-        <w:ind w:left="200"/>
         <w:jc w:val="both"/>
       </w:pPr>
       <w:r>
@@ -8723,7 +8631,7 @@
           <w:sz w:val="22"/>
           <w:szCs w:val="22"/>
         </w:rPr>
-        <w:t xml:space="preserve">통일부장관 의견은요?</w:t>
+        <w:t xml:space="preserve">통일부장관 의견은?</w:t>
       </w:r>
     </w:p>
     <w:p>
@@ -8869,11 +8777,7 @@
     </w:p>
     <w:p>
       <w:pPr>
-        <w:pBdr>
-          <w:left w:val="single" w:color="1F2F6B" w:sz="18" w:space="8"/>
-        </w:pBdr>
         <w:spacing w:after="120" w:line="350" w:lineRule="auto"/>
-        <w:ind w:left="200"/>
         <w:jc w:val="both"/>
       </w:pPr>
       <w:r>
@@ -8882,7 +8786,7 @@
           <w:sz w:val="22"/>
           <w:szCs w:val="22"/>
         </w:rPr>
-        <w:t xml:space="preserve">두 분 다 주장은 알겠는데, 서로 상대방이 틀렸다고만 하시니 대통령이 판단할 수가 없습니다. 장관 두 분께 요구하겠습니다. 국방부장관은 “방송을 켜면 무슨 효과가 있느냐”를, 통일부장관은 “방송을 안 켜면 우리가 대신 무엇을 하겠다”를 구체적으로 말씀하세요. 막연하게 안 된다, 해야 된다, 그건 토론이 아닙니다.</w:t>
+        <w:t xml:space="preserve">두 장관 모두 주장은 알겠으나 서로 상대방이 틀렸다고만 하면 대통령이 판단할 수 없음. 국방부장관은 “방송을 켜면 무슨 효과가 있는지”를, 통일부장관은 “방송을 켜지 않으면 대신 무엇을 하겠는지”를 구체적으로 말하기 바람. 막연히 안 된다, 해야 한다는 식은 토론이 아님.</w:t>
       </w:r>
     </w:p>
     <w:p>
@@ -8971,11 +8875,7 @@
     </w:p>
     <w:p>
       <w:pPr>
-        <w:pBdr>
-          <w:left w:val="single" w:color="1F2F6B" w:sz="18" w:space="8"/>
-        </w:pBdr>
         <w:spacing w:after="120" w:line="350" w:lineRule="auto"/>
-        <w:ind w:left="200"/>
         <w:jc w:val="both"/>
       </w:pPr>
       <w:r>
@@ -8984,7 +8884,7 @@
           <w:sz w:val="22"/>
           <w:szCs w:val="22"/>
         </w:rPr>
-        <w:t xml:space="preserve">좋습니다. 이제 토론이 됩니다. 외교부장관 의견은요?</w:t>
+        <w:t xml:space="preserve">좋음. 이제야 토론이 됨. 외교부장관 의견은?</w:t>
       </w:r>
     </w:p>
     <w:p>
@@ -9046,11 +8946,7 @@
     </w:p>
     <w:p>
       <w:pPr>
-        <w:pBdr>
-          <w:left w:val="single" w:color="1F2F6B" w:sz="18" w:space="8"/>
-        </w:pBdr>
         <w:spacing w:after="120" w:line="350" w:lineRule="auto"/>
-        <w:ind w:left="200"/>
         <w:jc w:val="both"/>
       </w:pPr>
       <w:r>
@@ -9059,7 +8955,7 @@
           <w:sz w:val="22"/>
           <w:szCs w:val="22"/>
         </w:rPr>
-        <w:t xml:space="preserve">국정원은 북한이 단계별 조치에 어떻게 반응할 것으로 봅니까? 이번에는 정확하게 판단해 주세요.</w:t>
+        <w:t xml:space="preserve">국정원은 북한이 단계별 조치에 어떻게 반응할 것으로 보는지? 이번에는 정확하게 판단하기 바람.</w:t>
       </w:r>
     </w:p>
     <w:p>
@@ -9147,11 +9043,7 @@
     </w:p>
     <w:p>
       <w:pPr>
-        <w:pBdr>
-          <w:left w:val="single" w:color="1F2F6B" w:sz="18" w:space="8"/>
-        </w:pBdr>
         <w:spacing w:after="120" w:line="350" w:lineRule="auto"/>
-        <w:ind w:left="200"/>
         <w:jc w:val="both"/>
       </w:pPr>
       <w:r>
@@ -9160,7 +9052,7 @@
           <w:sz w:val="22"/>
           <w:szCs w:val="22"/>
         </w:rPr>
-        <w:t xml:space="preserve">제가 올해 1월 신년 기자회견에서 9·19 군사합의를 복원하겠다고 말씀드렸습니다. 확성기와 전단도 작년 6월부터 중단했고요. 그런데 이번 일이 터졌습니다. 야당은 지금 이걸 놓고 대통령의 대북 정책이 실패했다고 합니다. 저는 이걸 회피하지 않겠습니다. 이 기조가 맞는지 틀린지, 이번 사고를 계기로 냉정하게 따져봅시다.</w:t>
+        <w:t xml:space="preserve">올해 1월 신년 기자회견에서 9·19 군사합의를 복원하겠다고 밝혔고, 확성기와 전단도 작년 6월부터 중단해 왔음. 그런데 이번 일이 터졌음. 야당은 이를 두고 대통령의 대북 정책이 실패하였다고 하고 있음. 이 문제를 회피하지 않겠음. 이 기조가 맞는지 틀린지 이번 사고를 계기로 냉정하게 따져 보기로 함.</w:t>
       </w:r>
     </w:p>
     <w:p>
@@ -9333,11 +9225,7 @@
     </w:p>
     <w:p>
       <w:pPr>
-        <w:pBdr>
-          <w:left w:val="single" w:color="1F2F6B" w:sz="18" w:space="8"/>
-        </w:pBdr>
         <w:spacing w:after="120" w:line="350" w:lineRule="auto"/>
-        <w:ind w:left="200"/>
         <w:jc w:val="both"/>
       </w:pPr>
       <w:r>
@@ -9346,7 +9234,7 @@
           <w:sz w:val="22"/>
           <w:szCs w:val="22"/>
         </w:rPr>
-        <w:t xml:space="preserve">두 분 서로 책임 떠넘기는 걸로 들려요. 지금 필요한 건 누구 탓이냐가 아니라 어떻게 고칠 거냐입니다. 안보실장님이 정리해 주세요.</w:t>
+        <w:t xml:space="preserve">두 장관이 서로 책임을 떠넘기는 것으로 들림. 지금 필요한 것은 누구 탓인지가 아니라 어떻게 고칠 것인지임. 안보실장이 정리하기 바람.</w:t>
       </w:r>
     </w:p>
     <w:p>
@@ -9393,11 +9281,7 @@
     </w:p>
     <w:p>
       <w:pPr>
-        <w:pBdr>
-          <w:left w:val="single" w:color="1F2F6B" w:sz="18" w:space="8"/>
-        </w:pBdr>
         <w:spacing w:after="120" w:line="350" w:lineRule="auto"/>
-        <w:ind w:left="200"/>
         <w:jc w:val="both"/>
       </w:pPr>
       <w:r>
@@ -9406,7 +9290,7 @@
           <w:sz w:val="22"/>
           <w:szCs w:val="22"/>
         </w:rPr>
-        <w:t xml:space="preserve">메시지 일원화, 맞습니다. 장관들끼리 다른 말을 하면 국민이 정부를 어떻게 믿겠습니까? 대외적으로는 하나의 목소리여야 합니다. 이견은 이 회의장 안에서 다 털고 나가세요.</w:t>
+        <w:t xml:space="preserve">메시지 일원화가 맞음. 장관들끼리 다른 말을 하면 국민이 정부를 어떻게 믿겠는지? 대외적으로는 하나의 목소리여야 함. 이견은 이 회의장 안에서 모두 털고 나가기 바람.</w:t>
       </w:r>
     </w:p>
     <w:p>
@@ -9493,11 +9377,7 @@
     </w:p>
     <w:p>
       <w:pPr>
-        <w:pBdr>
-          <w:left w:val="single" w:color="1F2F6B" w:sz="18" w:space="8"/>
-        </w:pBdr>
         <w:spacing w:after="120" w:line="350" w:lineRule="auto"/>
-        <w:ind w:left="200"/>
         <w:jc w:val="both"/>
       </w:pPr>
       <w:r>
@@ -9506,7 +9386,7 @@
           <w:sz w:val="22"/>
           <w:szCs w:val="22"/>
         </w:rPr>
-        <w:t xml:space="preserve">필요한 장비와 예산은 숨기지 말고 요청하세요. 나중에 돈이 없어서 못 했다는 얘기가 나오면 그건 장관과 저, 둘 다 문제입니다. 그리고 부상 장병 지원은 보훈부, 국방부 따로 움직이지 말고 한 창구로 하세요. 가족들이 이 부서, 저 부서 돌아다니게 만들면 안 됩니다.</w:t>
+        <w:t xml:space="preserve">필요한 장비와 예산은 숨기지 말고 요청하기 바람. 나중에 돈이 없어서 못 했다는 말이 나오면 장관과 대통령 모두의 문제임. 또한 부상 장병 지원은 보훈부와 국방부가 따로 움직이지 말고 한 창구로 하기 바람. 가족들이 이 부서 저 부서를 돌아다니게 해서는 안 됨.</w:t>
       </w:r>
     </w:p>
     <w:p>
@@ -9621,11 +9501,7 @@
     </w:p>
     <w:p>
       <w:pPr>
-        <w:pBdr>
-          <w:left w:val="single" w:color="1F2F6B" w:sz="18" w:space="8"/>
-        </w:pBdr>
         <w:spacing w:after="120" w:line="350" w:lineRule="auto"/>
-        <w:ind w:left="200"/>
         <w:jc w:val="both"/>
       </w:pPr>
       <w:r>
@@ -9634,7 +9510,7 @@
           <w:sz w:val="22"/>
           <w:szCs w:val="22"/>
         </w:rPr>
-        <w:t xml:space="preserve">접경지역 주민과 어민들은 어떻습니까? 22일에 백령도 어선들이 대피했다고 하던데, 그분들은 매번 이렇게 가슴을 졸이면서 사는 거 아닙니까?</w:t>
+        <w:t xml:space="preserve">접경지역 주민과 어민들은 어떠한지? 22일에 백령도 어선들이 대피하였다고 하는데, 그분들은 매번 이렇게 가슴을 졸이며 사는 것 아닌지?</w:t>
       </w:r>
     </w:p>
     <w:p>
@@ -9765,11 +9641,7 @@
     </w:p>
     <w:p>
       <w:pPr>
-        <w:pBdr>
-          <w:left w:val="single" w:color="1F2F6B" w:sz="18" w:space="8"/>
-        </w:pBdr>
         <w:spacing w:after="120" w:line="350" w:lineRule="auto"/>
-        <w:ind w:left="200"/>
         <w:jc w:val="both"/>
       </w:pPr>
       <w:r>
@@ -9778,7 +9650,7 @@
           <w:sz w:val="22"/>
           <w:szCs w:val="22"/>
         </w:rPr>
-        <w:t xml:space="preserve">불안을 이용한 허위 정보는 엄정하게 대응하시고, 주민들에게는 사실을 제때 정확하게 알리세요. 이게 소통의 기본입니다.</w:t>
+        <w:t xml:space="preserve">불안을 이용한 허위 정보에는 엄정하게 대응하고, 주민들에게는 사실을 제때 정확하게 알리기 바람. 이것이 소통의 기본임.</w:t>
       </w:r>
     </w:p>
     <w:p>
@@ -9809,11 +9681,7 @@
     </w:p>
     <w:p>
       <w:pPr>
-        <w:pBdr>
-          <w:left w:val="single" w:color="1F2F6B" w:sz="18" w:space="8"/>
-        </w:pBdr>
         <w:spacing w:after="120" w:line="350" w:lineRule="auto"/>
-        <w:ind w:left="200"/>
         <w:jc w:val="both"/>
       </w:pPr>
       <w:r>
@@ -9822,16 +9690,12 @@
           <w:sz w:val="22"/>
           <w:szCs w:val="22"/>
         </w:rPr>
-        <w:t xml:space="preserve">정리하겠습니다. 지금 대응이 늦었다는 비판이 나오는 건 사실이지만, 늦었다고 해서 허둥대면 안 됩니다. 사실이 확인됐으니 한 박자씩 정확하게 갑니다.</w:t>
-      </w:r>
-    </w:p>
-    <w:p>
-      <w:pPr>
-        <w:pBdr>
-          <w:left w:val="single" w:color="1F2F6B" w:sz="18" w:space="8"/>
-        </w:pBdr>
+        <w:t xml:space="preserve">정리하겠음. 대응이 늦었다는 비판이 나오는 것은 사실이나 늦었다고 해서 허둥대서는 안 됨. 사실이 확인되었으므로 한 단계씩 정확하게 가겠음.</w:t>
+      </w:r>
+    </w:p>
+    <w:p>
+      <w:pPr>
         <w:spacing w:after="120" w:line="350" w:lineRule="auto"/>
-        <w:ind w:left="200"/>
         <w:jc w:val="both"/>
       </w:pPr>
       <w:r>
@@ -9840,7 +9704,7 @@
           <w:sz w:val="22"/>
           <w:szCs w:val="22"/>
         </w:rPr>
-        <w:t xml:space="preserve">첫째, 1·2단계는 오늘부터 시행하세요. 둘째, 3단계 대북방송은 일단 보류합니다. 다만 추가 매설이 있거나, 인명 피해가 있거나, 실사격이 나오면 국방부장관이 건의하는 즉시 발동할 수 있게 조건을 문서로 명확히 하세요. 그때는 NSC를 열어서 승인받고 하는 게 아니라 바로 합니다. 우리가 다시 당했는데 회의부터 하고 있으면 안 되지 않겠습니까? 셋째, 9·19 복원은 폐기하지 않습니다. 대신 상호 이행 조건을 붙여서 속도를 조절하세요. 이의 있습니까?</w:t>
+        <w:t xml:space="preserve">첫째, 1·2단계는 오늘부터 시행하기 바람. 둘째, 3단계 대북방송은 일단 보류함. 다만 추가 매설, 인명 피해, 실사격이 있는 경우 국방부장관이 건의하는 즉시 발동할 수 있도록 조건을 문서로 명확히 하기 바람. 그 경우에는 NSC를 열어 승인을 받는 절차 없이 바로 시행함. 우리가 다시 당하였는데 회의부터 하고 있어서는 안 됨. 셋째, 9·19 복원은 폐기하지 않음. 대신 상호 이행 조건을 붙여 속도를 조절하기 바람. 이의 있는지?</w:t>
       </w:r>
     </w:p>
     <w:p>
@@ -9929,11 +9793,7 @@
     </w:p>
     <w:p>
       <w:pPr>
-        <w:pBdr>
-          <w:left w:val="single" w:color="1F2F6B" w:sz="18" w:space="8"/>
-        </w:pBdr>
         <w:spacing w:after="120" w:line="350" w:lineRule="auto"/>
-        <w:ind w:left="200"/>
         <w:jc w:val="both"/>
       </w:pPr>
       <w:r>
@@ -9942,7 +9802,7 @@
           <w:sz w:val="22"/>
           <w:szCs w:val="22"/>
         </w:rPr>
-        <w:t xml:space="preserve">NSC 미소집 경위는 안보실에서 정리해서 내일 오전에 같이 발표하세요. 숨길 일이 아닙니다. 숨기면 더 커집니다.</w:t>
+        <w:t xml:space="preserve">NSC 미소집 경위는 안보실에서 정리하여 내일 오전 함께 발표하기 바람. 숨길 일이 아님. 숨기면 더 커짐.</w:t>
       </w:r>
     </w:p>
     <w:p>
@@ -10224,11 +10084,7 @@
     </w:p>
     <w:p>
       <w:pPr>
-        <w:pBdr>
-          <w:left w:val="single" w:color="1F2F6B" w:sz="18" w:space="8"/>
-        </w:pBdr>
         <w:spacing w:after="120" w:line="350" w:lineRule="auto"/>
-        <w:ind w:left="200"/>
         <w:jc w:val="both"/>
       </w:pPr>
       <w:r>
@@ -10237,7 +10093,7 @@
           <w:sz w:val="22"/>
           <w:szCs w:val="22"/>
         </w:rPr>
-        <w:t xml:space="preserve">이 사안이 굉장히 불쾌합니다. 우리가 비공개 요청을 받아주고 포로 2명을 데려왔습니다. 그런데 하루아침에 그걸 유엔총회 연단에서 터뜨렸습니다. 그 연설이 나오기 전에 우리 쪽에서 낌새라도 파악한 건 있었습니까?</w:t>
+        <w:t xml:space="preserve">이 사안은 매우 불쾌함. 우리가 비공개 요청을 받아들여 포로 2명을 데려왔는데, 그것을 유엔총회 연단에서 하루아침에 공개하였음. 연설이 나오기 전에 우리 쪽에서 파악한 낌새는 있었는지?</w:t>
       </w:r>
     </w:p>
     <w:p>
@@ -10284,11 +10140,7 @@
     </w:p>
     <w:p>
       <w:pPr>
-        <w:pBdr>
-          <w:left w:val="single" w:color="1F2F6B" w:sz="18" w:space="8"/>
-        </w:pBdr>
         <w:spacing w:after="120" w:line="350" w:lineRule="auto"/>
-        <w:ind w:left="200"/>
         <w:jc w:val="both"/>
       </w:pPr>
       <w:r>
@@ -10297,7 +10149,7 @@
           <w:sz w:val="22"/>
           <w:szCs w:val="22"/>
         </w:rPr>
-        <w:t xml:space="preserve">못 했다고요? 그러면 이건 정보 공백이죠. 상대가 약속을 어길 수 있는 상황인지 아닌지를 보는 게 정보기관의 일 아닙니까? 그리고 한 가지 더 묻겠습니다. 우크라이나 입장에서 이걸 공개하면 우리한테 무기 지원 여론이 생길 것이라고 계산했을 수 있다고 하셨는데, 그러면 이건 우리가 이용당한 겁니까?</w:t>
+        <w:t xml:space="preserve">파악하지 못했다면 정보 공백임. 상대가 약속을 어길 수 있는 상황인지 아닌지를 보는 것이 정보기관의 일 아닌지? 한 가지 더 묻겠음. 우크라이나가 이를 공개하면 한국에서 무기 지원 여론이 생길 것이라고 계산했을 수 있다고 하였는데, 그렇다면 우리가 이용당한 것인지?</w:t>
       </w:r>
     </w:p>
     <w:p>
@@ -10344,11 +10196,7 @@
     </w:p>
     <w:p>
       <w:pPr>
-        <w:pBdr>
-          <w:left w:val="single" w:color="1F2F6B" w:sz="18" w:space="8"/>
-        </w:pBdr>
         <w:spacing w:after="120" w:line="350" w:lineRule="auto"/>
-        <w:ind w:left="200"/>
         <w:jc w:val="both"/>
       </w:pPr>
       <w:r>
@@ -10357,7 +10205,7 @@
           <w:sz w:val="22"/>
           <w:szCs w:val="22"/>
         </w:rPr>
-        <w:t xml:space="preserve">정상 간 합의가 없었다는 점은 어떻게 해석합니까? 우크라이나가 그걸 방패로 삼을 수도 있잖아요.</w:t>
+        <w:t xml:space="preserve">정상 간 합의가 없었다는 점은 어떻게 해석하는지? 우크라이나가 이를 방패로 삼을 수도 있지 않은지?</w:t>
       </w:r>
     </w:p>
     <w:p>
@@ -10404,11 +10252,7 @@
     </w:p>
     <w:p>
       <w:pPr>
-        <w:pBdr>
-          <w:left w:val="single" w:color="1F2F6B" w:sz="18" w:space="8"/>
-        </w:pBdr>
         <w:spacing w:after="120" w:line="350" w:lineRule="auto"/>
-        <w:ind w:left="200"/>
         <w:jc w:val="both"/>
       </w:pPr>
       <w:r>
@@ -10417,7 +10261,7 @@
           <w:sz w:val="22"/>
           <w:szCs w:val="22"/>
         </w:rPr>
-        <w:t xml:space="preserve">초치까지 했는데 사과를 못 받았다. 외교부는 이럴 때 어떻게 할 계획이었습니까? 유감 표명하고 끝내는 게 외교입니까? 끝까지 받아내는 겁니까? 여기서 우리가 물러서면 앞으로 다른 나라도 비공개 약속을 어겨도 되는 걸로 보지 않겠습니까?</w:t>
+        <w:t xml:space="preserve">초치까지 하였는데 사과를 받지 못하였음. 외교부는 이럴 때 어떻게 할 계획이었는지? 유감 표명하고 끝내는 것이 외교인지? 끝까지 받아내는 것인지? 여기서 물러서면 앞으로 다른 나라도 비공개 약속을 어겨도 되는 것으로 보지 않겠는지?</w:t>
       </w:r>
     </w:p>
     <w:p>
@@ -10617,11 +10461,7 @@
     </w:p>
     <w:p>
       <w:pPr>
-        <w:pBdr>
-          <w:left w:val="single" w:color="1F2F6B" w:sz="18" w:space="8"/>
-        </w:pBdr>
         <w:spacing w:after="120" w:line="350" w:lineRule="auto"/>
-        <w:ind w:left="200"/>
         <w:jc w:val="both"/>
       </w:pPr>
       <w:r>
@@ -10630,7 +10470,7 @@
           <w:sz w:val="22"/>
           <w:szCs w:val="22"/>
         </w:rPr>
-        <w:t xml:space="preserve">언론에서는 정부가 이들을 전쟁포로로 보는 건지 국민으로 보는 건지 분명히 안 밝힌다고 비판하고 있습니다. 법무부, 이 부분에 대해서 정부의 공식 입장이 정리돼 있습니까? 국민이 물으시면 대답을 해야 하지 않겠습니까?</w:t>
+        <w:t xml:space="preserve">언론에서는 정부가 이들을 전쟁포로로 보는지 국민으로 보는지 분명히 밝히지 않는다고 비판하고 있음. 법무부는 이 부분에 대해 정부의 공식 입장이 정리되어 있는지? 국민이 물으면 답할 수 있어야 하지 않은지?</w:t>
       </w:r>
     </w:p>
     <w:p>
@@ -10677,11 +10517,7 @@
     </w:p>
     <w:p>
       <w:pPr>
-        <w:pBdr>
-          <w:left w:val="single" w:color="1F2F6B" w:sz="18" w:space="8"/>
-        </w:pBdr>
         <w:spacing w:after="120" w:line="350" w:lineRule="auto"/>
-        <w:ind w:left="200"/>
         <w:jc w:val="both"/>
       </w:pPr>
       <w:r>
@@ -10690,7 +10526,7 @@
           <w:sz w:val="22"/>
           <w:szCs w:val="22"/>
         </w:rPr>
-        <w:t xml:space="preserve">장관 자리가 비어 있다고 해서 그게 일이 늦어지는 이유가 되면 안 됩니다. 장관 직무대행이면 장관의 권한과 책임을 그대로 갖는 겁니다. 법무장관 인선이 늦어지는 건 저의 책임입니다. 그러나 그 사이에 일이 안 굴러가면 안 됩니다. 이번 주 안에 정리해서 가져오세요.</w:t>
+        <w:t xml:space="preserve">장관 자리가 비어 있다는 것이 일이 늦어지는 이유가 되어서는 안 됨. 장관 직무대행은 장관의 권한과 책임을 그대로 가짐. 법무장관 인선이 늦어지는 것은 대통령의 책임임. 그러나 그 사이 일이 돌아가지 않아서는 안 됨. 이번 주 안에 정리하여 가져오기 바람.</w:t>
       </w:r>
     </w:p>
     <w:p>
@@ -10779,11 +10615,7 @@
     </w:p>
     <w:p>
       <w:pPr>
-        <w:pBdr>
-          <w:left w:val="single" w:color="1F2F6B" w:sz="18" w:space="8"/>
-        </w:pBdr>
         <w:spacing w:after="120" w:line="350" w:lineRule="auto"/>
-        <w:ind w:left="200"/>
         <w:jc w:val="both"/>
       </w:pPr>
       <w:r>
@@ -10792,7 +10624,7 @@
           <w:sz w:val="22"/>
           <w:szCs w:val="22"/>
         </w:rPr>
-        <w:t xml:space="preserve">통일부장관님, 이 사람들이 북한으로 돌아가길 원하지 않는다는 건 본인 의사로 확인된 겁니까? 혹시 본인의 의사가 아닌 부분은 없는지, 몇 번이든 확인하세요. 한 사람이라도 억지로 붙잡아 놨다는 말이 나오면 안 됩니다.</w:t>
+        <w:t xml:space="preserve">통일부장관에게 묻겠음. 이 사람들이 북한으로 돌아가길 원하지 않는다는 것은 본인 의사로 확인된 것인지? 본인 의사가 아닌 부분은 없는지 몇 번이든 확인하기 바람. 한 사람이라도 억지로 붙잡아 놓았다는 말이 나오면 안 됨.</w:t>
       </w:r>
     </w:p>
     <w:p>
@@ -10949,11 +10781,7 @@
     </w:p>
     <w:p>
       <w:pPr>
-        <w:pBdr>
-          <w:left w:val="single" w:color="1F2F6B" w:sz="18" w:space="8"/>
-        </w:pBdr>
         <w:spacing w:after="120" w:line="350" w:lineRule="auto"/>
-        <w:ind w:left="200"/>
         <w:jc w:val="both"/>
       </w:pPr>
       <w:r>
@@ -10962,7 +10790,7 @@
           <w:sz w:val="22"/>
           <w:szCs w:val="22"/>
         </w:rPr>
-        <w:t xml:space="preserve">북한과 러시아가 이걸 어떻게 활용할 것 같습니까? 국정원이 이번에는 잘 맞혀주기를 바랍니다.</w:t>
+        <w:t xml:space="preserve">북한과 러시아가 이를 어떻게 활용할 것으로 보는지? 국정원이 이번에는 정확히 판단하기를 바람.</w:t>
       </w:r>
     </w:p>
     <w:p>
@@ -11035,11 +10863,7 @@
     </w:p>
     <w:p>
       <w:pPr>
-        <w:pBdr>
-          <w:left w:val="single" w:color="1F2F6B" w:sz="18" w:space="8"/>
-        </w:pBdr>
         <w:spacing w:after="120" w:line="350" w:lineRule="auto"/>
-        <w:ind w:left="200"/>
         <w:jc w:val="both"/>
       </w:pPr>
       <w:r>
@@ -11048,7 +10872,7 @@
           <w:sz w:val="22"/>
           <w:szCs w:val="22"/>
         </w:rPr>
-        <w:t xml:space="preserve">포로의 신상과 조사 내용을 어디까지 공개할지, 기준부터 정하세요. 알 권리와 신변 보호 사이에서 정해야 합니다.</w:t>
+        <w:t xml:space="preserve">포로의 신상과 조사 내용을 어디까지 공개할지 기준부터 정하기 바람. 알 권리와 신변 보호 사이에서 정해야 함.</w:t>
       </w:r>
     </w:p>
     <w:p>
@@ -11179,11 +11003,7 @@
     </w:p>
     <w:p>
       <w:pPr>
-        <w:pBdr>
-          <w:left w:val="single" w:color="1F2F6B" w:sz="18" w:space="8"/>
-        </w:pBdr>
         <w:spacing w:after="120" w:line="350" w:lineRule="auto"/>
-        <w:ind w:left="200"/>
         <w:jc w:val="both"/>
       </w:pPr>
       <w:r>
@@ -11192,16 +11012,12 @@
           <w:sz w:val="22"/>
           <w:szCs w:val="22"/>
         </w:rPr>
-        <w:t xml:space="preserve">정리하겠습니다. 포로도 사람입니다. 인도적으로, 본인 의사를 존중해서 처리합니다. 무기 지원 문제는 이 자리에서 논의를 확대하지 않겠습니다. 우크라이나가 마음대로 이슈를 만들고 거기에 우리가 끌려가는 모양이 되면 안 됩니다.</w:t>
-      </w:r>
-    </w:p>
-    <w:p>
-      <w:pPr>
-        <w:pBdr>
-          <w:left w:val="single" w:color="1F2F6B" w:sz="18" w:space="8"/>
-        </w:pBdr>
+        <w:t xml:space="preserve">정리하겠음. 포로도 사람임. 인도적으로, 본인 의사를 존중하여 처리하겠음. 무기 지원 문제는 이 자리에서 논의를 확대하지 않겠음. 우크라이나가 마음대로 이슈를 만들고 거기에 우리가 끌려가는 모양이 되어서는 안 됨.</w:t>
+      </w:r>
+    </w:p>
+    <w:p>
+      <w:pPr>
         <w:spacing w:after="120" w:line="350" w:lineRule="auto"/>
-        <w:ind w:left="200"/>
         <w:jc w:val="both"/>
       </w:pPr>
       <w:r>
@@ -11210,7 +11026,7 @@
           <w:sz w:val="22"/>
           <w:szCs w:val="22"/>
         </w:rPr>
-        <w:t xml:space="preserve">외교부는 사과 요구를 유지하되 재발 방지 합의에서 마무리하세요. 법무부와 통일부는 이번 주 안에 법적 성격을 구분한 설명 자료를 확정하고, 국정원은 포로들의 안전과 자유의사 확인에 만전을 기하세요. 그리고 국정원은 정보 공백이 다시는 없도록 대응 체계를 점검해서 보고하세요.</w:t>
+        <w:t xml:space="preserve">외교부는 사과 요구를 유지하되 재발 방지 합의에서 마무리하기 바람. 법무부와 통일부는 이번 주 안에 법적 성격을 구분한 설명 자료를 확정하고, 국정원은 포로들의 안전과 자유의사 확인에 만전을 기하기 바람. 아울러 국정원은 정보 공백이 다시는 생기지 않도록 대응 체계를 점검하여 보고하기 바람.</w:t>
       </w:r>
     </w:p>
     <w:p>
@@ -11508,11 +11324,7 @@
     </w:p>
     <w:p>
       <w:pPr>
-        <w:pBdr>
-          <w:left w:val="single" w:color="1F2F6B" w:sz="18" w:space="8"/>
-        </w:pBdr>
         <w:spacing w:after="120" w:line="350" w:lineRule="auto"/>
-        <w:ind w:left="200"/>
         <w:jc w:val="both"/>
       </w:pPr>
       <w:r>
@@ -11521,7 +11333,7 @@
           <w:sz w:val="22"/>
           <w:szCs w:val="22"/>
         </w:rPr>
-        <w:t xml:space="preserve">여기서 국방부에 먼저 확인하겠습니다. “미국이 시한을 정해서 요청한 적 없다”고 국방부가 공식으로 말했는데, 그러면 UAE에 왜 실사단을 보냈습니까? 실사단 보내 놓고 결정된 게 없다고 하면 국민이 어떻게 믿겠습니까? 이거 앞뒤가 안 맞는 것 아닙니까?</w:t>
+        <w:t xml:space="preserve">국방부에 먼저 확인하겠음. “미국이 시한을 정해 요청한 적 없다”고 국방부가 공식 밝혔는데, UAE에 실사단은 왜 보냈는지? 실사단을 보내 놓고 결정된 것이 없다고 하면 국민이 어떻게 믿겠는지? 앞뒤가 맞지 않는 것 아닌지?</w:t>
       </w:r>
     </w:p>
     <w:p>
@@ -11568,11 +11380,7 @@
     </w:p>
     <w:p>
       <w:pPr>
-        <w:pBdr>
-          <w:left w:val="single" w:color="1F2F6B" w:sz="18" w:space="8"/>
-        </w:pBdr>
         <w:spacing w:after="120" w:line="350" w:lineRule="auto"/>
-        <w:ind w:left="200"/>
         <w:jc w:val="both"/>
       </w:pPr>
       <w:r>
@@ -11581,7 +11389,7 @@
           <w:sz w:val="22"/>
           <w:szCs w:val="22"/>
         </w:rPr>
-        <w:t xml:space="preserve">소통이 부족했다. 이 말이 지금 이 정부에서 너무 자주 나오는 것 같습니다. 결정 안 한 걸 결정 안 했다고 분명히 말해야 국민이 믿습니다. 앞뒤 안 맞게 하지 마세요.</w:t>
+        <w:t xml:space="preserve">소통이 부족했다는 말이 지금 이 정부에서 너무 자주 나옴. 결정하지 않은 것은 결정하지 않았다고 분명히 말해야 국민이 믿음. 앞뒤가 맞지 않게 하지 말기 바람.</w:t>
       </w:r>
     </w:p>
     <w:p>
@@ -12271,11 +12079,7 @@
     </w:p>
     <w:p>
       <w:pPr>
-        <w:pBdr>
-          <w:left w:val="single" w:color="1F2F6B" w:sz="18" w:space="8"/>
-        </w:pBdr>
         <w:spacing w:after="120" w:line="350" w:lineRule="auto"/>
-        <w:ind w:left="200"/>
         <w:jc w:val="both"/>
       </w:pPr>
       <w:r>
@@ -12284,7 +12088,7 @@
           <w:sz w:val="22"/>
           <w:szCs w:val="22"/>
         </w:rPr>
-        <w:t xml:space="preserve">청해부대 활동 강화로 가면 국회 동의가 필요 없다는 건데, 그걸 국회가 순순히 받아들이겠습니까? 야당은 야당대로, 시민단체는 시민단체대로 “편법 파병”이라고 하지 않겠습니까? 법무부는 법적으로 분명히 말씀하세요. 애매하게 하지 마시고요.</w:t>
+        <w:t xml:space="preserve">청해부대 활동 강화로 가면 국회 동의가 필요 없다는 것인데, 국회가 이를 순순히 받아들이겠는지? 야당과 시민단체가 “편법 파병”이라고 하지 않겠는지? 법무부는 법적으로 분명히 말하기 바람. 애매하게 하지 말기 바람.</w:t>
       </w:r>
     </w:p>
     <w:p>
@@ -12331,11 +12135,7 @@
     </w:p>
     <w:p>
       <w:pPr>
-        <w:pBdr>
-          <w:left w:val="single" w:color="1F2F6B" w:sz="18" w:space="8"/>
-        </w:pBdr>
         <w:spacing w:after="120" w:line="350" w:lineRule="auto"/>
-        <w:ind w:left="200"/>
         <w:jc w:val="both"/>
       </w:pPr>
       <w:r>
@@ -12344,7 +12144,7 @@
           <w:sz w:val="22"/>
           <w:szCs w:val="22"/>
         </w:rPr>
-        <w:t xml:space="preserve">가능하다는 거죠? 반론도 있고. 그러면 정부가 기대고 있는 법적 근거가 튼튼하지 않다는 거네요. 편법 소리 듣고 싶지 않습니다. 법적으로 애매하면 국회에 설명하고 협조를 구하는 게 맞습니다. 총리님 어떻습니까?</w:t>
+        <w:t xml:space="preserve">가능하다는 것인지? 반론도 있다고 하였음. 그렇다면 정부가 기대고 있는 법적 근거가 튼튼하지 않다는 것임. 편법이라는 말을 듣고 싶지 않음. 법적으로 애매하면 국회에 설명하고 협조를 구하는 것이 맞음. 총리의 생각은?</w:t>
       </w:r>
     </w:p>
     <w:p>
@@ -12499,11 +12299,7 @@
     </w:p>
     <w:p>
       <w:pPr>
-        <w:pBdr>
-          <w:left w:val="single" w:color="1F2F6B" w:sz="18" w:space="8"/>
-        </w:pBdr>
         <w:spacing w:after="120" w:line="350" w:lineRule="auto"/>
-        <w:ind w:left="200"/>
         <w:jc w:val="both"/>
       </w:pPr>
       <w:r>
@@ -12512,7 +12308,7 @@
           <w:sz w:val="22"/>
           <w:szCs w:val="22"/>
         </w:rPr>
-        <w:t xml:space="preserve">관리 가능한 범위라는 말은 많이 들었습니다. 그런데 관리 가능한 범위가 어디까지입니까? 비축 며칠분이 있고, 해협이 막히면 며칠 버팁니까? 숫자로 대답하세요. 추상적으로 말하면 아무 도움이 안 됩니다.</w:t>
+        <w:t xml:space="preserve">관리 가능한 범위라는 말은 많이 들었음. 그 범위가 어디까지인지? 비축이 며칠분이고 해협이 막히면 며칠을 버티는지? 숫자로 답하기 바람. 추상적으로 말하면 아무 도움이 되지 않음.</w:t>
       </w:r>
     </w:p>
     <w:p>
@@ -12559,11 +12355,7 @@
     </w:p>
     <w:p>
       <w:pPr>
-        <w:pBdr>
-          <w:left w:val="single" w:color="1F2F6B" w:sz="18" w:space="8"/>
-        </w:pBdr>
         <w:spacing w:after="120" w:line="350" w:lineRule="auto"/>
-        <w:ind w:left="200"/>
         <w:jc w:val="both"/>
       </w:pPr>
       <w:r>
@@ -12572,7 +12364,7 @@
           <w:sz w:val="22"/>
           <w:szCs w:val="22"/>
         </w:rPr>
-        <w:t xml:space="preserve">내일까지가 아니라 오늘 밤에라도 대략의 수치는 가지고 있어야 되는 것 아닙니까? 이런 회의에 숫자 없이 오시면 곤란합니다. 다음부터는 자료에 반드시 넣으세요.</w:t>
+        <w:t xml:space="preserve">내일까지가 아니라 오늘 밤에라도 대략의 수치는 가지고 있어야 하는 것 아닌지? 이런 회의에 숫자 없이 오는 것은 곤란함. 다음부터는 자료에 반드시 포함하기 바람.</w:t>
       </w:r>
     </w:p>
     <w:p>
@@ -12729,11 +12521,7 @@
     </w:p>
     <w:p>
       <w:pPr>
-        <w:pBdr>
-          <w:left w:val="single" w:color="1F2F6B" w:sz="18" w:space="8"/>
-        </w:pBdr>
         <w:spacing w:after="120" w:line="350" w:lineRule="auto"/>
-        <w:ind w:left="200"/>
         <w:jc w:val="both"/>
       </w:pPr>
       <w:r>
@@ -12742,7 +12530,7 @@
           <w:sz w:val="22"/>
           <w:szCs w:val="22"/>
         </w:rPr>
-        <w:t xml:space="preserve">안보실장님 말씀을 들으면, 미국이 요구하면 결국 들어줘야 한다는 쪽으로 들립니다. 저는 그렇게 생각하지 않습니다. 동맹이니까 서로 요구할 수 있고, 우리도 국익에 따라 거절할 수 있습니다. 국익이 우선이지 눈치가 우선이 아닙니다. 빈손일 때 청구서가 올 수 있다는 건 알지만 청구서가 무서워서 국민이 반대하는 파병을 할 수는 없습니다.</w:t>
+        <w:t xml:space="preserve">안보실장의 말은 미국이 요구하면 결국 들어줘야 한다는 쪽으로 들림. 그렇게 생각하지 않음. 동맹이므로 서로 요구할 수 있고, 우리도 국익에 따라 거절할 수 있음. 국익이 우선이지 눈치가 우선이 아님. 빈손일 때 청구서가 올 수 있다는 점은 알고 있으나 청구서가 무서워 국민이 반대하는 파병을 할 수는 없음.</w:t>
       </w:r>
     </w:p>
     <w:p>
@@ -12873,11 +12661,7 @@
     </w:p>
     <w:p>
       <w:pPr>
-        <w:pBdr>
-          <w:left w:val="single" w:color="1F2F6B" w:sz="18" w:space="8"/>
-        </w:pBdr>
         <w:spacing w:after="120" w:line="350" w:lineRule="auto"/>
-        <w:ind w:left="200"/>
         <w:jc w:val="both"/>
       </w:pPr>
       <w:r>
@@ -12886,7 +12670,7 @@
           <w:sz w:val="22"/>
           <w:szCs w:val="22"/>
         </w:rPr>
-        <w:t xml:space="preserve">국방부장관님, 지금 파병을 대가로 핵잠이나 전작권을 받아오자는 말씀입니까? 국민이 반대하는 일을 하면서 그걸 거래 카드로 쓰자는 겁니까? 국민들 눈에는 군인들 보내고 장사한다는 걸로 보일 수 있습니다. 그건 안 됩니다.</w:t>
+        <w:t xml:space="preserve">국방부장관은 파병을 대가로 핵잠이나 전작권을 받아오자는 것인지? 국민이 반대하는 일을 하면서 그것을 거래 카드로 쓰자는 것인지? 국민 눈에는 군인을 보내고 장사한다는 것으로 보일 수 있음. 그것은 안 됨.</w:t>
       </w:r>
     </w:p>
     <w:p>
@@ -13017,11 +12801,7 @@
     </w:p>
     <w:p>
       <w:pPr>
-        <w:pBdr>
-          <w:left w:val="single" w:color="1F2F6B" w:sz="18" w:space="8"/>
-        </w:pBdr>
         <w:spacing w:after="120" w:line="350" w:lineRule="auto"/>
-        <w:ind w:left="200"/>
         <w:jc w:val="both"/>
       </w:pPr>
       <w:r>
@@ -13030,7 +12810,7 @@
           <w:sz w:val="22"/>
           <w:szCs w:val="22"/>
         </w:rPr>
-        <w:t xml:space="preserve">두 분 의견 다 일리가 있습니다. 하지만 이 문제는 결국 우리 국민이 납득하느냐가 기준입니다. 안보실장님이 정리해 주세요.</w:t>
+        <w:t xml:space="preserve">두 장관의 의견 모두 일리가 있음. 그러나 이 문제는 결국 국민이 납득하는가가 기준임. 안보실장이 정리하기 바람.</w:t>
       </w:r>
     </w:p>
     <w:p>
@@ -13144,11 +12924,7 @@
     </w:p>
     <w:p>
       <w:pPr>
-        <w:pBdr>
-          <w:left w:val="single" w:color="1F2F6B" w:sz="18" w:space="8"/>
-        </w:pBdr>
         <w:spacing w:after="120" w:line="350" w:lineRule="auto"/>
-        <w:ind w:left="200"/>
         <w:jc w:val="both"/>
       </w:pPr>
       <w:r>
@@ -13157,7 +12933,7 @@
           <w:sz w:val="22"/>
           <w:szCs w:val="22"/>
         </w:rPr>
-        <w:t xml:space="preserve">제가 홍해 진입도 검토해 보라고 지시했고, 지난 18일 기자회견에서도 그렇게 밝혔습니다. 진행 상황이 어떻게 되고 있습니까?</w:t>
+        <w:t xml:space="preserve">홍해 진입도 검토하라고 지시하였고, 지난 18일 기자회견에서도 그렇게 밝혔음. 진행 상황은 어떠한지?</w:t>
       </w:r>
     </w:p>
     <w:p>
@@ -13204,11 +12980,7 @@
     </w:p>
     <w:p>
       <w:pPr>
-        <w:pBdr>
-          <w:left w:val="single" w:color="1F2F6B" w:sz="18" w:space="8"/>
-        </w:pBdr>
         <w:spacing w:after="120" w:line="350" w:lineRule="auto"/>
-        <w:ind w:left="200"/>
         <w:jc w:val="both"/>
       </w:pPr>
       <w:r>
@@ -13217,7 +12989,7 @@
           <w:sz w:val="22"/>
           <w:szCs w:val="22"/>
         </w:rPr>
-        <w:t xml:space="preserve">공개적으로 밝힌 지도 열흘이 넘었는데 아직도 검토 중입니까? 대통령 지시가 열흘 만에 별도로 보고드리겠다로 돌아오면, 지시를 어떻게 이행하겠다는 겁니까? 빨리하세요. 선박과 선원 문제는 누가 욕해도 해야 하는 일이에요.</w:t>
+        <w:t xml:space="preserve">공개적으로 밝힌 지 열흘이 넘었는데 아직도 검토 중인지? 대통령 지시가 열흘 만에 별도 보고하겠다는 답으로 돌아오면 지시를 어떻게 이행하겠다는 것인지? 서두르기 바람. 선박과 선원 문제는 누가 비판해도 해야 하는 일임.</w:t>
       </w:r>
     </w:p>
     <w:p>
@@ -13332,11 +13104,7 @@
     </w:p>
     <w:p>
       <w:pPr>
-        <w:pBdr>
-          <w:left w:val="single" w:color="1F2F6B" w:sz="18" w:space="8"/>
-        </w:pBdr>
         <w:spacing w:after="120" w:line="350" w:lineRule="auto"/>
-        <w:ind w:left="200"/>
         <w:jc w:val="both"/>
       </w:pPr>
       <w:r>
@@ -13345,16 +13113,12 @@
           <w:sz w:val="22"/>
           <w:szCs w:val="22"/>
         </w:rPr>
-        <w:t xml:space="preserve">두 가지 원칙을 다시 확인합니다. 첫째, 전쟁에 관여하거나 개입하는 파병은 없다는 원칙은 그대로입니다. 외국군 지휘를 받는 형태도 안 됩니다. 둘째, 한반도 방어를 해치지 않는 범위에서만 합니다. 미국이 시한을 제시했든 안 했든 그것 때문에 결정하지 않습니다.</w:t>
-      </w:r>
-    </w:p>
-    <w:p>
-      <w:pPr>
-        <w:pBdr>
-          <w:left w:val="single" w:color="1F2F6B" w:sz="18" w:space="8"/>
-        </w:pBdr>
+        <w:t xml:space="preserve">두 가지 원칙을 다시 확인함. 첫째, 전쟁에 관여하거나 개입하는 파병은 없다는 원칙은 그대로임. 외국군의 지휘를 받는 형태도 안 됨. 둘째, 한반도 방어를 해치지 않는 범위에서만 추진함. 미국이 시한을 제시했든 아니든 그것 때문에 결정하지 않음.</w:t>
+      </w:r>
+    </w:p>
+    <w:p>
+      <w:pPr>
         <w:spacing w:after="120" w:line="350" w:lineRule="auto"/>
-        <w:ind w:left="200"/>
         <w:jc w:val="both"/>
       </w:pPr>
       <w:r>
@@ -13363,16 +13127,12 @@
           <w:sz w:val="22"/>
           <w:szCs w:val="22"/>
         </w:rPr>
-        <w:t xml:space="preserve">오늘은 신규 파견 결정을 하지 않습니다. 안보실은 옵션 A와 C를 중심으로 임무 범위, 법적 근거, 국회 협의 방안, 대미 병행 협상안을 정리해서 10월 중순 NSC에서 최종 판단할 수 있게 하세요. 외교부는 그 사이 비군사 기여 방안을 먼저 준비하시고요.</w:t>
-      </w:r>
-    </w:p>
-    <w:p>
-      <w:pPr>
-        <w:pBdr>
-          <w:left w:val="single" w:color="1F2F6B" w:sz="18" w:space="8"/>
-        </w:pBdr>
+        <w:t xml:space="preserve">오늘은 신규 파견 결정을 하지 않겠음. 안보실은 옵션 A와 C를 중심으로 임무 범위, 법적 근거, 국회 협의 방안, 대미 병행 협상안을 정리하여 10월 중순 NSC에서 최종 판단할 수 있도록 하기 바람. 외교부는 그 사이 비군사 기여 방안을 먼저 준비하기 바람.</w:t>
+      </w:r>
+    </w:p>
+    <w:p>
+      <w:pPr>
         <w:spacing w:after="120" w:line="350" w:lineRule="auto"/>
-        <w:ind w:left="200"/>
         <w:jc w:val="both"/>
       </w:pPr>
       <w:r>
@@ -13381,7 +13141,7 @@
           <w:sz w:val="22"/>
           <w:szCs w:val="22"/>
         </w:rPr>
-        <w:t xml:space="preserve">국방부는 UAE 실사단 결과를 안보실에 일괄 보고하고, 재경부와 에너지 부처는 비상 수급계획을 갱신해서 다음 회의 때 보고하세요. 그리고 하나만 더 말씀드립니다. 이 문제를 결정하기 전에 반드시 국회에 먼저 설명하세요. 국민의 대표인 국회를 건너뛰고 군 자산을 먼저 내보내는 일은 없을 겁니다.</w:t>
+        <w:t xml:space="preserve">국방부는 UAE 실사단 결과를 안보실에 일괄 보고하고, 재경부와 에너지 부처는 비상 수급계획을 갱신하여 다음 회의에 보고하기 바람. 또한 이 문제를 결정하기 전에 반드시 국회에 먼저 설명하기 바람. 국민의 대표인 국회를 건너뛰고 군 자산을 먼저 내보내는 일은 없을 것임.</w:t>
       </w:r>
     </w:p>
     <w:p>
@@ -13691,11 +13451,7 @@
     </w:p>
     <w:p>
       <w:pPr>
-        <w:pBdr>
-          <w:left w:val="single" w:color="1F2F6B" w:sz="18" w:space="8"/>
-        </w:pBdr>
         <w:spacing w:after="120" w:line="350" w:lineRule="auto"/>
-        <w:ind w:left="200"/>
         <w:jc w:val="both"/>
       </w:pPr>
       <w:r>
@@ -13704,7 +13460,7 @@
           <w:sz w:val="22"/>
           <w:szCs w:val="22"/>
         </w:rPr>
-        <w:t xml:space="preserve">한반도 문제가 얘기됐다면, 우리는 그 자리에서 무슨 얘기가 오갔는지 알고 있어야죠. 지금 우리가 아는 건 신문에 나온 것뿐입니까? 정상회담이 열린 지 엿새가 지났는데 아직도 확인 중이라는 겁니까?</w:t>
+        <w:t xml:space="preserve">한반도 문제가 거론되었다면 그 자리에서 무엇이 오갔는지 우리가 알고 있어야 함. 지금 우리가 아는 것이 신문에 나온 내용뿐인지? 정상회담이 열린 지 엿새가 지났는데 아직도 확인 중이라는 것인지?</w:t>
       </w:r>
     </w:p>
     <w:p>
@@ -13751,11 +13507,7 @@
     </w:p>
     <w:p>
       <w:pPr>
-        <w:pBdr>
-          <w:left w:val="single" w:color="1F2F6B" w:sz="18" w:space="8"/>
-        </w:pBdr>
         <w:spacing w:after="120" w:line="350" w:lineRule="auto"/>
-        <w:ind w:left="200"/>
         <w:jc w:val="both"/>
       </w:pPr>
       <w:r>
@@ -13764,7 +13516,7 @@
           <w:sz w:val="22"/>
           <w:szCs w:val="22"/>
         </w:rPr>
-        <w:t xml:space="preserve">확인하고 있다는 말은 이제 그만 듣고 싶습니다. 동맹국이 정상회담을 하면 한국은 가장 먼저 내용을 아는 나라 중 하나여야 합니다. 그게 안 된다면 우리 외교 채널이 제대로 작동하고 있는 건지 의심할 수밖에 없습니다. 미국에도, 중국에도 직접 물으세요. 이번 주 안에 확인해서 보고하세요.</w:t>
+        <w:t xml:space="preserve">확인하고 있다는 말은 이제 그만 듣고 싶음. 동맹국이 정상회담을 하면 한국은 가장 먼저 내용을 아는 나라 중 하나여야 함. 그렇지 않다면 우리 외교 채널이 제대로 작동하고 있는지 의심할 수밖에 없음. 미국과 중국에 직접 문의하여 이번 주 안에 확인하고 보고하기 바람.</w:t>
       </w:r>
     </w:p>
     <w:p>
@@ -13919,11 +13671,7 @@
     </w:p>
     <w:p>
       <w:pPr>
-        <w:pBdr>
-          <w:left w:val="single" w:color="1F2F6B" w:sz="18" w:space="8"/>
-        </w:pBdr>
         <w:spacing w:after="120" w:line="350" w:lineRule="auto"/>
-        <w:ind w:left="200"/>
         <w:jc w:val="both"/>
       </w:pPr>
       <w:r>
@@ -13932,7 +13680,7 @@
           <w:sz w:val="22"/>
           <w:szCs w:val="22"/>
         </w:rPr>
-        <w:t xml:space="preserve">국정원 평가대로 50%라면 동전 던지기 수준입니다. 그런데 그 50% 안에 우리는 어디에 들어가 있습니까? 북미가 만나는데 한국은 뉴스로 알게 되는 상황, 이게 가장 최악 아닙니까? 한국이 빠진 채로 북미가 합의하고, 그 비용을 우리가 치르는 상황이 오면 누가 책임집니까?</w:t>
+        <w:t xml:space="preserve">국정원 평가대로 50%라면 동전 던지기 수준임. 그 가운데 우리는 어디에 들어가 있는지? 북미가 만나는데 한국은 뉴스로 알게 되는 상황이 가장 나쁜 경우 아닌지? 한국이 빠진 채 북미가 합의하고 그 비용을 우리가 치르게 되면 누가 책임지는지?</w:t>
       </w:r>
     </w:p>
     <w:p>
@@ -14105,11 +13853,7 @@
     </w:p>
     <w:p>
       <w:pPr>
-        <w:pBdr>
-          <w:left w:val="single" w:color="1F2F6B" w:sz="18" w:space="8"/>
-        </w:pBdr>
         <w:spacing w:after="120" w:line="350" w:lineRule="auto"/>
-        <w:ind w:left="200"/>
         <w:jc w:val="both"/>
       </w:pPr>
       <w:r>
@@ -14118,7 +13862,7 @@
           <w:sz w:val="22"/>
           <w:szCs w:val="22"/>
         </w:rPr>
-        <w:t xml:space="preserve">두 분 다 그만하세요. 국방부장관 말씀은 군사적 위협을 협상에서 빼면 안 된다는 거고, 통일부장관 말씀은 문을 닫으면 안 된다는 거죠. 둘 다 맞는 말씀입니다. 그러니까 둘 다 하면 됩니다. 단호하게 하되 문을 열어둔다. 이게 우리 입장입니다. 서로 상대가 틀렸다고만 하면 정부가 두 목소리를 내는 것처럼 보여요.</w:t>
+        <w:t xml:space="preserve">두 장관 모두 그만하기 바람. 국방부장관의 말은 군사적 위협을 협상에서 빼서는 안 된다는 것이고, 통일부장관의 말은 문을 닫아서는 안 된다는 것임. 둘 다 맞는 말임. 따라서 둘 다 하면 됨. 단호하게 하되 문을 열어 둠. 이것이 우리 입장임. 서로 상대가 틀렸다고만 하면 정부가 두 목소리를 내는 것으로 보임.</w:t>
       </w:r>
     </w:p>
     <w:p>
@@ -14246,11 +13990,7 @@
     </w:p>
     <w:p>
       <w:pPr>
-        <w:pBdr>
-          <w:left w:val="single" w:color="1F2F6B" w:sz="18" w:space="8"/>
-        </w:pBdr>
         <w:spacing w:after="120" w:line="350" w:lineRule="auto"/>
-        <w:ind w:left="200"/>
         <w:jc w:val="both"/>
       </w:pPr>
       <w:r>
@@ -14259,7 +13999,7 @@
           <w:sz w:val="22"/>
           <w:szCs w:val="22"/>
         </w:rPr>
-        <w:t xml:space="preserve">안보 현안과 통상 현안이 엮일 가능성에 대비해야 합니다. 부총리님, 대미 투자 공식 발표가 계속 늦어지는 것도 마음에 걸립니다. 이건 어떤 상황입니까?</w:t>
+        <w:t xml:space="preserve">안보 현안과 통상 현안이 엮일 가능성에 대비해야 함. 부총리에게 묻겠음. 대미 투자 공식 발표가 계속 늦어지는 점이 마음에 걸리는데 어떤 상황인지?</w:t>
       </w:r>
     </w:p>
     <w:p>
@@ -14306,11 +14046,7 @@
     </w:p>
     <w:p>
       <w:pPr>
-        <w:pBdr>
-          <w:left w:val="single" w:color="1F2F6B" w:sz="18" w:space="8"/>
-        </w:pBdr>
         <w:spacing w:after="120" w:line="350" w:lineRule="auto"/>
-        <w:ind w:left="200"/>
         <w:jc w:val="both"/>
       </w:pPr>
       <w:r>
@@ -14319,7 +14055,7 @@
           <w:sz w:val="22"/>
           <w:szCs w:val="22"/>
         </w:rPr>
-        <w:t xml:space="preserve">절차상 이유라는 말도 믿고 싶지만, 우리 기업에 3,500억 달러가 걸린 사안입니다. 낙관만 하지 마시고 만에 하나 지연이 길어지면 어떤 영향이 있는지도 점검해 놓으세요. 그리고 안보실장님, 통상 협상이 호르무즈 파병 요구와 같은 시기에 오는 건 우연이 아닐 수 있습니다. 미국이 연계를 시도할 때 우리가 쓸 논리를 미리 만들어 놓으세요.</w:t>
+        <w:t xml:space="preserve">절차상 이유라는 말을 믿고 싶으나 우리 기업에 3,500억 달러가 걸린 사안임. 낙관만 하지 말고, 지연이 길어질 경우의 영향도 점검해 두기 바람. 그리고 안보실장은 통상 협상이 호르무즈 파병 요구와 같은 시기에 오는 것이 우연이 아닐 수 있음을 염두에 두기 바람. 미국이 연계를 시도할 때 우리가 쓸 논리를 미리 만들어 두기 바람.</w:t>
       </w:r>
     </w:p>
     <w:p>
@@ -14448,11 +14184,7 @@
     </w:p>
     <w:p>
       <w:pPr>
-        <w:pBdr>
-          <w:left w:val="single" w:color="1F2F6B" w:sz="18" w:space="8"/>
-        </w:pBdr>
         <w:spacing w:after="120" w:line="350" w:lineRule="auto"/>
-        <w:ind w:left="200"/>
         <w:jc w:val="both"/>
       </w:pPr>
       <w:r>
@@ -14461,7 +14193,7 @@
           <w:sz w:val="22"/>
           <w:szCs w:val="22"/>
         </w:rPr>
-        <w:t xml:space="preserve">러시아와의 관계는 어떤 선에서 관리할 겁니까? 이쪽도 저쪽도 눈치 보다가 한쪽에서도 존중받지 못하는 일이 생기면 안 됩니다.</w:t>
+        <w:t xml:space="preserve">러시아와의 관계는 어떤 선에서 관리할 것인지? 이쪽저쪽 눈치만 보다가 어느 쪽에서도 존중받지 못하는 일이 생겨서는 안 됨.</w:t>
       </w:r>
     </w:p>
     <w:p>
@@ -14618,11 +14350,7 @@
     </w:p>
     <w:p>
       <w:pPr>
-        <w:pBdr>
-          <w:left w:val="single" w:color="1F2F6B" w:sz="18" w:space="8"/>
-        </w:pBdr>
         <w:spacing w:after="120" w:line="350" w:lineRule="auto"/>
-        <w:ind w:left="200"/>
         <w:jc w:val="both"/>
       </w:pPr>
       <w:r>
@@ -14631,16 +14359,12 @@
           <w:sz w:val="22"/>
           <w:szCs w:val="22"/>
         </w:rPr>
-        <w:t xml:space="preserve">정리하겠습니다. 대북은 이중으로 갑니다. 군사적 위반에는 단호하게 대응하고, 대화의 문은 닫지 않습니다. 이게 제가 말해 온 페이스메이커 역할이고, 이건 바뀌지 않습니다. 단호함과 대화는 대립하는 개념이 아닙니다. 둘 다 국민의 안전을 위한 수단입니다.</w:t>
-      </w:r>
-    </w:p>
-    <w:p>
-      <w:pPr>
-        <w:pBdr>
-          <w:left w:val="single" w:color="1F2F6B" w:sz="18" w:space="8"/>
-        </w:pBdr>
+        <w:t xml:space="preserve">정리하겠음. 대북은 이중으로 감. 군사적 위반에는 단호하게 대응하고 대화의 문은 닫지 않음. 이것이 말해 온 페이스메이커 역할이며 바뀌지 않음. 단호함과 대화는 대립하는 개념이 아님. 둘 다 국민의 안전을 위한 수단임.</w:t>
+      </w:r>
+    </w:p>
+    <w:p>
+      <w:pPr>
         <w:spacing w:after="120" w:line="350" w:lineRule="auto"/>
-        <w:ind w:left="200"/>
         <w:jc w:val="both"/>
       </w:pPr>
       <w:r>
@@ -14649,16 +14373,12 @@
           <w:sz w:val="22"/>
           <w:szCs w:val="22"/>
         </w:rPr>
-        <w:t xml:space="preserve">외교부와 안보실은 미국과의 사전 조율 채널을 오늘부터 돌리세요. 중국과는 정상 간 소통도 검토하시고요. 북미 접촉에 대비해서 우리가 참여할 수 있는 형태를 10월 SCM과 한미 외교장관 협의 전에 정리하세요. 국방부는 SCM에서 전작권과 확장억제를 다루되, 호르무즈와는 문서를 분리해서 진행하세요.</w:t>
-      </w:r>
-    </w:p>
-    <w:p>
-      <w:pPr>
-        <w:pBdr>
-          <w:left w:val="single" w:color="1F2F6B" w:sz="18" w:space="8"/>
-        </w:pBdr>
+        <w:t xml:space="preserve">외교부와 안보실은 미국과의 사전 조율 채널을 오늘부터 가동하기 바람. 중국과는 정상 간 소통도 검토하기 바람. 북미 접촉에 대비하여 우리가 참여할 수 있는 형태를 10월 SCM과 한미 외교장관 협의 전에 정리하기 바람. 국방부는 SCM에서 전작권과 확장억제를 다루되 호르무즈와는 문서를 분리하여 진행하기 바람.</w:t>
+      </w:r>
+    </w:p>
+    <w:p>
+      <w:pPr>
         <w:spacing w:after="120" w:line="350" w:lineRule="auto"/>
-        <w:ind w:left="200"/>
         <w:jc w:val="both"/>
       </w:pPr>
       <w:r>
@@ -14667,7 +14387,7 @@
           <w:sz w:val="22"/>
           <w:szCs w:val="22"/>
         </w:rPr>
-        <w:t xml:space="preserve">그리고 한 가지 더 요구합니다. 외교, 안보, 통일 라인이 서로 다른 얘기를 하지 마세요. 정보가 흐르지 않으면 판단이 늦어지고, 판단이 늦어지면 국민이 피해를 봅니다. 지금 이 정부에 가장 필요한 건 속도와 일관성입니다.</w:t>
+        <w:t xml:space="preserve">한 가지 더 요구함. 외교, 안보, 통일 라인이 서로 다른 말을 하지 말기 바람. 정보가 흐르지 않으면 판단이 늦어지고, 판단이 늦어지면 국민이 피해를 봄. 지금 이 정부에 가장 필요한 것은 속도와 일관성임.</w:t>
       </w:r>
     </w:p>
     <w:p>
@@ -15552,11 +15272,7 @@
     </w:p>
     <w:p>
       <w:pPr>
-        <w:pBdr>
-          <w:left w:val="single" w:color="1F2F6B" w:sz="18" w:space="8"/>
-        </w:pBdr>
         <w:spacing w:after="120" w:line="350" w:lineRule="auto"/>
-        <w:ind w:left="200"/>
         <w:jc w:val="both"/>
       </w:pPr>
       <w:r>
@@ -15565,7 +15281,7 @@
           <w:sz w:val="22"/>
           <w:szCs w:val="22"/>
         </w:rPr>
-        <w:t xml:space="preserve">부총리님, 취임하신 지 열흘도 안 됐고, 뉴욕에서 투자자들 만나고 오셨는데 거기서 이 문제에 대해 질문이 나오지 않았습니까? 외국 투자자들이 한국의 지정학 리스크를 어떻게 보고 있습니까?</w:t>
+        <w:t xml:space="preserve">부총리는 취임한 지 열흘도 되지 않았고 뉴욕에서 투자자들을 만나고 왔는데, 거기서 이 문제에 대한 질문이 나오지 않았는지? 외국 투자자들은 한국의 지정학 리스크를 어떻게 보고 있는지?</w:t>
       </w:r>
     </w:p>
     <w:p>
@@ -15612,11 +15328,7 @@
     </w:p>
     <w:p>
       <w:pPr>
-        <w:pBdr>
-          <w:left w:val="single" w:color="1F2F6B" w:sz="18" w:space="8"/>
-        </w:pBdr>
         <w:spacing w:after="120" w:line="350" w:lineRule="auto"/>
-        <w:ind w:left="200"/>
         <w:jc w:val="both"/>
       </w:pPr>
       <w:r>
@@ -15625,7 +15337,7 @@
           <w:sz w:val="22"/>
           <w:szCs w:val="22"/>
         </w:rPr>
-        <w:t xml:space="preserve">시장은 정부가 상황을 통제하고 있다는 믿음에 반응합니다. 오늘 같은 회의가 늦게 열렸다는 보도 자체가 시장에는 부정적 신호가 됩니다. 사고가 터지고 9일 동안 NSC가 안 열렸다는 게 해외에 알려지면 어떻게 읽히겠습니까? 경제부처는 안보 상황을 남의 일처럼 보지 마시고, 같이 대응하세요. 금융위는 시장 교란 세력에게는 봐주지 말고 엄정하게 처리하세요.</w:t>
+        <w:t xml:space="preserve">시장은 정부가 상황을 통제하고 있다는 믿음에 반응함. 오늘 같은 회의가 늦게 열렸다는 보도 자체가 시장에는 부정적 신호가 됨. 사고가 터지고 9일 동안 NSC가 열리지 않았다는 사실이 해외에 알려지면 어떻게 읽히겠는지? 경제 부처는 안보 상황을 남의 일처럼 보지 말고 함께 대응하기 바람. 금융위는 시장 교란 세력에게는 봐주지 말고 엄정하게 처리하기 바람.</w:t>
       </w:r>
     </w:p>
     <w:p>
@@ -15825,11 +15537,7 @@
     </w:p>
     <w:p>
       <w:pPr>
-        <w:pBdr>
-          <w:left w:val="single" w:color="1F2F6B" w:sz="18" w:space="8"/>
-        </w:pBdr>
         <w:spacing w:after="120" w:line="350" w:lineRule="auto"/>
-        <w:ind w:left="200"/>
         <w:jc w:val="both"/>
       </w:pPr>
       <w:r>
@@ -15838,7 +15546,7 @@
           <w:sz w:val="22"/>
           <w:szCs w:val="22"/>
         </w:rPr>
-        <w:t xml:space="preserve">지지율 얘기는 하지 마세요. 지지율이 낮다고 해서 해야 할 일을 안 할 수 없고, 높다고 해서 해도 되는 일이 늘어나는 것도 아닙니다. 다만 국민이 정부를 바라보는 눈이 엄중하다는 건 아프게 받아들이겠습니다. 그러면 소통 쪽을 짚겠습니다. 그동안 사고 대응에 관한 비판이 나올 때 청와대는 어떻게 대응했습니까? 홍보소통수석이 설명해 주세요.</w:t>
+        <w:t xml:space="preserve">지지율 얘기는 하지 말기 바람. 지지율이 낮다고 해서 해야 할 일을 안 할 수 없고, 높다고 해서 해도 되는 일이 늘어나는 것도 아님. 다만 국민이 정부를 바라보는 눈이 엄중하다는 점은 아프게 받아들이겠음. 소통 쪽을 짚겠음. 그동안 사고 대응에 관한 비판이 나올 때 청와대는 어떻게 대응하였는지? 홍보소통수석이 설명하기 바람.</w:t>
       </w:r>
     </w:p>
     <w:p>
@@ -15884,11 +15592,7 @@
     </w:p>
     <w:p>
       <w:pPr>
-        <w:pBdr>
-          <w:left w:val="single" w:color="1F2F6B" w:sz="18" w:space="8"/>
-        </w:pBdr>
         <w:spacing w:after="120" w:line="350" w:lineRule="auto"/>
-        <w:ind w:left="200"/>
         <w:jc w:val="both"/>
       </w:pPr>
       <w:r>
@@ -15897,7 +15601,7 @@
           <w:sz w:val="22"/>
           <w:szCs w:val="22"/>
         </w:rPr>
-        <w:t xml:space="preserve">선 진상규명, 후 조치. 맞습니다. 저도 어제 그렇게 말했습니다. 그런데 오늘 진상이 확인됐으면 이제 후 조치 단계로 넘어간 겁니다. 그 표현을 계속 쓰면 아무것도 안 하겠다는 말로 들립니다. 오늘부터는 무엇을 하고 있는지로 설명하세요. 말 바꾸기라는 소리 들을까 봐 그 표현에 갇혀 있으면 안 됩니다.</w:t>
+        <w:t xml:space="preserve">선 진상규명, 후 조치는 맞는 말이며 어제 대통령도 그렇게 말하였음. 그러나 오늘 진상이 확인되었으면 이제 후 조치 단계로 넘어간 것임. 그 표현을 계속 쓰면 아무것도 하지 않겠다는 말로 들림. 오늘부터는 무엇을 하고 있는지로 설명하기 바람. 말 바꾸기라는 소리를 들을까 봐 그 표현에 갇혀 있어서는 안 됨.</w:t>
       </w:r>
     </w:p>
     <w:p>
@@ -16000,11 +15704,7 @@
     </w:p>
     <w:p>
       <w:pPr>
-        <w:pBdr>
-          <w:left w:val="single" w:color="1F2F6B" w:sz="18" w:space="8"/>
-        </w:pBdr>
         <w:spacing w:after="120" w:line="350" w:lineRule="auto"/>
-        <w:ind w:left="200"/>
         <w:jc w:val="both"/>
       </w:pPr>
       <w:r>
@@ -16013,7 +15713,7 @@
           <w:sz w:val="22"/>
           <w:szCs w:val="22"/>
         </w:rPr>
-        <w:t xml:space="preserve">비서실장님은 지금 거취 문제도 있으시고, 이 사안에 대해 책임을 느낀다고 하시니 그 말씀 자체는 일단 받아들이겠습니다. 다만 사의 수리 여부는 이 회의와 별개로 결정하겠습니다. 그리고 지금 비서실장과 정책실장, 법무부장관이 다 비어 있거나 흔들리고 있습니다. 인사가 늦어지는 건 제 책임입니다. 야당이 국정 공백이라고 하면 변명하지 않겠습니다. 다만 공백이 길어지지 않게, 빨리 사람을 정하겠습니다.</w:t>
+        <w:t xml:space="preserve">비서실장이 거취 문제가 있는 상황에서 이 사안에 대해 책임을 느낀다고 한 점은 일단 받아들이겠음. 다만 사의 수리 여부는 이 회의와 별개로 결정하겠음. 현재 비서실장과 정책실장, 법무부장관이 모두 비어 있거나 흔들리고 있음. 인사가 늦어지는 것은 대통령의 책임임. 야당이 국정 공백이라고 하면 변명하지 않겠음. 다만 공백이 길어지지 않도록 빨리 사람을 정하겠음.</w:t>
       </w:r>
     </w:p>
     <w:p>
@@ -16060,11 +15760,7 @@
     </w:p>
     <w:p>
       <w:pPr>
-        <w:pBdr>
-          <w:left w:val="single" w:color="1F2F6B" w:sz="18" w:space="8"/>
-        </w:pBdr>
         <w:spacing w:after="120" w:line="350" w:lineRule="auto"/>
-        <w:ind w:left="200"/>
         <w:jc w:val="both"/>
       </w:pPr>
       <w:r>
@@ -16073,7 +15769,7 @@
           <w:sz w:val="22"/>
           <w:szCs w:val="22"/>
         </w:rPr>
-        <w:t xml:space="preserve">외통위 얘기도 하겠습니다. 정부가 불참한 건 잘못입니다. 다만 여당도 마찬가지입니다. 국회에서 현안질의를 하자고 하면 가서 설명하는 게 맞고, 여야 간사 합의가 안 됐다고 해서 정부가 빠지는 게 정당화되지는 않습니다. 국민 앞에서 숨는 정부로 보이면 안 됩니다. 총리님, 여당 지도부와 협의해서 필요한 상임위에서 사실 중심으로 보고하는 자리를 만드세요.</w:t>
+        <w:t xml:space="preserve">외통위 문제도 짚겠음. 정부가 불참한 것은 잘못임. 다만 여당도 마찬가지임. 국회에서 현안질의를 하자고 하면 가서 설명하는 것이 맞고, 여야 간사 합의가 되지 않았다고 정부가 빠지는 것이 정당화되지는 않음. 국민 앞에서 숨는 정부로 보여서는 안 됨. 총리는 여당 지도부와 협의하여 필요한 상임위에서 사실 중심으로 보고하는 자리를 만들기 바람.</w:t>
       </w:r>
     </w:p>
     <w:p>
@@ -16162,11 +15858,7 @@
     </w:p>
     <w:p>
       <w:pPr>
-        <w:pBdr>
-          <w:left w:val="single" w:color="1F2F6B" w:sz="18" w:space="8"/>
-        </w:pBdr>
         <w:spacing w:after="120" w:line="350" w:lineRule="auto"/>
-        <w:ind w:left="200"/>
         <w:jc w:val="both"/>
       </w:pPr>
       <w:r>
@@ -16175,7 +15867,7 @@
           <w:sz w:val="22"/>
           <w:szCs w:val="22"/>
         </w:rPr>
-        <w:t xml:space="preserve">정치권에서 지뢰 사고를 두고 음모론이 나오는 것도 문제입니다. 제가 어제 국무회의에서 근거 없는 음모론은 안 된다고 했는데, 그렇다고 해서 정부가 가만히 있을 일은 아닙니다. 팩트를 투명하게 공개하세요. 숨기면 음모론은 더 커집니다. 다만 작전 보안이 필요한 부분은 구분해서 공개하세요.</w:t>
+        <w:t xml:space="preserve">정치권에서 지뢰 사고를 두고 음모론이 나오는 것도 문제임. 어제 국무회의에서 근거 없는 음모론은 안 된다고 하였으나 그렇다고 정부가 가만히 있을 일은 아님. 팩트를 투명하게 공개하기 바람. 숨기면 음모론은 더 커짐. 다만 작전 보안이 필요한 부분은 구분하여 공개하기 바람.</w:t>
       </w:r>
     </w:p>
     <w:p>
@@ -16360,11 +16052,7 @@
     </w:p>
     <w:p>
       <w:pPr>
-        <w:pBdr>
-          <w:left w:val="single" w:color="1F2F6B" w:sz="18" w:space="8"/>
-        </w:pBdr>
         <w:spacing w:after="120" w:line="350" w:lineRule="auto"/>
-        <w:ind w:left="200"/>
         <w:jc w:val="both"/>
       </w:pPr>
       <w:r>
@@ -16373,7 +16061,7 @@
           <w:sz w:val="22"/>
           <w:szCs w:val="22"/>
         </w:rPr>
-        <w:t xml:space="preserve">연휴 기간에 뭔가 터지면 정부가 쉬고 있었다는 소리가 나올 겁니다. 이번에는 절대 그런 일 없게 하세요. 도발이나 사고가 나면 즉시 보고하고, 필요하면 휴일이든 새벽이든 제가 직접 NSC를 소집하겠습니다.</w:t>
+        <w:t xml:space="preserve">연휴 기간에 사고가 터지면 정부가 쉬고 있었다는 말이 나올 것임. 이번에는 절대 그런 일이 없도록 하기 바람. 도발이나 사고가 발생하면 즉시 보고하고, 필요하면 휴일이든 새벽이든 대통령이 직접 NSC를 소집하겠음.</w:t>
       </w:r>
     </w:p>
     <w:p>
@@ -16488,11 +16176,7 @@
     </w:p>
     <w:p>
       <w:pPr>
-        <w:pBdr>
-          <w:left w:val="single" w:color="1F2F6B" w:sz="18" w:space="8"/>
-        </w:pBdr>
         <w:spacing w:after="120" w:line="350" w:lineRule="auto"/>
-        <w:ind w:left="200"/>
         <w:jc w:val="both"/>
       </w:pPr>
       <w:r>
@@ -16501,7 +16185,7 @@
           <w:sz w:val="22"/>
           <w:szCs w:val="22"/>
         </w:rPr>
-        <w:t xml:space="preserve">세 가지입니다. 정전협정 위반에는 단호하게 대응한다. 장병의 안전은 어떤 정치적 논쟁보다 앞선다. 안보에는 여야가 없다. 그 세 가지만 분명히 하세요. 북한에 대한 감정적인 표현, 대북방송 재개 예단, 호르무즈 파병 결정을 암시하는 표현은 넣지 마세요. 지켜야 할 약속만 말하고 못 지킬 약속은 하지 않습니다.</w:t>
+        <w:t xml:space="preserve">세 가지임. 정전협정 위반에는 단호하게 대응한다, 장병의 안전은 어떤 정치적 논쟁보다 앞선다, 안보에는 여야가 없다. 이 세 가지만 분명히 하기 바람. 북한에 대한 감정적 표현, 대북방송 재개 예단, 호르무즈 파병 결정을 암시하는 표현은 넣지 말기 바람. 지켜야 할 약속만 말하고 지키지 못할 약속은 하지 않음.</w:t>
       </w:r>
     </w:p>
     <w:tbl>
@@ -21353,11 +21037,7 @@
     </w:p>
     <w:p>
       <w:pPr>
-        <w:pBdr>
-          <w:left w:val="single" w:color="1F2F6B" w:sz="18" w:space="8"/>
-        </w:pBdr>
         <w:spacing w:after="120" w:line="350" w:lineRule="auto"/>
-        <w:ind w:left="200"/>
         <w:jc w:val="both"/>
       </w:pPr>
       <w:r>
@@ -21366,7 +21046,7 @@
           <w:sz w:val="22"/>
           <w:szCs w:val="22"/>
         </w:rPr>
-        <w:t xml:space="preserve">끝으로 한 분씩 짧게 말씀하세요. 오늘 얘기한 것 중에 자기 몫이 뭔지, 그것만 분명히 하시면 됩니다.</w:t>
+        <w:t xml:space="preserve">끝으로 한 사람씩 짧게 말하기 바람. 오늘 논의한 것 가운데 자기 몫이 무엇인지만 분명히 하면 됨.</w:t>
       </w:r>
     </w:p>
     <w:p>
@@ -21665,11 +21345,7 @@
     </w:p>
     <w:p>
       <w:pPr>
-        <w:pBdr>
-          <w:left w:val="single" w:color="1F2F6B" w:sz="18" w:space="8"/>
-        </w:pBdr>
         <w:spacing w:after="120" w:line="350" w:lineRule="auto"/>
-        <w:ind w:left="200"/>
         <w:jc w:val="both"/>
       </w:pPr>
       <w:r>
@@ -21678,16 +21354,12 @@
           <w:sz w:val="22"/>
           <w:szCs w:val="22"/>
         </w:rPr>
-        <w:t xml:space="preserve">마지막으로 말씀드립니다. 정부가 늦었다는 비판은 겸허하게 받아들입니다. 하지만 늦었다고 해서 방향까지 흔들리면 안 됩니다. 우리가 지켜야 할 것은 장병의 안전과 국민의 일상, 그리고 한반도의 안정입니다.</w:t>
-      </w:r>
-    </w:p>
-    <w:p>
-      <w:pPr>
-        <w:pBdr>
-          <w:left w:val="single" w:color="1F2F6B" w:sz="18" w:space="8"/>
-        </w:pBdr>
+        <w:t xml:space="preserve">마지막으로 당부함. 정부가 늦었다는 비판은 겸허하게 받아들임. 그러나 늦었다고 해서 방향까지 흔들려서는 안 됨. 우리가 지켜야 할 것은 장병의 안전과 국민의 일상, 그리고 한반도의 안정임.</w:t>
+      </w:r>
+    </w:p>
+    <w:p>
+      <w:pPr>
         <w:spacing w:after="120" w:line="350" w:lineRule="auto"/>
-        <w:ind w:left="200"/>
         <w:jc w:val="both"/>
       </w:pPr>
       <w:r>
@@ -21696,16 +21368,12 @@
           <w:sz w:val="22"/>
           <w:szCs w:val="22"/>
         </w:rPr>
-        <w:t xml:space="preserve">북한이 책임을 부인하고 위협을 키우더라도 우리는 사실에 근거해서 일관되게 갑니다. 동시에 미국이든 중국이든, 어느 한쪽의 요구에 끌려가지 않습니다. 우리가 선택하고, 우리가 국민께 설명할 수 있는 길을 갑니다. 그게 국익 중심 실용외교입니다.</w:t>
-      </w:r>
-    </w:p>
-    <w:p>
-      <w:pPr>
-        <w:pBdr>
-          <w:left w:val="single" w:color="1F2F6B" w:sz="18" w:space="8"/>
-        </w:pBdr>
+        <w:t xml:space="preserve">북한이 책임을 부인하고 위협을 키우더라도 우리는 사실에 근거하여 일관되게 감. 동시에 미국이든 중국이든 어느 한쪽의 요구에 끌려가지 않음. 우리가 선택하고 국민에게 설명할 수 있는 길을 감. 그것이 국익 중심 실용외교임.</w:t>
+      </w:r>
+    </w:p>
+    <w:p>
+      <w:pPr>
         <w:spacing w:after="120" w:line="350" w:lineRule="auto"/>
-        <w:ind w:left="200"/>
         <w:jc w:val="both"/>
       </w:pPr>
       <w:r>
@@ -21714,7 +21382,7 @@
           <w:sz w:val="22"/>
           <w:szCs w:val="22"/>
         </w:rPr>
-        <w:t xml:space="preserve">오늘 회의에서 여러 장관님들이 서로 다른 의견을 내주셨습니다. 그런 의견 충돌은 얼마든지 환영합니다. 그런데 회의장 밖으로 나가서는 한목소리를 내세요. 그리고 오늘 정해진 일은 말로 끝내지 말고 결과로 보여주세요. 내일부터 이행 상황을 하루도 빠짐없이 보고받겠습니다. 결과를 못 내는 부처는 이유 불문하고 책임을 묻겠습니다.</w:t>
+        <w:t xml:space="preserve">오늘 회의에서 여러 장관이 서로 다른 의견을 내었음. 의견 충돌은 얼마든지 환영함. 그러나 회의장 밖에서는 한목소리를 내기 바람. 오늘 정해진 일은 말로 끝내지 말고 결과로 보여 주기 바람. 내일부터 이행 상황을 하루도 빠짐없이 보고받겠음. 결과를 내지 못하는 부처는 이유를 불문하고 책임을 묻겠음.</w:t>
       </w:r>
     </w:p>
     <w:p>
@@ -34133,7 +33801,7 @@
                 <w:sz w:val="19"/>
                 <w:szCs w:val="19"/>
               </w:rPr>
-              <w:t xml:space="preserve">대통령 어투</w:t>
+              <w:t xml:space="preserve">대통령 발언 표기</w:t>
             </w:r>
           </w:p>
         </w:tc>
@@ -34165,7 +33833,76 @@
                 <w:sz w:val="19"/>
                 <w:szCs w:val="19"/>
               </w:rPr>
-              <w:t xml:space="preserve">2025~2026년 국무회의·업무보고·기자회견에서 보도된 발언(“책임 있는 사람이 이상한 소리 하는 건 정말 문제”, “자기가 쓴 글자의 의미는 알고 있어야 하지 않나”, “지지부진한 건 안 하는 거하고 똑같다”, “근거 없는 음모론”, “제 책임이 가장 크다” 등)의 말투와 어휘를 참고해 재구성한 것이며, 실제 발언이 아님. 신상필벌, 책임, 국민 눈높이, 국익 중심 실용외교, 속도와 일관성 같은 평소 강조 어휘를 반영함</w:t>
+              <w:t xml:space="preserve">참고 양식(국무회의 회의록)의 의장 발언과 같이 라벨 없는 일반 문단으로, 회의록 서술체(~함, ~임, ~바람, ~하겠음, ~인지?)로 정리함. 구어체 존댓말은 사용하지 않음</w:t>
+            </w:r>
+          </w:p>
+        </w:tc>
+      </w:tr>
+      <w:tr>
+        <w:trPr>
+          <w:cantSplit/>
+        </w:trPr>
+        <w:tc>
+          <w:tcPr>
+            <w:tcW w:type="dxa" w:w="2000"/>
+            <w:tcBorders>
+              <w:top w:val="single" w:color="000000" w:sz="4"/>
+              <w:left w:val="single" w:color="000000" w:sz="4"/>
+              <w:bottom w:val="single" w:color="000000" w:sz="4"/>
+              <w:right w:val="single" w:color="000000" w:sz="4"/>
+            </w:tcBorders>
+            <w:tcMar>
+              <w:top w:type="dxa" w:w="60"/>
+              <w:left w:type="dxa" w:w="80"/>
+              <w:bottom w:type="dxa" w:w="60"/>
+              <w:right w:type="dxa" w:w="80"/>
+            </w:tcMar>
+            <w:vAlign w:val="center"/>
+          </w:tcPr>
+          <w:p>
+            <w:pPr>
+              <w:spacing w:line="280" w:lineRule="auto"/>
+              <w:jc w:val="center"/>
+            </w:pPr>
+            <w:r>
+              <w:rPr>
+                <w:rFonts w:ascii="바탕" w:cs="바탕" w:eastAsia="바탕" w:hAnsi="바탕"/>
+                <w:sz w:val="19"/>
+                <w:szCs w:val="19"/>
+              </w:rPr>
+              <w:t xml:space="preserve">대통령 어휘·논조</w:t>
+            </w:r>
+          </w:p>
+        </w:tc>
+        <w:tc>
+          <w:tcPr>
+            <w:tcW w:type="dxa" w:w="7638"/>
+            <w:tcBorders>
+              <w:top w:val="single" w:color="000000" w:sz="4"/>
+              <w:left w:val="single" w:color="000000" w:sz="4"/>
+              <w:bottom w:val="single" w:color="000000" w:sz="4"/>
+              <w:right w:val="single" w:color="000000" w:sz="4"/>
+            </w:tcBorders>
+            <w:tcMar>
+              <w:top w:type="dxa" w:w="60"/>
+              <w:left w:type="dxa" w:w="80"/>
+              <w:bottom w:type="dxa" w:w="60"/>
+              <w:right w:type="dxa" w:w="80"/>
+            </w:tcMar>
+            <w:vAlign w:val="center"/>
+          </w:tcPr>
+          <w:p>
+            <w:pPr>
+              <w:spacing w:line="280" w:lineRule="auto"/>
+              <w:jc w:val="left"/>
+            </w:pPr>
+            <w:r>
+              <w:rPr>
+                <w:rFonts w:ascii="바탕" w:cs="바탕" w:eastAsia="바탕" w:hAnsi="바탕"/>
+                <w:sz w:val="19"/>
+                <w:szCs w:val="19"/>
+              </w:rPr>
+              <w:t xml:space="preserve">2025~2026년 국무회의·업무보고·기자회견에서 보도된 발언(“책임 있는 사람이 이상한 소리 하는 건 정말 문제”, “자기가 쓴 글자의 의미는 알고 있어야 하지 않나”, “지지부진한 건 안 하는 거하고 똑같다”, “근거 없는 음모론”, “제 책임이 가장 크다” 등)에서 드러난 어휘와 논조를 재구성해 반영함. 실제 발언이 아니며, 책임·신상필벌·국민 눈높이·국익 중심 실용외교·속도와 일관성 같은 평소 강조 어휘를 사용함</w:t>
             </w:r>
           </w:p>
         </w:tc>

</xml_diff>